<commit_message>
Expand Python field guide for black and white printing
</commit_message>
<xml_diff>
--- a/week-05-halloween-loop-quest/handouts/python-field-guide-editable.docx
+++ b/week-05-halloween-loop-quest/handouts/python-field-guide-editable.docx
@@ -26,10 +26,10 @@
         <w:rPr>
           <w:rFonts w:ascii="Aptos" w:hAnsi="Aptos"/>
           <w:b w:val="0"/>
-          <w:color w:val="556070"/>
+          <w:color w:val="444444"/>
           <w:sz w:val="20"/>
         </w:rPr>
-        <w:t>A beginner lookup guide</w:t>
+        <w:t>A black and white lookup guide for learning Python</w:t>
       </w:r>
     </w:p>
     <w:tbl>
@@ -45,7 +45,7 @@
         <w:tc>
           <w:tcPr>
             <w:tcW w:type="dxa" w:w="6538"/>
-            <w:shd w:fill="EAF2FF"/>
+            <w:shd w:fill="F5F5F5"/>
           </w:tcPr>
           <w:p>
             <w:pPr>
@@ -55,10 +55,10 @@
               <w:rPr>
                 <w:rFonts w:ascii="Aptos" w:hAnsi="Aptos"/>
                 <w:b/>
-                <w:color w:val="2F6FEB"/>
+                <w:color w:val="000000"/>
                 <w:sz w:val="20"/>
               </w:rPr>
-              <w:t>Use this book while you code</w:t>
+              <w:t>How to use this guide</w:t>
             </w:r>
           </w:p>
           <w:p>
@@ -67,12 +67,12 @@
             </w:pPr>
             <w:r>
               <w:rPr>
-                <w:rFonts w:ascii="Consolas" w:hAnsi="Consolas"/>
+                <w:rFonts w:ascii="Aptos" w:hAnsi="Aptos"/>
                 <w:b w:val="0"/>
-                <w:color w:val="172033"/>
-                <w:sz w:val="16"/>
+                <w:color w:val="000000"/>
+                <w:sz w:val="17"/>
               </w:rPr>
-              <w:t>Look up a pattern, copy its shape, then change the names and values for your program.</w:t>
+              <w:t>Find the idea you need, copy the pattern, change the names and values, then run a small test.</w:t>
             </w:r>
           </w:p>
         </w:tc>
@@ -96,7 +96,7 @@
         <w:tc>
           <w:tcPr>
             <w:tcW w:type="dxa" w:w="6538"/>
-            <w:shd w:fill="EAF2FF"/>
+            <w:shd w:fill="F5F5F5"/>
           </w:tcPr>
           <w:p>
             <w:pPr>
@@ -106,10 +106,10 @@
               <w:rPr>
                 <w:rFonts w:ascii="Aptos" w:hAnsi="Aptos"/>
                 <w:b/>
-                <w:color w:val="2F6FEB"/>
+                <w:color w:val="000000"/>
                 <w:sz w:val="20"/>
               </w:rPr>
-              <w:t>You do not need to memorize everything</w:t>
+              <w:t>Looking things up is part of programming</w:t>
             </w:r>
           </w:p>
           <w:p>
@@ -120,10 +120,10 @@
               <w:rPr>
                 <w:rFonts w:ascii="Aptos" w:hAnsi="Aptos"/>
                 <w:b w:val="0"/>
-                <w:color w:val="172033"/>
+                <w:color w:val="000000"/>
                 <w:sz w:val="17"/>
               </w:rPr>
-              <w:t>Programmers look up syntax. Your job is to understand what the code is doing and test it.</w:t>
+              <w:t>You do not need to memorize every command. You do need to explain what your code is doing.</w:t>
             </w:r>
           </w:p>
         </w:tc>
@@ -147,7 +147,7 @@
         <w:tc>
           <w:tcPr>
             <w:tcW w:type="dxa" w:w="6538"/>
-            <w:shd w:fill="EAF2FF"/>
+            <w:shd w:fill="F5F5F5"/>
           </w:tcPr>
           <w:p>
             <w:pPr>
@@ -157,10 +157,10 @@
               <w:rPr>
                 <w:rFonts w:ascii="Aptos" w:hAnsi="Aptos"/>
                 <w:b/>
-                <w:color w:val="2F6FEB"/>
+                <w:color w:val="000000"/>
                 <w:sz w:val="20"/>
               </w:rPr>
-              <w:t>Concepts inside</w:t>
+              <w:t>Start with what we have learned</w:t>
             </w:r>
           </w:p>
           <w:p>
@@ -169,12 +169,12 @@
             </w:pPr>
             <w:r>
               <w:rPr>
-                <w:rFonts w:ascii="Aptos" w:hAnsi="Aptos"/>
+                <w:rFonts w:ascii="Consolas" w:hAnsi="Consolas"/>
                 <w:b w:val="0"/>
-                <w:color w:val="172033"/>
-                <w:sz w:val="17"/>
+                <w:color w:val="000000"/>
+                <w:sz w:val="16"/>
               </w:rPr>
-              <w:t>Variables  Lists  Conditions  For loops  While loops  Functions  return  None</w:t>
+              <w:t>Pages 2 through 8 review our current course. Pages 9 through 16 prepare you for future lessons.</w:t>
             </w:r>
           </w:p>
         </w:tc>
@@ -193,7 +193,7 @@
         <w:rPr>
           <w:rFonts w:ascii="Aptos" w:hAnsi="Aptos"/>
           <w:b/>
-          <w:color w:val="556070"/>
+          <w:color w:val="444444"/>
           <w:sz w:val="15"/>
         </w:rPr>
         <w:t>PYTHON FIELD GUIDE   1</w:t>
@@ -217,7 +217,7 @@
           <w:color w:val="000000"/>
           <w:sz w:val="40"/>
         </w:rPr>
-        <w:t>How to read Python</w:t>
+        <w:t>What we have learned</w:t>
       </w:r>
     </w:p>
     <w:p>
@@ -228,10 +228,10 @@
         <w:rPr>
           <w:rFonts w:ascii="Aptos" w:hAnsi="Aptos"/>
           <w:b w:val="0"/>
-          <w:color w:val="556070"/>
+          <w:color w:val="444444"/>
           <w:sz w:val="20"/>
         </w:rPr>
-        <w:t>Trace one line at a time</w:t>
+        <w:t>Current course reference</w:t>
       </w:r>
     </w:p>
     <w:tbl>
@@ -247,7 +247,7 @@
         <w:tc>
           <w:tcPr>
             <w:tcW w:type="dxa" w:w="6538"/>
-            <w:shd w:fill="EAF2FF"/>
+            <w:shd w:fill="F5F5F5"/>
           </w:tcPr>
           <w:p>
             <w:pPr>
@@ -257,10 +257,10 @@
               <w:rPr>
                 <w:rFonts w:ascii="Aptos" w:hAnsi="Aptos"/>
                 <w:b/>
-                <w:color w:val="2F6FEB"/>
+                <w:color w:val="000000"/>
                 <w:sz w:val="20"/>
               </w:rPr>
-              <w:t>Assignment</w:t>
+              <w:t>Values and variables</w:t>
             </w:r>
           </w:p>
           <w:p>
@@ -269,12 +269,12 @@
             </w:pPr>
             <w:r>
               <w:rPr>
-                <w:rFonts w:ascii="Consolas" w:hAnsi="Consolas"/>
+                <w:rFonts w:ascii="Aptos" w:hAnsi="Aptos"/>
                 <w:b w:val="0"/>
-                <w:color w:val="172033"/>
-                <w:sz w:val="16"/>
+                <w:color w:val="000000"/>
+                <w:sz w:val="17"/>
               </w:rPr>
-              <w:t>coins = 3 means store 3 in the name coins. The = sign assigns a value.</w:t>
+              <w:t>Store text, numbers, and True or False values under useful names.</w:t>
             </w:r>
           </w:p>
         </w:tc>
@@ -298,7 +298,7 @@
         <w:tc>
           <w:tcPr>
             <w:tcW w:type="dxa" w:w="6538"/>
-            <w:shd w:fill="EAF2FF"/>
+            <w:shd w:fill="F5F5F5"/>
           </w:tcPr>
           <w:p>
             <w:pPr>
@@ -308,10 +308,10 @@
               <w:rPr>
                 <w:rFonts w:ascii="Aptos" w:hAnsi="Aptos"/>
                 <w:b/>
-                <w:color w:val="2F6FEB"/>
+                <w:color w:val="000000"/>
                 <w:sz w:val="20"/>
               </w:rPr>
-              <w:t>Indentation</w:t>
+              <w:t>Program decisions</w:t>
             </w:r>
           </w:p>
           <w:p>
@@ -322,10 +322,10 @@
               <w:rPr>
                 <w:rFonts w:ascii="Aptos" w:hAnsi="Aptos"/>
                 <w:b w:val="0"/>
-                <w:color w:val="172033"/>
+                <w:color w:val="000000"/>
                 <w:sz w:val="17"/>
               </w:rPr>
-              <w:t>Indented lines belong to the if, loop, or function above them.</w:t>
+              <w:t>Use if, elif, else, comparisons, and logic to choose which code runs.</w:t>
             </w:r>
           </w:p>
         </w:tc>
@@ -349,7 +349,7 @@
         <w:tc>
           <w:tcPr>
             <w:tcW w:type="dxa" w:w="6538"/>
-            <w:shd w:fill="EAF2FF"/>
+            <w:shd w:fill="F5F5F5"/>
           </w:tcPr>
           <w:p>
             <w:pPr>
@@ -359,10 +359,10 @@
               <w:rPr>
                 <w:rFonts w:ascii="Aptos" w:hAnsi="Aptos"/>
                 <w:b/>
-                <w:color w:val="2F6FEB"/>
+                <w:color w:val="000000"/>
                 <w:sz w:val="20"/>
               </w:rPr>
-              <w:t>Function call</w:t>
+              <w:t>Repetition</w:t>
             </w:r>
           </w:p>
           <w:p>
@@ -373,10 +373,10 @@
               <w:rPr>
                 <w:rFonts w:ascii="Consolas" w:hAnsi="Consolas"/>
                 <w:b w:val="0"/>
-                <w:color w:val="172033"/>
+                <w:color w:val="000000"/>
                 <w:sz w:val="16"/>
               </w:rPr>
-              <w:t>print(coins) runs the function named print with coins as its argument.</w:t>
+              <w:t>Use for with a collection or range. Use while when repetition depends on a condition.</w:t>
             </w:r>
           </w:p>
         </w:tc>
@@ -400,7 +400,7 @@
         <w:tc>
           <w:tcPr>
             <w:tcW w:type="dxa" w:w="6538"/>
-            <w:shd w:fill="EAF2FF"/>
+            <w:shd w:fill="F5F5F5"/>
           </w:tcPr>
           <w:p>
             <w:pPr>
@@ -410,10 +410,10 @@
               <w:rPr>
                 <w:rFonts w:ascii="Aptos" w:hAnsi="Aptos"/>
                 <w:b/>
-                <w:color w:val="2F6FEB"/>
+                <w:color w:val="000000"/>
                 <w:sz w:val="20"/>
               </w:rPr>
-              <w:t>Predict then run</w:t>
+              <w:t>Reusable code</w:t>
             </w:r>
           </w:p>
           <w:p>
@@ -424,10 +424,61 @@
               <w:rPr>
                 <w:rFonts w:ascii="Aptos" w:hAnsi="Aptos"/>
                 <w:b w:val="0"/>
-                <w:color w:val="172033"/>
+                <w:color w:val="000000"/>
                 <w:sz w:val="17"/>
               </w:rPr>
-              <w:t>Before you press Run, predict the output. Then compare your prediction with Python.</w:t>
+              <w:t>Use functions, parameters, arguments, and return values to organize a program.</w:t>
+            </w:r>
+          </w:p>
+        </w:tc>
+      </w:tr>
+    </w:tbl>
+    <w:p>
+      <w:pPr>
+        <w:spacing w:after="60"/>
+      </w:pPr>
+    </w:p>
+    <w:tbl>
+      <w:tblPr>
+        <w:tblW w:type="auto" w:w="0"/>
+        <w:tblLayout w:type="fixed"/>
+        <w:tblLook w:firstColumn="1" w:firstRow="1" w:lastColumn="0" w:lastRow="0" w:noHBand="0" w:noVBand="1" w:val="04A0"/>
+      </w:tblPr>
+      <w:tblGrid>
+        <w:gridCol w:w="6480"/>
+      </w:tblGrid>
+      <w:tr>
+        <w:tc>
+          <w:tcPr>
+            <w:tcW w:type="dxa" w:w="6538"/>
+            <w:shd w:fill="F5F5F5"/>
+          </w:tcPr>
+          <w:p>
+            <w:pPr>
+              <w:spacing w:after="60"/>
+            </w:pPr>
+            <w:r>
+              <w:rPr>
+                <w:rFonts w:ascii="Aptos" w:hAnsi="Aptos"/>
+                <w:b/>
+                <w:color w:val="000000"/>
+                <w:sz w:val="20"/>
+              </w:rPr>
+              <w:t>Core habit</w:t>
+            </w:r>
+          </w:p>
+          <w:p>
+            <w:pPr>
+              <w:spacing w:after="20"/>
+            </w:pPr>
+            <w:r>
+              <w:rPr>
+                <w:rFonts w:ascii="Aptos" w:hAnsi="Aptos"/>
+                <w:b w:val="0"/>
+                <w:color w:val="000000"/>
+                <w:sz w:val="17"/>
+              </w:rPr>
+              <w:t>Predict the result, run the code, compare, and investigate any difference.</w:t>
             </w:r>
           </w:p>
         </w:tc>
@@ -446,7 +497,7 @@
         <w:rPr>
           <w:rFonts w:ascii="Aptos" w:hAnsi="Aptos"/>
           <w:b/>
-          <w:color w:val="556070"/>
+          <w:color w:val="444444"/>
           <w:sz w:val="15"/>
         </w:rPr>
         <w:t>PYTHON FIELD GUIDE   2</w:t>
@@ -470,7 +521,7 @@
           <w:color w:val="000000"/>
           <w:sz w:val="40"/>
         </w:rPr>
-        <w:t>Variables and lists</w:t>
+        <w:t>Variables lists and input</w:t>
       </w:r>
     </w:p>
     <w:p>
@@ -481,10 +532,10 @@
         <w:rPr>
           <w:rFonts w:ascii="Aptos" w:hAnsi="Aptos"/>
           <w:b w:val="0"/>
-          <w:color w:val="556070"/>
+          <w:color w:val="444444"/>
           <w:sz w:val="20"/>
         </w:rPr>
-        <w:t>Store one value or a collection</w:t>
+        <w:t>Store information and receive user choices</w:t>
       </w:r>
     </w:p>
     <w:tbl>
@@ -500,7 +551,7 @@
         <w:tc>
           <w:tcPr>
             <w:tcW w:type="dxa" w:w="6538"/>
-            <w:shd w:fill="EAF2FF"/>
+            <w:shd w:fill="F5F5F5"/>
           </w:tcPr>
           <w:p>
             <w:pPr>
@@ -510,7 +561,7 @@
               <w:rPr>
                 <w:rFonts w:ascii="Aptos" w:hAnsi="Aptos"/>
                 <w:b/>
-                <w:color w:val="2F6FEB"/>
+                <w:color w:val="000000"/>
                 <w:sz w:val="20"/>
               </w:rPr>
               <w:t>Variables</w:t>
@@ -524,10 +575,10 @@
               <w:rPr>
                 <w:rFonts w:ascii="Consolas" w:hAnsi="Consolas"/>
                 <w:b w:val="0"/>
-                <w:color w:val="172033"/>
+                <w:color w:val="000000"/>
                 <w:sz w:val="16"/>
               </w:rPr>
-              <w:t>name = "Luigi"</w:t>
+              <w:t>player = "Mario"</w:t>
             </w:r>
           </w:p>
           <w:p>
@@ -538,7 +589,7 @@
               <w:rPr>
                 <w:rFonts w:ascii="Consolas" w:hAnsi="Consolas"/>
                 <w:b w:val="0"/>
-                <w:color w:val="172033"/>
+                <w:color w:val="000000"/>
                 <w:sz w:val="16"/>
               </w:rPr>
               <w:t>lives = 3</w:t>
@@ -552,7 +603,7 @@
               <w:rPr>
                 <w:rFonts w:ascii="Consolas" w:hAnsi="Consolas"/>
                 <w:b w:val="0"/>
-                <w:color w:val="172033"/>
+                <w:color w:val="000000"/>
                 <w:sz w:val="16"/>
               </w:rPr>
               <w:t>is_ready = True</w:t>
@@ -579,7 +630,7 @@
         <w:tc>
           <w:tcPr>
             <w:tcW w:type="dxa" w:w="6538"/>
-            <w:shd w:fill="EAF2FF"/>
+            <w:shd w:fill="F5F5F5"/>
           </w:tcPr>
           <w:p>
             <w:pPr>
@@ -589,10 +640,10 @@
               <w:rPr>
                 <w:rFonts w:ascii="Aptos" w:hAnsi="Aptos"/>
                 <w:b/>
-                <w:color w:val="2F6FEB"/>
+                <w:color w:val="000000"/>
                 <w:sz w:val="20"/>
               </w:rPr>
-              <w:t>Lists</w:t>
+              <w:t>Input returns text</w:t>
             </w:r>
           </w:p>
           <w:p>
@@ -603,10 +654,10 @@
               <w:rPr>
                 <w:rFonts w:ascii="Consolas" w:hAnsi="Consolas"/>
                 <w:b w:val="0"/>
-                <w:color w:val="172033"/>
+                <w:color w:val="000000"/>
                 <w:sz w:val="16"/>
               </w:rPr>
-              <w:t>items = ["key", "star"]</w:t>
+              <w:t>name = input("Your name: ")</w:t>
             </w:r>
           </w:p>
           <w:p>
@@ -617,10 +668,10 @@
               <w:rPr>
                 <w:rFonts w:ascii="Consolas" w:hAnsi="Consolas"/>
                 <w:b w:val="0"/>
-                <w:color w:val="172033"/>
+                <w:color w:val="000000"/>
                 <w:sz w:val="16"/>
               </w:rPr>
-              <w:t>items.append("mushroom")</w:t>
+              <w:t>print("Hello", name)</w:t>
             </w:r>
           </w:p>
         </w:tc>
@@ -644,7 +695,7 @@
         <w:tc>
           <w:tcPr>
             <w:tcW w:type="dxa" w:w="6538"/>
-            <w:shd w:fill="EAF2FF"/>
+            <w:shd w:fill="F5F5F5"/>
           </w:tcPr>
           <w:p>
             <w:pPr>
@@ -654,10 +705,10 @@
               <w:rPr>
                 <w:rFonts w:ascii="Aptos" w:hAnsi="Aptos"/>
                 <w:b/>
-                <w:color w:val="2F6FEB"/>
+                <w:color w:val="000000"/>
                 <w:sz w:val="20"/>
               </w:rPr>
-              <w:t>List lookup</w:t>
+              <w:t>Lists</w:t>
             </w:r>
           </w:p>
           <w:p>
@@ -666,12 +717,40 @@
             </w:pPr>
             <w:r>
               <w:rPr>
-                <w:rFonts w:ascii="Aptos" w:hAnsi="Aptos"/>
+                <w:rFonts w:ascii="Consolas" w:hAnsi="Consolas"/>
                 <w:b w:val="0"/>
-                <w:color w:val="172033"/>
-                <w:sz w:val="17"/>
+                <w:color w:val="000000"/>
+                <w:sz w:val="16"/>
               </w:rPr>
-              <w:t>items[0] is the first item. Python starts counting indexes at 0.</w:t>
+              <w:t>items = ["key", "star"]</w:t>
+            </w:r>
+          </w:p>
+          <w:p>
+            <w:pPr>
+              <w:spacing w:after="20"/>
+            </w:pPr>
+            <w:r>
+              <w:rPr>
+                <w:rFonts w:ascii="Consolas" w:hAnsi="Consolas"/>
+                <w:b w:val="0"/>
+                <w:color w:val="000000"/>
+                <w:sz w:val="16"/>
+              </w:rPr>
+              <w:t>items.append("mushroom")</w:t>
+            </w:r>
+          </w:p>
+          <w:p>
+            <w:pPr>
+              <w:spacing w:after="20"/>
+            </w:pPr>
+            <w:r>
+              <w:rPr>
+                <w:rFonts w:ascii="Consolas" w:hAnsi="Consolas"/>
+                <w:b w:val="0"/>
+                <w:color w:val="000000"/>
+                <w:sz w:val="16"/>
+              </w:rPr>
+              <w:t>first = items[0]</w:t>
             </w:r>
           </w:p>
         </w:tc>
@@ -695,7 +774,7 @@
         <w:tc>
           <w:tcPr>
             <w:tcW w:type="dxa" w:w="6538"/>
-            <w:shd w:fill="EAF2FF"/>
+            <w:shd w:fill="F5F5F5"/>
           </w:tcPr>
           <w:p>
             <w:pPr>
@@ -705,10 +784,10 @@
               <w:rPr>
                 <w:rFonts w:ascii="Aptos" w:hAnsi="Aptos"/>
                 <w:b/>
-                <w:color w:val="2F6FEB"/>
+                <w:color w:val="000000"/>
                 <w:sz w:val="20"/>
               </w:rPr>
-              <w:t>Useful checks</w:t>
+              <w:t>Useful list tools</w:t>
             </w:r>
           </w:p>
           <w:p>
@@ -719,10 +798,61 @@
               <w:rPr>
                 <w:rFonts w:ascii="Aptos" w:hAnsi="Aptos"/>
                 <w:b w:val="0"/>
-                <w:color w:val="172033"/>
+                <w:color w:val="000000"/>
                 <w:sz w:val="17"/>
               </w:rPr>
-              <w:t>len(items) counts items.  value in items checks whether a value is present.</w:t>
+              <w:t>len(items) counts items. value in items checks membership. items.remove(value) removes a matching item.</w:t>
+            </w:r>
+          </w:p>
+        </w:tc>
+      </w:tr>
+    </w:tbl>
+    <w:p>
+      <w:pPr>
+        <w:spacing w:after="60"/>
+      </w:pPr>
+    </w:p>
+    <w:tbl>
+      <w:tblPr>
+        <w:tblW w:type="auto" w:w="0"/>
+        <w:tblLayout w:type="fixed"/>
+        <w:tblLook w:firstColumn="1" w:firstRow="1" w:lastColumn="0" w:lastRow="0" w:noHBand="0" w:noVBand="1" w:val="04A0"/>
+      </w:tblPr>
+      <w:tblGrid>
+        <w:gridCol w:w="6480"/>
+      </w:tblGrid>
+      <w:tr>
+        <w:tc>
+          <w:tcPr>
+            <w:tcW w:type="dxa" w:w="6538"/>
+            <w:shd w:fill="F5F5F5"/>
+          </w:tcPr>
+          <w:p>
+            <w:pPr>
+              <w:spacing w:after="60"/>
+            </w:pPr>
+            <w:r>
+              <w:rPr>
+                <w:rFonts w:ascii="Aptos" w:hAnsi="Aptos"/>
+                <w:b/>
+                <w:color w:val="000000"/>
+                <w:sz w:val="20"/>
+              </w:rPr>
+              <w:t>Index reminder</w:t>
+            </w:r>
+          </w:p>
+          <w:p>
+            <w:pPr>
+              <w:spacing w:after="20"/>
+            </w:pPr>
+            <w:r>
+              <w:rPr>
+                <w:rFonts w:ascii="Aptos" w:hAnsi="Aptos"/>
+                <w:b w:val="0"/>
+                <w:color w:val="000000"/>
+                <w:sz w:val="17"/>
+              </w:rPr>
+              <w:t>The first list index is 0. The last item can be read with items[-1].</w:t>
             </w:r>
           </w:p>
         </w:tc>
@@ -741,7 +871,7 @@
         <w:rPr>
           <w:rFonts w:ascii="Aptos" w:hAnsi="Aptos"/>
           <w:b/>
-          <w:color w:val="556070"/>
+          <w:color w:val="444444"/>
           <w:sz w:val="15"/>
         </w:rPr>
         <w:t>PYTHON FIELD GUIDE   3</w:t>
@@ -776,7 +906,7 @@
         <w:rPr>
           <w:rFonts w:ascii="Aptos" w:hAnsi="Aptos"/>
           <w:b w:val="0"/>
-          <w:color w:val="556070"/>
+          <w:color w:val="444444"/>
           <w:sz w:val="20"/>
         </w:rPr>
         <w:t>Choose which code runs</w:t>
@@ -795,7 +925,7 @@
         <w:tc>
           <w:tcPr>
             <w:tcW w:type="dxa" w:w="6538"/>
-            <w:shd w:fill="EAF2FF"/>
+            <w:shd w:fill="F5F5F5"/>
           </w:tcPr>
           <w:p>
             <w:pPr>
@@ -805,7 +935,7 @@
               <w:rPr>
                 <w:rFonts w:ascii="Aptos" w:hAnsi="Aptos"/>
                 <w:b/>
-                <w:color w:val="2F6FEB"/>
+                <w:color w:val="000000"/>
                 <w:sz w:val="20"/>
               </w:rPr>
               <w:t>Basic pattern</w:t>
@@ -819,7 +949,7 @@
               <w:rPr>
                 <w:rFonts w:ascii="Consolas" w:hAnsi="Consolas"/>
                 <w:b w:val="0"/>
-                <w:color w:val="172033"/>
+                <w:color w:val="000000"/>
                 <w:sz w:val="16"/>
               </w:rPr>
               <w:t>if coins &gt;= 10:</w:t>
@@ -833,7 +963,7 @@
               <w:rPr>
                 <w:rFonts w:ascii="Consolas" w:hAnsi="Consolas"/>
                 <w:b w:val="0"/>
-                <w:color w:val="172033"/>
+                <w:color w:val="000000"/>
                 <w:sz w:val="16"/>
               </w:rPr>
               <w:t xml:space="preserve">    print("1-UP")</w:t>
@@ -847,7 +977,35 @@
               <w:rPr>
                 <w:rFonts w:ascii="Consolas" w:hAnsi="Consolas"/>
                 <w:b w:val="0"/>
-                <w:color w:val="172033"/>
+                <w:color w:val="000000"/>
+                <w:sz w:val="16"/>
+              </w:rPr>
+              <w:t>elif coins &gt;= 5:</w:t>
+            </w:r>
+          </w:p>
+          <w:p>
+            <w:pPr>
+              <w:spacing w:after="20"/>
+            </w:pPr>
+            <w:r>
+              <w:rPr>
+                <w:rFonts w:ascii="Consolas" w:hAnsi="Consolas"/>
+                <w:b w:val="0"/>
+                <w:color w:val="000000"/>
+                <w:sz w:val="16"/>
+              </w:rPr>
+              <w:t xml:space="preserve">    print("Almost")</w:t>
+            </w:r>
+          </w:p>
+          <w:p>
+            <w:pPr>
+              <w:spacing w:after="20"/>
+            </w:pPr>
+            <w:r>
+              <w:rPr>
+                <w:rFonts w:ascii="Consolas" w:hAnsi="Consolas"/>
+                <w:b w:val="0"/>
+                <w:color w:val="000000"/>
                 <w:sz w:val="16"/>
               </w:rPr>
               <w:t>else:</w:t>
@@ -861,7 +1019,7 @@
               <w:rPr>
                 <w:rFonts w:ascii="Consolas" w:hAnsi="Consolas"/>
                 <w:b w:val="0"/>
-                <w:color w:val="172033"/>
+                <w:color w:val="000000"/>
                 <w:sz w:val="16"/>
               </w:rPr>
               <w:t xml:space="preserve">    print("Keep going")</w:t>
@@ -888,7 +1046,7 @@
         <w:tc>
           <w:tcPr>
             <w:tcW w:type="dxa" w:w="6538"/>
-            <w:shd w:fill="EAF2FF"/>
+            <w:shd w:fill="F5F5F5"/>
           </w:tcPr>
           <w:p>
             <w:pPr>
@@ -898,7 +1056,7 @@
               <w:rPr>
                 <w:rFonts w:ascii="Aptos" w:hAnsi="Aptos"/>
                 <w:b/>
-                <w:color w:val="2F6FEB"/>
+                <w:color w:val="000000"/>
                 <w:sz w:val="20"/>
               </w:rPr>
               <w:t>Comparisons</w:t>
@@ -912,7 +1070,7 @@
               <w:rPr>
                 <w:rFonts w:ascii="Aptos" w:hAnsi="Aptos"/>
                 <w:b w:val="0"/>
-                <w:color w:val="172033"/>
+                <w:color w:val="000000"/>
                 <w:sz w:val="17"/>
               </w:rPr>
               <w:t>== equal   != not equal   &gt; greater   &lt; less   &gt;= at least   &lt;= at most</w:t>
@@ -939,7 +1097,7 @@
         <w:tc>
           <w:tcPr>
             <w:tcW w:type="dxa" w:w="6538"/>
-            <w:shd w:fill="EAF2FF"/>
+            <w:shd w:fill="F5F5F5"/>
           </w:tcPr>
           <w:p>
             <w:pPr>
@@ -949,7 +1107,7 @@
               <w:rPr>
                 <w:rFonts w:ascii="Aptos" w:hAnsi="Aptos"/>
                 <w:b/>
-                <w:color w:val="2F6FEB"/>
+                <w:color w:val="000000"/>
                 <w:sz w:val="20"/>
               </w:rPr>
               <w:t>Logic</w:t>
@@ -963,10 +1121,10 @@
               <w:rPr>
                 <w:rFonts w:ascii="Aptos" w:hAnsi="Aptos"/>
                 <w:b w:val="0"/>
-                <w:color w:val="172033"/>
+                <w:color w:val="000000"/>
                 <w:sz w:val="17"/>
               </w:rPr>
-              <w:t>and needs both conditions.  or needs either condition.  not reverses True and False.</w:t>
+              <w:t>and needs both conditions. or needs either condition. not reverses True and False.</w:t>
             </w:r>
           </w:p>
         </w:tc>
@@ -990,7 +1148,7 @@
         <w:tc>
           <w:tcPr>
             <w:tcW w:type="dxa" w:w="6538"/>
-            <w:shd w:fill="EAF2FF"/>
+            <w:shd w:fill="F5F5F5"/>
           </w:tcPr>
           <w:p>
             <w:pPr>
@@ -1000,10 +1158,10 @@
               <w:rPr>
                 <w:rFonts w:ascii="Aptos" w:hAnsi="Aptos"/>
                 <w:b/>
-                <w:color w:val="2F6FEB"/>
+                <w:color w:val="000000"/>
                 <w:sz w:val="20"/>
               </w:rPr>
-              <w:t>Remember</w:t>
+              <w:t>Common mistake</w:t>
             </w:r>
           </w:p>
           <w:p>
@@ -1014,10 +1172,10 @@
               <w:rPr>
                 <w:rFonts w:ascii="Consolas" w:hAnsi="Consolas"/>
                 <w:b w:val="0"/>
-                <w:color w:val="172033"/>
+                <w:color w:val="000000"/>
                 <w:sz w:val="16"/>
               </w:rPr>
-              <w:t>Use == to compare. Use = to assign a value.</w:t>
+              <w:t>Use == to compare values. Use = to assign a value to a variable.</w:t>
             </w:r>
           </w:p>
         </w:tc>
@@ -1036,7 +1194,7 @@
         <w:rPr>
           <w:rFonts w:ascii="Aptos" w:hAnsi="Aptos"/>
           <w:b/>
-          <w:color w:val="556070"/>
+          <w:color w:val="444444"/>
           <w:sz w:val="15"/>
         </w:rPr>
         <w:t>PYTHON FIELD GUIDE   4</w:t>
@@ -1071,7 +1229,7 @@
         <w:rPr>
           <w:rFonts w:ascii="Aptos" w:hAnsi="Aptos"/>
           <w:b w:val="0"/>
-          <w:color w:val="556070"/>
+          <w:color w:val="444444"/>
           <w:sz w:val="20"/>
         </w:rPr>
         <w:t>Repeat a known number of times</w:t>
@@ -1090,7 +1248,7 @@
         <w:tc>
           <w:tcPr>
             <w:tcW w:type="dxa" w:w="6538"/>
-            <w:shd w:fill="EAF2FF"/>
+            <w:shd w:fill="F5F5F5"/>
           </w:tcPr>
           <w:p>
             <w:pPr>
@@ -1100,7 +1258,7 @@
               <w:rPr>
                 <w:rFonts w:ascii="Aptos" w:hAnsi="Aptos"/>
                 <w:b/>
-                <w:color w:val="2F6FEB"/>
+                <w:color w:val="000000"/>
                 <w:sz w:val="20"/>
               </w:rPr>
               <w:t>Loop through a list</w:t>
@@ -1114,7 +1272,7 @@
               <w:rPr>
                 <w:rFonts w:ascii="Consolas" w:hAnsi="Consolas"/>
                 <w:b w:val="0"/>
-                <w:color w:val="172033"/>
+                <w:color w:val="000000"/>
                 <w:sz w:val="16"/>
               </w:rPr>
               <w:t>for enemy in ["Boo", "Goomba"]:</w:t>
@@ -1128,7 +1286,7 @@
               <w:rPr>
                 <w:rFonts w:ascii="Consolas" w:hAnsi="Consolas"/>
                 <w:b w:val="0"/>
-                <w:color w:val="172033"/>
+                <w:color w:val="000000"/>
                 <w:sz w:val="16"/>
               </w:rPr>
               <w:t xml:space="preserve">    print(enemy)</w:t>
@@ -1155,7 +1313,7 @@
         <w:tc>
           <w:tcPr>
             <w:tcW w:type="dxa" w:w="6538"/>
-            <w:shd w:fill="EAF2FF"/>
+            <w:shd w:fill="F5F5F5"/>
           </w:tcPr>
           <w:p>
             <w:pPr>
@@ -1165,7 +1323,7 @@
               <w:rPr>
                 <w:rFonts w:ascii="Aptos" w:hAnsi="Aptos"/>
                 <w:b/>
-                <w:color w:val="2F6FEB"/>
+                <w:color w:val="000000"/>
                 <w:sz w:val="20"/>
               </w:rPr>
               <w:t>What range means</w:t>
@@ -1179,7 +1337,7 @@
               <w:rPr>
                 <w:rFonts w:ascii="Consolas" w:hAnsi="Consolas"/>
                 <w:b w:val="0"/>
-                <w:color w:val="172033"/>
+                <w:color w:val="000000"/>
                 <w:sz w:val="16"/>
               </w:rPr>
               <w:t>range(4) produces 0, 1, 2, 3. It starts at 0 and stops before 4.</w:t>
@@ -1206,7 +1364,7 @@
         <w:tc>
           <w:tcPr>
             <w:tcW w:type="dxa" w:w="6538"/>
-            <w:shd w:fill="EAF2FF"/>
+            <w:shd w:fill="F5F5F5"/>
           </w:tcPr>
           <w:p>
             <w:pPr>
@@ -1216,7 +1374,7 @@
               <w:rPr>
                 <w:rFonts w:ascii="Aptos" w:hAnsi="Aptos"/>
                 <w:b/>
-                <w:color w:val="2F6FEB"/>
+                <w:color w:val="000000"/>
                 <w:sz w:val="20"/>
               </w:rPr>
               <w:t>Three useful forms</w:t>
@@ -1230,7 +1388,7 @@
               <w:rPr>
                 <w:rFonts w:ascii="Consolas" w:hAnsi="Consolas"/>
                 <w:b w:val="0"/>
-                <w:color w:val="172033"/>
+                <w:color w:val="000000"/>
                 <w:sz w:val="16"/>
               </w:rPr>
               <w:t>range(4) -&gt; 0,1,2,3</w:t>
@@ -1244,7 +1402,7 @@
               <w:rPr>
                 <w:rFonts w:ascii="Consolas" w:hAnsi="Consolas"/>
                 <w:b w:val="0"/>
-                <w:color w:val="172033"/>
+                <w:color w:val="000000"/>
                 <w:sz w:val="16"/>
               </w:rPr>
               <w:t>range(2, 5) -&gt; 2,3,4</w:t>
@@ -1258,7 +1416,7 @@
               <w:rPr>
                 <w:rFonts w:ascii="Consolas" w:hAnsi="Consolas"/>
                 <w:b w:val="0"/>
-                <w:color w:val="172033"/>
+                <w:color w:val="000000"/>
                 <w:sz w:val="16"/>
               </w:rPr>
               <w:t>range(2, 9, 2) -&gt; 2,4,6,8</w:t>
@@ -1285,7 +1443,7 @@
         <w:tc>
           <w:tcPr>
             <w:tcW w:type="dxa" w:w="6538"/>
-            <w:shd w:fill="EAF2FF"/>
+            <w:shd w:fill="F5F5F5"/>
           </w:tcPr>
           <w:p>
             <w:pPr>
@@ -1295,10 +1453,10 @@
               <w:rPr>
                 <w:rFonts w:ascii="Aptos" w:hAnsi="Aptos"/>
                 <w:b/>
-                <w:color w:val="2F6FEB"/>
+                <w:color w:val="000000"/>
                 <w:sz w:val="20"/>
               </w:rPr>
-              <w:t>Accumulator</w:t>
+              <w:t>Accumulator pattern</w:t>
             </w:r>
           </w:p>
           <w:p>
@@ -1309,7 +1467,7 @@
               <w:rPr>
                 <w:rFonts w:ascii="Consolas" w:hAnsi="Consolas"/>
                 <w:b w:val="0"/>
-                <w:color w:val="172033"/>
+                <w:color w:val="000000"/>
                 <w:sz w:val="16"/>
               </w:rPr>
               <w:t>total = 0</w:t>
@@ -1323,7 +1481,7 @@
               <w:rPr>
                 <w:rFonts w:ascii="Consolas" w:hAnsi="Consolas"/>
                 <w:b w:val="0"/>
-                <w:color w:val="172033"/>
+                <w:color w:val="000000"/>
                 <w:sz w:val="16"/>
               </w:rPr>
               <w:t>for coin in [2, 4, 6]:</w:t>
@@ -1337,7 +1495,7 @@
               <w:rPr>
                 <w:rFonts w:ascii="Consolas" w:hAnsi="Consolas"/>
                 <w:b w:val="0"/>
-                <w:color w:val="172033"/>
+                <w:color w:val="000000"/>
                 <w:sz w:val="16"/>
               </w:rPr>
               <w:t xml:space="preserve">    total = total + coin</w:t>
@@ -1359,7 +1517,7 @@
         <w:rPr>
           <w:rFonts w:ascii="Aptos" w:hAnsi="Aptos"/>
           <w:b/>
-          <w:color w:val="556070"/>
+          <w:color w:val="444444"/>
           <w:sz w:val="15"/>
         </w:rPr>
         <w:t>PYTHON FIELD GUIDE   5</w:t>
@@ -1394,7 +1552,7 @@
         <w:rPr>
           <w:rFonts w:ascii="Aptos" w:hAnsi="Aptos"/>
           <w:b w:val="0"/>
-          <w:color w:val="556070"/>
+          <w:color w:val="444444"/>
           <w:sz w:val="20"/>
         </w:rPr>
         <w:t>Repeat while a condition stays True</w:t>
@@ -1413,7 +1571,7 @@
         <w:tc>
           <w:tcPr>
             <w:tcW w:type="dxa" w:w="6538"/>
-            <w:shd w:fill="EAF2FF"/>
+            <w:shd w:fill="F5F5F5"/>
           </w:tcPr>
           <w:p>
             <w:pPr>
@@ -1423,7 +1581,7 @@
               <w:rPr>
                 <w:rFonts w:ascii="Aptos" w:hAnsi="Aptos"/>
                 <w:b/>
-                <w:color w:val="2F6FEB"/>
+                <w:color w:val="000000"/>
                 <w:sz w:val="20"/>
               </w:rPr>
               <w:t>Basic pattern</w:t>
@@ -1437,7 +1595,7 @@
               <w:rPr>
                 <w:rFonts w:ascii="Consolas" w:hAnsi="Consolas"/>
                 <w:b w:val="0"/>
-                <w:color w:val="172033"/>
+                <w:color w:val="000000"/>
                 <w:sz w:val="16"/>
               </w:rPr>
               <w:t>lives = 3</w:t>
@@ -1451,7 +1609,7 @@
               <w:rPr>
                 <w:rFonts w:ascii="Consolas" w:hAnsi="Consolas"/>
                 <w:b w:val="0"/>
-                <w:color w:val="172033"/>
+                <w:color w:val="000000"/>
                 <w:sz w:val="16"/>
               </w:rPr>
               <w:t>while lives &gt; 0:</w:t>
@@ -1465,7 +1623,7 @@
               <w:rPr>
                 <w:rFonts w:ascii="Consolas" w:hAnsi="Consolas"/>
                 <w:b w:val="0"/>
-                <w:color w:val="172033"/>
+                <w:color w:val="000000"/>
                 <w:sz w:val="16"/>
               </w:rPr>
               <w:t xml:space="preserve">    lives = lives - 1</w:t>
@@ -1492,7 +1650,7 @@
         <w:tc>
           <w:tcPr>
             <w:tcW w:type="dxa" w:w="6538"/>
-            <w:shd w:fill="EAF2FF"/>
+            <w:shd w:fill="F5F5F5"/>
           </w:tcPr>
           <w:p>
             <w:pPr>
@@ -1502,7 +1660,7 @@
               <w:rPr>
                 <w:rFonts w:ascii="Aptos" w:hAnsi="Aptos"/>
                 <w:b/>
-                <w:color w:val="2F6FEB"/>
+                <w:color w:val="000000"/>
                 <w:sz w:val="20"/>
               </w:rPr>
               <w:t>Ask two questions</w:t>
@@ -1516,10 +1674,10 @@
               <w:rPr>
                 <w:rFonts w:ascii="Aptos" w:hAnsi="Aptos"/>
                 <w:b w:val="0"/>
-                <w:color w:val="172033"/>
+                <w:color w:val="000000"/>
                 <w:sz w:val="17"/>
               </w:rPr>
-              <w:t>What condition keeps the loop running? What changes so the loop can stop?</w:t>
+              <w:t>What condition keeps the loop running? What changes so that condition becomes False?</w:t>
             </w:r>
           </w:p>
         </w:tc>
@@ -1543,7 +1701,7 @@
         <w:tc>
           <w:tcPr>
             <w:tcW w:type="dxa" w:w="6538"/>
-            <w:shd w:fill="EAF2FF"/>
+            <w:shd w:fill="F5F5F5"/>
           </w:tcPr>
           <w:p>
             <w:pPr>
@@ -1553,7 +1711,7 @@
               <w:rPr>
                 <w:rFonts w:ascii="Aptos" w:hAnsi="Aptos"/>
                 <w:b/>
-                <w:color w:val="2F6FEB"/>
+                <w:color w:val="000000"/>
                 <w:sz w:val="20"/>
               </w:rPr>
               <w:t>Avoid infinite loops</w:t>
@@ -1567,7 +1725,7 @@
               <w:rPr>
                 <w:rFonts w:ascii="Aptos" w:hAnsi="Aptos"/>
                 <w:b w:val="0"/>
-                <w:color w:val="172033"/>
+                <w:color w:val="000000"/>
                 <w:sz w:val="17"/>
               </w:rPr>
               <w:t>If the condition never becomes False, the loop never stops. Update the condition variable inside the loop.</w:t>
@@ -1594,7 +1752,7 @@
         <w:tc>
           <w:tcPr>
             <w:tcW w:type="dxa" w:w="6538"/>
-            <w:shd w:fill="EAF2FF"/>
+            <w:shd w:fill="F5F5F5"/>
           </w:tcPr>
           <w:p>
             <w:pPr>
@@ -1604,7 +1762,7 @@
               <w:rPr>
                 <w:rFonts w:ascii="Aptos" w:hAnsi="Aptos"/>
                 <w:b/>
-                <w:color w:val="2F6FEB"/>
+                <w:color w:val="000000"/>
                 <w:sz w:val="20"/>
               </w:rPr>
               <w:t>Choose the loop</w:t>
@@ -1618,10 +1776,61 @@
               <w:rPr>
                 <w:rFonts w:ascii="Consolas" w:hAnsi="Consolas"/>
                 <w:b w:val="0"/>
-                <w:color w:val="172033"/>
+                <w:color w:val="000000"/>
                 <w:sz w:val="16"/>
               </w:rPr>
               <w:t>Use for for a list or known count. Use while when repetition depends on a condition.</w:t>
+            </w:r>
+          </w:p>
+        </w:tc>
+      </w:tr>
+    </w:tbl>
+    <w:p>
+      <w:pPr>
+        <w:spacing w:after="60"/>
+      </w:pPr>
+    </w:p>
+    <w:tbl>
+      <w:tblPr>
+        <w:tblW w:type="auto" w:w="0"/>
+        <w:tblLayout w:type="fixed"/>
+        <w:tblLook w:firstColumn="1" w:firstRow="1" w:lastColumn="0" w:lastRow="0" w:noHBand="0" w:noVBand="1" w:val="04A0"/>
+      </w:tblPr>
+      <w:tblGrid>
+        <w:gridCol w:w="6480"/>
+      </w:tblGrid>
+      <w:tr>
+        <w:tc>
+          <w:tcPr>
+            <w:tcW w:type="dxa" w:w="6538"/>
+            <w:shd w:fill="F5F5F5"/>
+          </w:tcPr>
+          <w:p>
+            <w:pPr>
+              <w:spacing w:after="60"/>
+            </w:pPr>
+            <w:r>
+              <w:rPr>
+                <w:rFonts w:ascii="Aptos" w:hAnsi="Aptos"/>
+                <w:b/>
+                <w:color w:val="000000"/>
+                <w:sz w:val="20"/>
+              </w:rPr>
+              <w:t>Useful controls</w:t>
+            </w:r>
+          </w:p>
+          <w:p>
+            <w:pPr>
+              <w:spacing w:after="20"/>
+            </w:pPr>
+            <w:r>
+              <w:rPr>
+                <w:rFonts w:ascii="Aptos" w:hAnsi="Aptos"/>
+                <w:b w:val="0"/>
+                <w:color w:val="000000"/>
+                <w:sz w:val="17"/>
+              </w:rPr>
+              <w:t>break exits a loop early. continue skips to the next iteration.</w:t>
             </w:r>
           </w:p>
         </w:tc>
@@ -1640,7 +1849,7 @@
         <w:rPr>
           <w:rFonts w:ascii="Aptos" w:hAnsi="Aptos"/>
           <w:b/>
-          <w:color w:val="556070"/>
+          <w:color w:val="444444"/>
           <w:sz w:val="15"/>
         </w:rPr>
         <w:t>PYTHON FIELD GUIDE   6</w:t>
@@ -1675,10 +1884,10 @@
         <w:rPr>
           <w:rFonts w:ascii="Aptos" w:hAnsi="Aptos"/>
           <w:b w:val="0"/>
-          <w:color w:val="556070"/>
+          <w:color w:val="444444"/>
           <w:sz w:val="20"/>
         </w:rPr>
-        <w:t>Give reusable code a name</w:t>
+        <w:t>Give reusable code a clear name</w:t>
       </w:r>
     </w:p>
     <w:tbl>
@@ -1694,7 +1903,7 @@
         <w:tc>
           <w:tcPr>
             <w:tcW w:type="dxa" w:w="6538"/>
-            <w:shd w:fill="EAF2FF"/>
+            <w:shd w:fill="F5F5F5"/>
           </w:tcPr>
           <w:p>
             <w:pPr>
@@ -1704,7 +1913,7 @@
               <w:rPr>
                 <w:rFonts w:ascii="Aptos" w:hAnsi="Aptos"/>
                 <w:b/>
-                <w:color w:val="2F6FEB"/>
+                <w:color w:val="000000"/>
                 <w:sz w:val="20"/>
               </w:rPr>
               <w:t>Define and call</w:t>
@@ -1718,7 +1927,7 @@
               <w:rPr>
                 <w:rFonts w:ascii="Consolas" w:hAnsi="Consolas"/>
                 <w:b w:val="0"/>
-                <w:color w:val="172033"/>
+                <w:color w:val="000000"/>
                 <w:sz w:val="16"/>
               </w:rPr>
               <w:t>def power(base, bonus):</w:t>
@@ -1732,7 +1941,7 @@
               <w:rPr>
                 <w:rFonts w:ascii="Consolas" w:hAnsi="Consolas"/>
                 <w:b w:val="0"/>
-                <w:color w:val="172033"/>
+                <w:color w:val="000000"/>
                 <w:sz w:val="16"/>
               </w:rPr>
               <w:t xml:space="preserve">    return base + bonus</w:t>
@@ -1746,7 +1955,7 @@
               <w:rPr>
                 <w:rFonts w:ascii="Consolas" w:hAnsi="Consolas"/>
                 <w:b w:val="0"/>
-                <w:color w:val="172033"/>
+                <w:color w:val="000000"/>
                 <w:sz w:val="16"/>
               </w:rPr>
             </w:r>
@@ -1759,7 +1968,7 @@
               <w:rPr>
                 <w:rFonts w:ascii="Consolas" w:hAnsi="Consolas"/>
                 <w:b w:val="0"/>
-                <w:color w:val="172033"/>
+                <w:color w:val="000000"/>
                 <w:sz w:val="16"/>
               </w:rPr>
               <w:t>score = power(7, 5)</w:t>
@@ -1786,7 +1995,7 @@
         <w:tc>
           <w:tcPr>
             <w:tcW w:type="dxa" w:w="6538"/>
-            <w:shd w:fill="EAF2FF"/>
+            <w:shd w:fill="F5F5F5"/>
           </w:tcPr>
           <w:p>
             <w:pPr>
@@ -1796,7 +2005,7 @@
               <w:rPr>
                 <w:rFonts w:ascii="Aptos" w:hAnsi="Aptos"/>
                 <w:b/>
-                <w:color w:val="2F6FEB"/>
+                <w:color w:val="000000"/>
                 <w:sz w:val="20"/>
               </w:rPr>
               <w:t>Vocabulary</w:t>
@@ -1810,7 +2019,7 @@
               <w:rPr>
                 <w:rFonts w:ascii="Aptos" w:hAnsi="Aptos"/>
                 <w:b w:val="0"/>
-                <w:color w:val="172033"/>
+                <w:color w:val="000000"/>
                 <w:sz w:val="17"/>
               </w:rPr>
               <w:t>Parameters are names in the definition. Arguments are values sent into the call.</w:t>
@@ -1837,7 +2046,7 @@
         <w:tc>
           <w:tcPr>
             <w:tcW w:type="dxa" w:w="6538"/>
-            <w:shd w:fill="EAF2FF"/>
+            <w:shd w:fill="F5F5F5"/>
           </w:tcPr>
           <w:p>
             <w:pPr>
@@ -1847,7 +2056,7 @@
               <w:rPr>
                 <w:rFonts w:ascii="Aptos" w:hAnsi="Aptos"/>
                 <w:b/>
-                <w:color w:val="2F6FEB"/>
+                <w:color w:val="000000"/>
                 <w:sz w:val="20"/>
               </w:rPr>
               <w:t>return</w:t>
@@ -1861,7 +2070,7 @@
               <w:rPr>
                 <w:rFonts w:ascii="Aptos" w:hAnsi="Aptos"/>
                 <w:b w:val="0"/>
-                <w:color w:val="172033"/>
+                <w:color w:val="000000"/>
                 <w:sz w:val="17"/>
               </w:rPr>
               <w:t>return sends a value back to the caller. Here, power(7, 5) returns 12.</w:t>
@@ -1888,7 +2097,7 @@
         <w:tc>
           <w:tcPr>
             <w:tcW w:type="dxa" w:w="6538"/>
-            <w:shd w:fill="EAF2FF"/>
+            <w:shd w:fill="F5F5F5"/>
           </w:tcPr>
           <w:p>
             <w:pPr>
@@ -1898,7 +2107,7 @@
               <w:rPr>
                 <w:rFonts w:ascii="Aptos" w:hAnsi="Aptos"/>
                 <w:b/>
-                <w:color w:val="2F6FEB"/>
+                <w:color w:val="000000"/>
                 <w:sz w:val="20"/>
               </w:rPr>
               <w:t>None</w:t>
@@ -1912,7 +2121,7 @@
               <w:rPr>
                 <w:rFonts w:ascii="Aptos" w:hAnsi="Aptos"/>
                 <w:b w:val="0"/>
-                <w:color w:val="172033"/>
+                <w:color w:val="000000"/>
                 <w:sz w:val="17"/>
               </w:rPr>
               <w:t>None means no value. A function without return still runs, but its result is None.</w:t>
@@ -1939,7 +2148,7 @@
         <w:tc>
           <w:tcPr>
             <w:tcW w:type="dxa" w:w="6538"/>
-            <w:shd w:fill="EAF2FF"/>
+            <w:shd w:fill="F5F5F5"/>
           </w:tcPr>
           <w:p>
             <w:pPr>
@@ -1949,7 +2158,7 @@
               <w:rPr>
                 <w:rFonts w:ascii="Aptos" w:hAnsi="Aptos"/>
                 <w:b/>
-                <w:color w:val="2F6FEB"/>
+                <w:color w:val="000000"/>
                 <w:sz w:val="20"/>
               </w:rPr>
               <w:t>Print is different</w:t>
@@ -1963,10 +2172,10 @@
               <w:rPr>
                 <w:rFonts w:ascii="Aptos" w:hAnsi="Aptos"/>
                 <w:b w:val="0"/>
-                <w:color w:val="172033"/>
+                <w:color w:val="000000"/>
                 <w:sz w:val="17"/>
               </w:rPr>
-              <w:t>print shows text on screen. return gives a value back so the program can reuse it.</w:t>
+              <w:t>print displays information. return gives a value back so the program can reuse it.</w:t>
             </w:r>
           </w:p>
         </w:tc>
@@ -1985,7 +2194,7 @@
         <w:rPr>
           <w:rFonts w:ascii="Aptos" w:hAnsi="Aptos"/>
           <w:b/>
-          <w:color w:val="556070"/>
+          <w:color w:val="444444"/>
           <w:sz w:val="15"/>
         </w:rPr>
         <w:t>PYTHON FIELD GUIDE   7</w:t>
@@ -2009,7 +2218,7 @@
           <w:color w:val="000000"/>
           <w:sz w:val="40"/>
         </w:rPr>
-        <w:t>Debug and look it up</w:t>
+        <w:t>Current course quick check</w:t>
       </w:r>
     </w:p>
     <w:p>
@@ -2020,10 +2229,10 @@
         <w:rPr>
           <w:rFonts w:ascii="Aptos" w:hAnsi="Aptos"/>
           <w:b w:val="0"/>
-          <w:color w:val="556070"/>
+          <w:color w:val="444444"/>
           <w:sz w:val="20"/>
         </w:rPr>
-        <w:t>A routine for getting unstuck</w:t>
+        <w:t>Use this before asking for help</w:t>
       </w:r>
     </w:p>
     <w:tbl>
@@ -2039,7 +2248,7 @@
         <w:tc>
           <w:tcPr>
             <w:tcW w:type="dxa" w:w="6538"/>
-            <w:shd w:fill="EAF2FF"/>
+            <w:shd w:fill="F5F5F5"/>
           </w:tcPr>
           <w:p>
             <w:pPr>
@@ -2049,10 +2258,10 @@
               <w:rPr>
                 <w:rFonts w:ascii="Aptos" w:hAnsi="Aptos"/>
                 <w:b/>
-                <w:color w:val="2F6FEB"/>
+                <w:color w:val="000000"/>
                 <w:sz w:val="20"/>
               </w:rPr>
-              <w:t>1 Read the error</w:t>
+              <w:t>Trace</w:t>
             </w:r>
           </w:p>
           <w:p>
@@ -2063,10 +2272,10 @@
               <w:rPr>
                 <w:rFonts w:ascii="Aptos" w:hAnsi="Aptos"/>
                 <w:b w:val="0"/>
-                <w:color w:val="172033"/>
+                <w:color w:val="000000"/>
                 <w:sz w:val="17"/>
               </w:rPr>
-              <w:t>The last line usually names the error and points toward the problem.</w:t>
+              <w:t>Write the value of each variable after every line. For a loop, trace one iteration at a time.</w:t>
             </w:r>
           </w:p>
         </w:tc>
@@ -2090,7 +2299,7 @@
         <w:tc>
           <w:tcPr>
             <w:tcW w:type="dxa" w:w="6538"/>
-            <w:shd w:fill="EAF2FF"/>
+            <w:shd w:fill="F5F5F5"/>
           </w:tcPr>
           <w:p>
             <w:pPr>
@@ -2100,10 +2309,10 @@
               <w:rPr>
                 <w:rFonts w:ascii="Aptos" w:hAnsi="Aptos"/>
                 <w:b/>
-                <w:color w:val="2F6FEB"/>
+                <w:color w:val="000000"/>
                 <w:sz w:val="20"/>
               </w:rPr>
-              <w:t>2 Check the shape</w:t>
+              <w:t>Check the shape</w:t>
             </w:r>
           </w:p>
           <w:p>
@@ -2114,7 +2323,7 @@
               <w:rPr>
                 <w:rFonts w:ascii="Consolas" w:hAnsi="Consolas"/>
                 <w:b w:val="0"/>
-                <w:color w:val="172033"/>
+                <w:color w:val="000000"/>
                 <w:sz w:val="16"/>
               </w:rPr>
               <w:t>Look for missing colons, parentheses, quotes, indentation, or misspelled names.</w:t>
@@ -2141,7 +2350,7 @@
         <w:tc>
           <w:tcPr>
             <w:tcW w:type="dxa" w:w="6538"/>
-            <w:shd w:fill="EAF2FF"/>
+            <w:shd w:fill="F5F5F5"/>
           </w:tcPr>
           <w:p>
             <w:pPr>
@@ -2151,10 +2360,10 @@
               <w:rPr>
                 <w:rFonts w:ascii="Aptos" w:hAnsi="Aptos"/>
                 <w:b/>
-                <w:color w:val="2F6FEB"/>
+                <w:color w:val="000000"/>
                 <w:sz w:val="20"/>
               </w:rPr>
-              <w:t>3 Trace values</w:t>
+              <w:t>Test one piece</w:t>
             </w:r>
           </w:p>
           <w:p>
@@ -2163,12 +2372,12 @@
             </w:pPr>
             <w:r>
               <w:rPr>
-                <w:rFonts w:ascii="Consolas" w:hAnsi="Consolas"/>
+                <w:rFonts w:ascii="Aptos" w:hAnsi="Aptos"/>
                 <w:b w:val="0"/>
-                <w:color w:val="172033"/>
-                <w:sz w:val="16"/>
+                <w:color w:val="000000"/>
+                <w:sz w:val="17"/>
               </w:rPr>
-              <w:t>Use print(variable) to see what a value is during the program.</w:t>
+              <w:t>Run one expression, condition, loop, or function call before testing the whole program.</w:t>
             </w:r>
           </w:p>
         </w:tc>
@@ -2192,7 +2401,7 @@
         <w:tc>
           <w:tcPr>
             <w:tcW w:type="dxa" w:w="6538"/>
-            <w:shd w:fill="EAF2FF"/>
+            <w:shd w:fill="F5F5F5"/>
           </w:tcPr>
           <w:p>
             <w:pPr>
@@ -2202,10 +2411,10 @@
               <w:rPr>
                 <w:rFonts w:ascii="Aptos" w:hAnsi="Aptos"/>
                 <w:b/>
-                <w:color w:val="2F6FEB"/>
+                <w:color w:val="000000"/>
                 <w:sz w:val="20"/>
               </w:rPr>
-              <w:t>4 Test a small piece</w:t>
+              <w:t>Explain</w:t>
             </w:r>
           </w:p>
           <w:p>
@@ -2216,10 +2425,10 @@
               <w:rPr>
                 <w:rFonts w:ascii="Aptos" w:hAnsi="Aptos"/>
                 <w:b w:val="0"/>
-                <w:color w:val="172033"/>
+                <w:color w:val="000000"/>
                 <w:sz w:val="17"/>
               </w:rPr>
-              <w:t>Run one line, one condition, or one function call before testing the whole program.</w:t>
+              <w:t>Can you say what each variable stores, when each loop stops, and what each function returns?</w:t>
             </w:r>
           </w:p>
         </w:tc>
@@ -2243,7 +2452,7 @@
         <w:tc>
           <w:tcPr>
             <w:tcW w:type="dxa" w:w="6538"/>
-            <w:shd w:fill="EAF2FF"/>
+            <w:shd w:fill="F5F5F5"/>
           </w:tcPr>
           <w:p>
             <w:pPr>
@@ -2253,10 +2462,10 @@
               <w:rPr>
                 <w:rFonts w:ascii="Aptos" w:hAnsi="Aptos"/>
                 <w:b/>
-                <w:color w:val="2F6FEB"/>
+                <w:color w:val="000000"/>
                 <w:sz w:val="20"/>
               </w:rPr>
-              <w:t>Good search</w:t>
+              <w:t>Search precisely</w:t>
             </w:r>
           </w:p>
           <w:p>
@@ -2267,10 +2476,138 @@
               <w:rPr>
                 <w:rFonts w:ascii="Aptos" w:hAnsi="Aptos"/>
                 <w:b w:val="0"/>
-                <w:color w:val="172033"/>
+                <w:color w:val="000000"/>
                 <w:sz w:val="17"/>
               </w:rPr>
-              <w:t>Search the exact goal: Python add item to list or Python range start stop step.</w:t>
+              <w:t>Try: Python add item to list, Python range start stop step, or Python function returns None.</w:t>
+            </w:r>
+          </w:p>
+        </w:tc>
+      </w:tr>
+    </w:tbl>
+    <w:p>
+      <w:pPr>
+        <w:spacing w:after="60"/>
+      </w:pPr>
+    </w:p>
+    <w:p>
+      <w:pPr>
+        <w:jc w:val="right"/>
+      </w:pPr>
+      <w:r>
+        <w:rPr>
+          <w:rFonts w:ascii="Aptos" w:hAnsi="Aptos"/>
+          <w:b/>
+          <w:color w:val="444444"/>
+          <w:sz w:val="15"/>
+        </w:rPr>
+        <w:t>PYTHON FIELD GUIDE   8</w:t>
+      </w:r>
+    </w:p>
+    <w:p>
+      <w:r>
+        <w:br w:type="page"/>
+      </w:r>
+    </w:p>
+    <w:p>
+      <w:pPr>
+        <w:pStyle w:val="Title"/>
+        <w:spacing w:after="40"/>
+        <w:jc w:val="left"/>
+      </w:pPr>
+      <w:r>
+        <w:rPr>
+          <w:rFonts w:ascii="Aptos" w:hAnsi="Aptos"/>
+          <w:b/>
+          <w:color w:val="000000"/>
+          <w:sz w:val="40"/>
+        </w:rPr>
+        <w:t>Future strings and numbers</w:t>
+      </w:r>
+    </w:p>
+    <w:p>
+      <w:pPr>
+        <w:spacing w:after="180"/>
+      </w:pPr>
+      <w:r>
+        <w:rPr>
+          <w:rFonts w:ascii="Aptos" w:hAnsi="Aptos"/>
+          <w:b w:val="0"/>
+          <w:color w:val="444444"/>
+          <w:sz w:val="20"/>
+        </w:rPr>
+        <w:t>Convert and format information</w:t>
+      </w:r>
+    </w:p>
+    <w:tbl>
+      <w:tblPr>
+        <w:tblW w:type="auto" w:w="0"/>
+        <w:tblLayout w:type="fixed"/>
+        <w:tblLook w:firstColumn="1" w:firstRow="1" w:lastColumn="0" w:lastRow="0" w:noHBand="0" w:noVBand="1" w:val="04A0"/>
+      </w:tblPr>
+      <w:tblGrid>
+        <w:gridCol w:w="6480"/>
+      </w:tblGrid>
+      <w:tr>
+        <w:tc>
+          <w:tcPr>
+            <w:tcW w:type="dxa" w:w="6538"/>
+            <w:shd w:fill="F5F5F5"/>
+          </w:tcPr>
+          <w:p>
+            <w:pPr>
+              <w:spacing w:after="60"/>
+            </w:pPr>
+            <w:r>
+              <w:rPr>
+                <w:rFonts w:ascii="Aptos" w:hAnsi="Aptos"/>
+                <w:b/>
+                <w:color w:val="000000"/>
+                <w:sz w:val="20"/>
+              </w:rPr>
+              <w:t>Input conversion</w:t>
+            </w:r>
+          </w:p>
+          <w:p>
+            <w:pPr>
+              <w:spacing w:after="20"/>
+            </w:pPr>
+            <w:r>
+              <w:rPr>
+                <w:rFonts w:ascii="Consolas" w:hAnsi="Consolas"/>
+                <w:b w:val="0"/>
+                <w:color w:val="000000"/>
+                <w:sz w:val="16"/>
+              </w:rPr>
+              <w:t>age_text = input("Age: ")</w:t>
+            </w:r>
+          </w:p>
+          <w:p>
+            <w:pPr>
+              <w:spacing w:after="20"/>
+            </w:pPr>
+            <w:r>
+              <w:rPr>
+                <w:rFonts w:ascii="Consolas" w:hAnsi="Consolas"/>
+                <w:b w:val="0"/>
+                <w:color w:val="000000"/>
+                <w:sz w:val="16"/>
+              </w:rPr>
+              <w:t>age = int(age_text)</w:t>
+            </w:r>
+          </w:p>
+          <w:p>
+            <w:pPr>
+              <w:spacing w:after="20"/>
+            </w:pPr>
+            <w:r>
+              <w:rPr>
+                <w:rFonts w:ascii="Consolas" w:hAnsi="Consolas"/>
+                <w:b w:val="0"/>
+                <w:color w:val="000000"/>
+                <w:sz w:val="16"/>
+              </w:rPr>
+              <w:t>height = float(input("Height: "))</w:t>
             </w:r>
           </w:p>
         </w:tc>
@@ -2294,7 +2631,7 @@
         <w:tc>
           <w:tcPr>
             <w:tcW w:type="dxa" w:w="6538"/>
-            <w:shd w:fill="EAF2FF"/>
+            <w:shd w:fill="F5F5F5"/>
           </w:tcPr>
           <w:p>
             <w:pPr>
@@ -2304,10 +2641,10 @@
               <w:rPr>
                 <w:rFonts w:ascii="Aptos" w:hAnsi="Aptos"/>
                 <w:b/>
-                <w:color w:val="2F6FEB"/>
+                <w:color w:val="000000"/>
                 <w:sz w:val="20"/>
               </w:rPr>
-              <w:t>Final check</w:t>
+              <w:t>String methods</w:t>
             </w:r>
           </w:p>
           <w:p>
@@ -2318,10 +2655,126 @@
               <w:rPr>
                 <w:rFonts w:ascii="Aptos" w:hAnsi="Aptos"/>
                 <w:b w:val="0"/>
-                <w:color w:val="172033"/>
+                <w:color w:val="000000"/>
                 <w:sz w:val="17"/>
               </w:rPr>
-              <w:t>Can you explain what each variable stores, when each loop stops, and what each function returns?</w:t>
+              <w:t>name.strip() removes edge spaces. name.lower() changes case. text.split(",") makes a list.</w:t>
+            </w:r>
+          </w:p>
+        </w:tc>
+      </w:tr>
+    </w:tbl>
+    <w:p>
+      <w:pPr>
+        <w:spacing w:after="60"/>
+      </w:pPr>
+    </w:p>
+    <w:tbl>
+      <w:tblPr>
+        <w:tblW w:type="auto" w:w="0"/>
+        <w:tblLayout w:type="fixed"/>
+        <w:tblLook w:firstColumn="1" w:firstRow="1" w:lastColumn="0" w:lastRow="0" w:noHBand="0" w:noVBand="1" w:val="04A0"/>
+      </w:tblPr>
+      <w:tblGrid>
+        <w:gridCol w:w="6480"/>
+      </w:tblGrid>
+      <w:tr>
+        <w:tc>
+          <w:tcPr>
+            <w:tcW w:type="dxa" w:w="6538"/>
+            <w:shd w:fill="F5F5F5"/>
+          </w:tcPr>
+          <w:p>
+            <w:pPr>
+              <w:spacing w:after="60"/>
+            </w:pPr>
+            <w:r>
+              <w:rPr>
+                <w:rFonts w:ascii="Aptos" w:hAnsi="Aptos"/>
+                <w:b/>
+                <w:color w:val="000000"/>
+                <w:sz w:val="20"/>
+              </w:rPr>
+              <w:t>Formatted strings</w:t>
+            </w:r>
+          </w:p>
+          <w:p>
+            <w:pPr>
+              <w:spacing w:after="20"/>
+            </w:pPr>
+            <w:r>
+              <w:rPr>
+                <w:rFonts w:ascii="Consolas" w:hAnsi="Consolas"/>
+                <w:b w:val="0"/>
+                <w:color w:val="000000"/>
+                <w:sz w:val="16"/>
+              </w:rPr>
+              <w:t>coins = 12</w:t>
+            </w:r>
+          </w:p>
+          <w:p>
+            <w:pPr>
+              <w:spacing w:after="20"/>
+            </w:pPr>
+            <w:r>
+              <w:rPr>
+                <w:rFonts w:ascii="Consolas" w:hAnsi="Consolas"/>
+                <w:b w:val="0"/>
+                <w:color w:val="000000"/>
+                <w:sz w:val="16"/>
+              </w:rPr>
+              <w:t>message = f"You have {coins} coins"</w:t>
+            </w:r>
+          </w:p>
+        </w:tc>
+      </w:tr>
+    </w:tbl>
+    <w:p>
+      <w:pPr>
+        <w:spacing w:after="60"/>
+      </w:pPr>
+    </w:p>
+    <w:tbl>
+      <w:tblPr>
+        <w:tblW w:type="auto" w:w="0"/>
+        <w:tblLayout w:type="fixed"/>
+        <w:tblLook w:firstColumn="1" w:firstRow="1" w:lastColumn="0" w:lastRow="0" w:noHBand="0" w:noVBand="1" w:val="04A0"/>
+      </w:tblPr>
+      <w:tblGrid>
+        <w:gridCol w:w="6480"/>
+      </w:tblGrid>
+      <w:tr>
+        <w:tc>
+          <w:tcPr>
+            <w:tcW w:type="dxa" w:w="6538"/>
+            <w:shd w:fill="F5F5F5"/>
+          </w:tcPr>
+          <w:p>
+            <w:pPr>
+              <w:spacing w:after="60"/>
+            </w:pPr>
+            <w:r>
+              <w:rPr>
+                <w:rFonts w:ascii="Aptos" w:hAnsi="Aptos"/>
+                <w:b/>
+                <w:color w:val="000000"/>
+                <w:sz w:val="20"/>
+              </w:rPr>
+              <w:t>Type check</w:t>
+            </w:r>
+          </w:p>
+          <w:p>
+            <w:pPr>
+              <w:spacing w:after="20"/>
+            </w:pPr>
+            <w:r>
+              <w:rPr>
+                <w:rFonts w:ascii="Aptos" w:hAnsi="Aptos"/>
+                <w:b w:val="0"/>
+                <w:color w:val="000000"/>
+                <w:sz w:val="17"/>
+              </w:rPr>
+              <w:t>type(value) reports a value's type. Common types are str, int, float, bool, list, and NoneType.</w:t>
             </w:r>
           </w:p>
         </w:tc>
@@ -2340,10 +2793,2158 @@
         <w:rPr>
           <w:rFonts w:ascii="Aptos" w:hAnsi="Aptos"/>
           <w:b/>
-          <w:color w:val="556070"/>
+          <w:color w:val="444444"/>
           <w:sz w:val="15"/>
         </w:rPr>
-        <w:t>PYTHON FIELD GUIDE   8</w:t>
+        <w:t>PYTHON FIELD GUIDE   9</w:t>
+      </w:r>
+    </w:p>
+    <w:p>
+      <w:r>
+        <w:br w:type="page"/>
+      </w:r>
+    </w:p>
+    <w:p>
+      <w:pPr>
+        <w:pStyle w:val="Title"/>
+        <w:spacing w:after="40"/>
+        <w:jc w:val="left"/>
+      </w:pPr>
+      <w:r>
+        <w:rPr>
+          <w:rFonts w:ascii="Aptos" w:hAnsi="Aptos"/>
+          <w:b/>
+          <w:color w:val="000000"/>
+          <w:sz w:val="40"/>
+        </w:rPr>
+        <w:t>Future dictionaries and sets</w:t>
+      </w:r>
+    </w:p>
+    <w:p>
+      <w:pPr>
+        <w:spacing w:after="180"/>
+      </w:pPr>
+      <w:r>
+        <w:rPr>
+          <w:rFonts w:ascii="Aptos" w:hAnsi="Aptos"/>
+          <w:b w:val="0"/>
+          <w:color w:val="444444"/>
+          <w:sz w:val="20"/>
+        </w:rPr>
+        <w:t>Store labeled data and unique values</w:t>
+      </w:r>
+    </w:p>
+    <w:tbl>
+      <w:tblPr>
+        <w:tblW w:type="auto" w:w="0"/>
+        <w:tblLayout w:type="fixed"/>
+        <w:tblLook w:firstColumn="1" w:firstRow="1" w:lastColumn="0" w:lastRow="0" w:noHBand="0" w:noVBand="1" w:val="04A0"/>
+      </w:tblPr>
+      <w:tblGrid>
+        <w:gridCol w:w="6480"/>
+      </w:tblGrid>
+      <w:tr>
+        <w:tc>
+          <w:tcPr>
+            <w:tcW w:type="dxa" w:w="6538"/>
+            <w:shd w:fill="F5F5F5"/>
+          </w:tcPr>
+          <w:p>
+            <w:pPr>
+              <w:spacing w:after="60"/>
+            </w:pPr>
+            <w:r>
+              <w:rPr>
+                <w:rFonts w:ascii="Aptos" w:hAnsi="Aptos"/>
+                <w:b/>
+                <w:color w:val="000000"/>
+                <w:sz w:val="20"/>
+              </w:rPr>
+              <w:t>Dictionary</w:t>
+            </w:r>
+          </w:p>
+          <w:p>
+            <w:pPr>
+              <w:spacing w:after="20"/>
+            </w:pPr>
+            <w:r>
+              <w:rPr>
+                <w:rFonts w:ascii="Consolas" w:hAnsi="Consolas"/>
+                <w:b w:val="0"/>
+                <w:color w:val="000000"/>
+                <w:sz w:val="16"/>
+              </w:rPr>
+              <w:t>player = {"name": "Luigi", "lives": 3}</w:t>
+            </w:r>
+          </w:p>
+          <w:p>
+            <w:pPr>
+              <w:spacing w:after="20"/>
+            </w:pPr>
+            <w:r>
+              <w:rPr>
+                <w:rFonts w:ascii="Consolas" w:hAnsi="Consolas"/>
+                <w:b w:val="0"/>
+                <w:color w:val="000000"/>
+                <w:sz w:val="16"/>
+              </w:rPr>
+              <w:t>print(player["name"])</w:t>
+            </w:r>
+          </w:p>
+        </w:tc>
+      </w:tr>
+    </w:tbl>
+    <w:p>
+      <w:pPr>
+        <w:spacing w:after="60"/>
+      </w:pPr>
+    </w:p>
+    <w:tbl>
+      <w:tblPr>
+        <w:tblW w:type="auto" w:w="0"/>
+        <w:tblLayout w:type="fixed"/>
+        <w:tblLook w:firstColumn="1" w:firstRow="1" w:lastColumn="0" w:lastRow="0" w:noHBand="0" w:noVBand="1" w:val="04A0"/>
+      </w:tblPr>
+      <w:tblGrid>
+        <w:gridCol w:w="6480"/>
+      </w:tblGrid>
+      <w:tr>
+        <w:tc>
+          <w:tcPr>
+            <w:tcW w:type="dxa" w:w="6538"/>
+            <w:shd w:fill="F5F5F5"/>
+          </w:tcPr>
+          <w:p>
+            <w:pPr>
+              <w:spacing w:after="60"/>
+            </w:pPr>
+            <w:r>
+              <w:rPr>
+                <w:rFonts w:ascii="Aptos" w:hAnsi="Aptos"/>
+                <w:b/>
+                <w:color w:val="000000"/>
+                <w:sz w:val="20"/>
+              </w:rPr>
+              <w:t>Safe lookup</w:t>
+            </w:r>
+          </w:p>
+          <w:p>
+            <w:pPr>
+              <w:spacing w:after="20"/>
+            </w:pPr>
+            <w:r>
+              <w:rPr>
+                <w:rFonts w:ascii="Consolas" w:hAnsi="Consolas"/>
+                <w:b w:val="0"/>
+                <w:color w:val="000000"/>
+                <w:sz w:val="16"/>
+              </w:rPr>
+              <w:t>player.get("power", "small") returns a default if the key is missing.</w:t>
+            </w:r>
+          </w:p>
+        </w:tc>
+      </w:tr>
+    </w:tbl>
+    <w:p>
+      <w:pPr>
+        <w:spacing w:after="60"/>
+      </w:pPr>
+    </w:p>
+    <w:tbl>
+      <w:tblPr>
+        <w:tblW w:type="auto" w:w="0"/>
+        <w:tblLayout w:type="fixed"/>
+        <w:tblLook w:firstColumn="1" w:firstRow="1" w:lastColumn="0" w:lastRow="0" w:noHBand="0" w:noVBand="1" w:val="04A0"/>
+      </w:tblPr>
+      <w:tblGrid>
+        <w:gridCol w:w="6480"/>
+      </w:tblGrid>
+      <w:tr>
+        <w:tc>
+          <w:tcPr>
+            <w:tcW w:type="dxa" w:w="6538"/>
+            <w:shd w:fill="F5F5F5"/>
+          </w:tcPr>
+          <w:p>
+            <w:pPr>
+              <w:spacing w:after="60"/>
+            </w:pPr>
+            <w:r>
+              <w:rPr>
+                <w:rFonts w:ascii="Aptos" w:hAnsi="Aptos"/>
+                <w:b/>
+                <w:color w:val="000000"/>
+                <w:sz w:val="20"/>
+              </w:rPr>
+              <w:t>Loop through pairs</w:t>
+            </w:r>
+          </w:p>
+          <w:p>
+            <w:pPr>
+              <w:spacing w:after="20"/>
+            </w:pPr>
+            <w:r>
+              <w:rPr>
+                <w:rFonts w:ascii="Consolas" w:hAnsi="Consolas"/>
+                <w:b w:val="0"/>
+                <w:color w:val="000000"/>
+                <w:sz w:val="16"/>
+              </w:rPr>
+              <w:t>for key, value in player.items():</w:t>
+            </w:r>
+          </w:p>
+          <w:p>
+            <w:pPr>
+              <w:spacing w:after="20"/>
+            </w:pPr>
+            <w:r>
+              <w:rPr>
+                <w:rFonts w:ascii="Consolas" w:hAnsi="Consolas"/>
+                <w:b w:val="0"/>
+                <w:color w:val="000000"/>
+                <w:sz w:val="16"/>
+              </w:rPr>
+              <w:t xml:space="preserve">    print(key, value)</w:t>
+            </w:r>
+          </w:p>
+        </w:tc>
+      </w:tr>
+    </w:tbl>
+    <w:p>
+      <w:pPr>
+        <w:spacing w:after="60"/>
+      </w:pPr>
+    </w:p>
+    <w:tbl>
+      <w:tblPr>
+        <w:tblW w:type="auto" w:w="0"/>
+        <w:tblLayout w:type="fixed"/>
+        <w:tblLook w:firstColumn="1" w:firstRow="1" w:lastColumn="0" w:lastRow="0" w:noHBand="0" w:noVBand="1" w:val="04A0"/>
+      </w:tblPr>
+      <w:tblGrid>
+        <w:gridCol w:w="6480"/>
+      </w:tblGrid>
+      <w:tr>
+        <w:tc>
+          <w:tcPr>
+            <w:tcW w:type="dxa" w:w="6538"/>
+            <w:shd w:fill="F5F5F5"/>
+          </w:tcPr>
+          <w:p>
+            <w:pPr>
+              <w:spacing w:after="60"/>
+            </w:pPr>
+            <w:r>
+              <w:rPr>
+                <w:rFonts w:ascii="Aptos" w:hAnsi="Aptos"/>
+                <w:b/>
+                <w:color w:val="000000"/>
+                <w:sz w:val="20"/>
+              </w:rPr>
+              <w:t>Set</w:t>
+            </w:r>
+          </w:p>
+          <w:p>
+            <w:pPr>
+              <w:spacing w:after="20"/>
+            </w:pPr>
+            <w:r>
+              <w:rPr>
+                <w:rFonts w:ascii="Consolas" w:hAnsi="Consolas"/>
+                <w:b w:val="0"/>
+                <w:color w:val="000000"/>
+                <w:sz w:val="16"/>
+              </w:rPr>
+              <w:t>unique_items = set(items) removes duplicates. Sets are useful for membership checks.</w:t>
+            </w:r>
+          </w:p>
+        </w:tc>
+      </w:tr>
+    </w:tbl>
+    <w:p>
+      <w:pPr>
+        <w:spacing w:after="60"/>
+      </w:pPr>
+    </w:p>
+    <w:p>
+      <w:pPr>
+        <w:jc w:val="right"/>
+      </w:pPr>
+      <w:r>
+        <w:rPr>
+          <w:rFonts w:ascii="Aptos" w:hAnsi="Aptos"/>
+          <w:b/>
+          <w:color w:val="444444"/>
+          <w:sz w:val="15"/>
+        </w:rPr>
+        <w:t>PYTHON FIELD GUIDE   10</w:t>
+      </w:r>
+    </w:p>
+    <w:p>
+      <w:r>
+        <w:br w:type="page"/>
+      </w:r>
+    </w:p>
+    <w:p>
+      <w:pPr>
+        <w:pStyle w:val="Title"/>
+        <w:spacing w:after="40"/>
+        <w:jc w:val="left"/>
+      </w:pPr>
+      <w:r>
+        <w:rPr>
+          <w:rFonts w:ascii="Aptos" w:hAnsi="Aptos"/>
+          <w:b/>
+          <w:color w:val="000000"/>
+          <w:sz w:val="40"/>
+        </w:rPr>
+        <w:t>Future function patterns</w:t>
+      </w:r>
+    </w:p>
+    <w:p>
+      <w:pPr>
+        <w:spacing w:after="180"/>
+      </w:pPr>
+      <w:r>
+        <w:rPr>
+          <w:rFonts w:ascii="Aptos" w:hAnsi="Aptos"/>
+          <w:b w:val="0"/>
+          <w:color w:val="444444"/>
+          <w:sz w:val="20"/>
+        </w:rPr>
+        <w:t>Make code easier to reuse and test</w:t>
+      </w:r>
+    </w:p>
+    <w:tbl>
+      <w:tblPr>
+        <w:tblW w:type="auto" w:w="0"/>
+        <w:tblLayout w:type="fixed"/>
+        <w:tblLook w:firstColumn="1" w:firstRow="1" w:lastColumn="0" w:lastRow="0" w:noHBand="0" w:noVBand="1" w:val="04A0"/>
+      </w:tblPr>
+      <w:tblGrid>
+        <w:gridCol w:w="6480"/>
+      </w:tblGrid>
+      <w:tr>
+        <w:tc>
+          <w:tcPr>
+            <w:tcW w:type="dxa" w:w="6538"/>
+            <w:shd w:fill="F5F5F5"/>
+          </w:tcPr>
+          <w:p>
+            <w:pPr>
+              <w:spacing w:after="60"/>
+            </w:pPr>
+            <w:r>
+              <w:rPr>
+                <w:rFonts w:ascii="Aptos" w:hAnsi="Aptos"/>
+                <w:b/>
+                <w:color w:val="000000"/>
+                <w:sz w:val="20"/>
+              </w:rPr>
+              <w:t>Default argument</w:t>
+            </w:r>
+          </w:p>
+          <w:p>
+            <w:pPr>
+              <w:spacing w:after="20"/>
+            </w:pPr>
+            <w:r>
+              <w:rPr>
+                <w:rFonts w:ascii="Consolas" w:hAnsi="Consolas"/>
+                <w:b w:val="0"/>
+                <w:color w:val="000000"/>
+                <w:sz w:val="16"/>
+              </w:rPr>
+              <w:t>def greet(name, greeting="Hello"):</w:t>
+            </w:r>
+          </w:p>
+          <w:p>
+            <w:pPr>
+              <w:spacing w:after="20"/>
+            </w:pPr>
+            <w:r>
+              <w:rPr>
+                <w:rFonts w:ascii="Consolas" w:hAnsi="Consolas"/>
+                <w:b w:val="0"/>
+                <w:color w:val="000000"/>
+                <w:sz w:val="16"/>
+              </w:rPr>
+              <w:t xml:space="preserve">    return f"{greeting}, {name}"</w:t>
+            </w:r>
+          </w:p>
+        </w:tc>
+      </w:tr>
+    </w:tbl>
+    <w:p>
+      <w:pPr>
+        <w:spacing w:after="60"/>
+      </w:pPr>
+    </w:p>
+    <w:tbl>
+      <w:tblPr>
+        <w:tblW w:type="auto" w:w="0"/>
+        <w:tblLayout w:type="fixed"/>
+        <w:tblLook w:firstColumn="1" w:firstRow="1" w:lastColumn="0" w:lastRow="0" w:noHBand="0" w:noVBand="1" w:val="04A0"/>
+      </w:tblPr>
+      <w:tblGrid>
+        <w:gridCol w:w="6480"/>
+      </w:tblGrid>
+      <w:tr>
+        <w:tc>
+          <w:tcPr>
+            <w:tcW w:type="dxa" w:w="6538"/>
+            <w:shd w:fill="F5F5F5"/>
+          </w:tcPr>
+          <w:p>
+            <w:pPr>
+              <w:spacing w:after="60"/>
+            </w:pPr>
+            <w:r>
+              <w:rPr>
+                <w:rFonts w:ascii="Aptos" w:hAnsi="Aptos"/>
+                <w:b/>
+                <w:color w:val="000000"/>
+                <w:sz w:val="20"/>
+              </w:rPr>
+              <w:t>Small focused functions</w:t>
+            </w:r>
+          </w:p>
+          <w:p>
+            <w:pPr>
+              <w:spacing w:after="20"/>
+            </w:pPr>
+            <w:r>
+              <w:rPr>
+                <w:rFonts w:ascii="Aptos" w:hAnsi="Aptos"/>
+                <w:b w:val="0"/>
+                <w:color w:val="000000"/>
+                <w:sz w:val="17"/>
+              </w:rPr>
+              <w:t>A function should usually do one clear job. A good name describes that job.</w:t>
+            </w:r>
+          </w:p>
+        </w:tc>
+      </w:tr>
+    </w:tbl>
+    <w:p>
+      <w:pPr>
+        <w:spacing w:after="60"/>
+      </w:pPr>
+    </w:p>
+    <w:tbl>
+      <w:tblPr>
+        <w:tblW w:type="auto" w:w="0"/>
+        <w:tblLayout w:type="fixed"/>
+        <w:tblLook w:firstColumn="1" w:firstRow="1" w:lastColumn="0" w:lastRow="0" w:noHBand="0" w:noVBand="1" w:val="04A0"/>
+      </w:tblPr>
+      <w:tblGrid>
+        <w:gridCol w:w="6480"/>
+      </w:tblGrid>
+      <w:tr>
+        <w:tc>
+          <w:tcPr>
+            <w:tcW w:type="dxa" w:w="6538"/>
+            <w:shd w:fill="F5F5F5"/>
+          </w:tcPr>
+          <w:p>
+            <w:pPr>
+              <w:spacing w:after="60"/>
+            </w:pPr>
+            <w:r>
+              <w:rPr>
+                <w:rFonts w:ascii="Aptos" w:hAnsi="Aptos"/>
+                <w:b/>
+                <w:color w:val="000000"/>
+                <w:sz w:val="20"/>
+              </w:rPr>
+              <w:t>Local variables</w:t>
+            </w:r>
+          </w:p>
+          <w:p>
+            <w:pPr>
+              <w:spacing w:after="20"/>
+            </w:pPr>
+            <w:r>
+              <w:rPr>
+                <w:rFonts w:ascii="Aptos" w:hAnsi="Aptos"/>
+                <w:b w:val="0"/>
+                <w:color w:val="000000"/>
+                <w:sz w:val="17"/>
+              </w:rPr>
+              <w:t>A variable created inside a function is normally local to that function.</w:t>
+            </w:r>
+          </w:p>
+        </w:tc>
+      </w:tr>
+    </w:tbl>
+    <w:p>
+      <w:pPr>
+        <w:spacing w:after="60"/>
+      </w:pPr>
+    </w:p>
+    <w:tbl>
+      <w:tblPr>
+        <w:tblW w:type="auto" w:w="0"/>
+        <w:tblLayout w:type="fixed"/>
+        <w:tblLook w:firstColumn="1" w:firstRow="1" w:lastColumn="0" w:lastRow="0" w:noHBand="0" w:noVBand="1" w:val="04A0"/>
+      </w:tblPr>
+      <w:tblGrid>
+        <w:gridCol w:w="6480"/>
+      </w:tblGrid>
+      <w:tr>
+        <w:tc>
+          <w:tcPr>
+            <w:tcW w:type="dxa" w:w="6538"/>
+            <w:shd w:fill="F5F5F5"/>
+          </w:tcPr>
+          <w:p>
+            <w:pPr>
+              <w:spacing w:after="60"/>
+            </w:pPr>
+            <w:r>
+              <w:rPr>
+                <w:rFonts w:ascii="Aptos" w:hAnsi="Aptos"/>
+                <w:b/>
+                <w:color w:val="000000"/>
+                <w:sz w:val="20"/>
+              </w:rPr>
+              <w:t>Documentation</w:t>
+            </w:r>
+          </w:p>
+          <w:p>
+            <w:pPr>
+              <w:spacing w:after="20"/>
+            </w:pPr>
+            <w:r>
+              <w:rPr>
+                <w:rFonts w:ascii="Consolas" w:hAnsi="Consolas"/>
+                <w:b w:val="0"/>
+                <w:color w:val="000000"/>
+                <w:sz w:val="16"/>
+              </w:rPr>
+              <w:t>Place a short docstring under def to explain the inputs, behavior, and returned value.</w:t>
+            </w:r>
+          </w:p>
+        </w:tc>
+      </w:tr>
+    </w:tbl>
+    <w:p>
+      <w:pPr>
+        <w:spacing w:after="60"/>
+      </w:pPr>
+    </w:p>
+    <w:p>
+      <w:pPr>
+        <w:jc w:val="right"/>
+      </w:pPr>
+      <w:r>
+        <w:rPr>
+          <w:rFonts w:ascii="Aptos" w:hAnsi="Aptos"/>
+          <w:b/>
+          <w:color w:val="444444"/>
+          <w:sz w:val="15"/>
+        </w:rPr>
+        <w:t>PYTHON FIELD GUIDE   11</w:t>
+      </w:r>
+    </w:p>
+    <w:p>
+      <w:r>
+        <w:br w:type="page"/>
+      </w:r>
+    </w:p>
+    <w:p>
+      <w:pPr>
+        <w:pStyle w:val="Title"/>
+        <w:spacing w:after="40"/>
+        <w:jc w:val="left"/>
+      </w:pPr>
+      <w:r>
+        <w:rPr>
+          <w:rFonts w:ascii="Aptos" w:hAnsi="Aptos"/>
+          <w:b/>
+          <w:color w:val="000000"/>
+          <w:sz w:val="40"/>
+        </w:rPr>
+        <w:t>Future errors and exceptions</w:t>
+      </w:r>
+    </w:p>
+    <w:p>
+      <w:pPr>
+        <w:spacing w:after="180"/>
+      </w:pPr>
+      <w:r>
+        <w:rPr>
+          <w:rFonts w:ascii="Aptos" w:hAnsi="Aptos"/>
+          <w:b w:val="0"/>
+          <w:color w:val="444444"/>
+          <w:sz w:val="20"/>
+        </w:rPr>
+        <w:t>Handle expected problems</w:t>
+      </w:r>
+    </w:p>
+    <w:tbl>
+      <w:tblPr>
+        <w:tblW w:type="auto" w:w="0"/>
+        <w:tblLayout w:type="fixed"/>
+        <w:tblLook w:firstColumn="1" w:firstRow="1" w:lastColumn="0" w:lastRow="0" w:noHBand="0" w:noVBand="1" w:val="04A0"/>
+      </w:tblPr>
+      <w:tblGrid>
+        <w:gridCol w:w="6480"/>
+      </w:tblGrid>
+      <w:tr>
+        <w:tc>
+          <w:tcPr>
+            <w:tcW w:type="dxa" w:w="6538"/>
+            <w:shd w:fill="F5F5F5"/>
+          </w:tcPr>
+          <w:p>
+            <w:pPr>
+              <w:spacing w:after="60"/>
+            </w:pPr>
+            <w:r>
+              <w:rPr>
+                <w:rFonts w:ascii="Aptos" w:hAnsi="Aptos"/>
+                <w:b/>
+                <w:color w:val="000000"/>
+                <w:sz w:val="20"/>
+              </w:rPr>
+              <w:t>Read the traceback</w:t>
+            </w:r>
+          </w:p>
+          <w:p>
+            <w:pPr>
+              <w:spacing w:after="20"/>
+            </w:pPr>
+            <w:r>
+              <w:rPr>
+                <w:rFonts w:ascii="Consolas" w:hAnsi="Consolas"/>
+                <w:b w:val="0"/>
+                <w:color w:val="000000"/>
+                <w:sz w:val="16"/>
+              </w:rPr>
+              <w:t>Start at the final line for the error type and message, then check the named line in your code.</w:t>
+            </w:r>
+          </w:p>
+        </w:tc>
+      </w:tr>
+    </w:tbl>
+    <w:p>
+      <w:pPr>
+        <w:spacing w:after="60"/>
+      </w:pPr>
+    </w:p>
+    <w:tbl>
+      <w:tblPr>
+        <w:tblW w:type="auto" w:w="0"/>
+        <w:tblLayout w:type="fixed"/>
+        <w:tblLook w:firstColumn="1" w:firstRow="1" w:lastColumn="0" w:lastRow="0" w:noHBand="0" w:noVBand="1" w:val="04A0"/>
+      </w:tblPr>
+      <w:tblGrid>
+        <w:gridCol w:w="6480"/>
+      </w:tblGrid>
+      <w:tr>
+        <w:tc>
+          <w:tcPr>
+            <w:tcW w:type="dxa" w:w="6538"/>
+            <w:shd w:fill="F5F5F5"/>
+          </w:tcPr>
+          <w:p>
+            <w:pPr>
+              <w:spacing w:after="60"/>
+            </w:pPr>
+            <w:r>
+              <w:rPr>
+                <w:rFonts w:ascii="Aptos" w:hAnsi="Aptos"/>
+                <w:b/>
+                <w:color w:val="000000"/>
+                <w:sz w:val="20"/>
+              </w:rPr>
+              <w:t>Common errors</w:t>
+            </w:r>
+          </w:p>
+          <w:p>
+            <w:pPr>
+              <w:spacing w:after="20"/>
+            </w:pPr>
+            <w:r>
+              <w:rPr>
+                <w:rFonts w:ascii="Aptos" w:hAnsi="Aptos"/>
+                <w:b w:val="0"/>
+                <w:color w:val="000000"/>
+                <w:sz w:val="17"/>
+              </w:rPr>
+              <w:t>SyntaxError: code shape is invalid. NameError: name is unknown. TypeError: operation does not fit the value type.</w:t>
+            </w:r>
+          </w:p>
+        </w:tc>
+      </w:tr>
+    </w:tbl>
+    <w:p>
+      <w:pPr>
+        <w:spacing w:after="60"/>
+      </w:pPr>
+    </w:p>
+    <w:tbl>
+      <w:tblPr>
+        <w:tblW w:type="auto" w:w="0"/>
+        <w:tblLayout w:type="fixed"/>
+        <w:tblLook w:firstColumn="1" w:firstRow="1" w:lastColumn="0" w:lastRow="0" w:noHBand="0" w:noVBand="1" w:val="04A0"/>
+      </w:tblPr>
+      <w:tblGrid>
+        <w:gridCol w:w="6480"/>
+      </w:tblGrid>
+      <w:tr>
+        <w:tc>
+          <w:tcPr>
+            <w:tcW w:type="dxa" w:w="6538"/>
+            <w:shd w:fill="F5F5F5"/>
+          </w:tcPr>
+          <w:p>
+            <w:pPr>
+              <w:spacing w:after="60"/>
+            </w:pPr>
+            <w:r>
+              <w:rPr>
+                <w:rFonts w:ascii="Aptos" w:hAnsi="Aptos"/>
+                <w:b/>
+                <w:color w:val="000000"/>
+                <w:sz w:val="20"/>
+              </w:rPr>
+              <w:t>Expected input problem</w:t>
+            </w:r>
+          </w:p>
+          <w:p>
+            <w:pPr>
+              <w:spacing w:after="20"/>
+            </w:pPr>
+            <w:r>
+              <w:rPr>
+                <w:rFonts w:ascii="Consolas" w:hAnsi="Consolas"/>
+                <w:b w:val="0"/>
+                <w:color w:val="000000"/>
+                <w:sz w:val="16"/>
+              </w:rPr>
+              <w:t>try:</w:t>
+            </w:r>
+          </w:p>
+          <w:p>
+            <w:pPr>
+              <w:spacing w:after="20"/>
+            </w:pPr>
+            <w:r>
+              <w:rPr>
+                <w:rFonts w:ascii="Consolas" w:hAnsi="Consolas"/>
+                <w:b w:val="0"/>
+                <w:color w:val="000000"/>
+                <w:sz w:val="16"/>
+              </w:rPr>
+              <w:t xml:space="preserve">    age = int(input("Age: "))</w:t>
+            </w:r>
+          </w:p>
+          <w:p>
+            <w:pPr>
+              <w:spacing w:after="20"/>
+            </w:pPr>
+            <w:r>
+              <w:rPr>
+                <w:rFonts w:ascii="Consolas" w:hAnsi="Consolas"/>
+                <w:b w:val="0"/>
+                <w:color w:val="000000"/>
+                <w:sz w:val="16"/>
+              </w:rPr>
+              <w:t>except ValueError:</w:t>
+            </w:r>
+          </w:p>
+          <w:p>
+            <w:pPr>
+              <w:spacing w:after="20"/>
+            </w:pPr>
+            <w:r>
+              <w:rPr>
+                <w:rFonts w:ascii="Consolas" w:hAnsi="Consolas"/>
+                <w:b w:val="0"/>
+                <w:color w:val="000000"/>
+                <w:sz w:val="16"/>
+              </w:rPr>
+              <w:t xml:space="preserve">    print("Enter a whole number")</w:t>
+            </w:r>
+          </w:p>
+        </w:tc>
+      </w:tr>
+    </w:tbl>
+    <w:p>
+      <w:pPr>
+        <w:spacing w:after="60"/>
+      </w:pPr>
+    </w:p>
+    <w:tbl>
+      <w:tblPr>
+        <w:tblW w:type="auto" w:w="0"/>
+        <w:tblLayout w:type="fixed"/>
+        <w:tblLook w:firstColumn="1" w:firstRow="1" w:lastColumn="0" w:lastRow="0" w:noHBand="0" w:noVBand="1" w:val="04A0"/>
+      </w:tblPr>
+      <w:tblGrid>
+        <w:gridCol w:w="6480"/>
+      </w:tblGrid>
+      <w:tr>
+        <w:tc>
+          <w:tcPr>
+            <w:tcW w:type="dxa" w:w="6538"/>
+            <w:shd w:fill="F5F5F5"/>
+          </w:tcPr>
+          <w:p>
+            <w:pPr>
+              <w:spacing w:after="60"/>
+            </w:pPr>
+            <w:r>
+              <w:rPr>
+                <w:rFonts w:ascii="Aptos" w:hAnsi="Aptos"/>
+                <w:b/>
+                <w:color w:val="000000"/>
+                <w:sz w:val="20"/>
+              </w:rPr>
+              <w:t>Do not hide every error</w:t>
+            </w:r>
+          </w:p>
+          <w:p>
+            <w:pPr>
+              <w:spacing w:after="20"/>
+            </w:pPr>
+            <w:r>
+              <w:rPr>
+                <w:rFonts w:ascii="Consolas" w:hAnsi="Consolas"/>
+                <w:b w:val="0"/>
+                <w:color w:val="000000"/>
+                <w:sz w:val="16"/>
+              </w:rPr>
+              <w:t>Catch errors you expect and can handle. Unexpected errors should stay visible while debugging.</w:t>
+            </w:r>
+          </w:p>
+        </w:tc>
+      </w:tr>
+    </w:tbl>
+    <w:p>
+      <w:pPr>
+        <w:spacing w:after="60"/>
+      </w:pPr>
+    </w:p>
+    <w:p>
+      <w:pPr>
+        <w:jc w:val="right"/>
+      </w:pPr>
+      <w:r>
+        <w:rPr>
+          <w:rFonts w:ascii="Aptos" w:hAnsi="Aptos"/>
+          <w:b/>
+          <w:color w:val="444444"/>
+          <w:sz w:val="15"/>
+        </w:rPr>
+        <w:t>PYTHON FIELD GUIDE   12</w:t>
+      </w:r>
+    </w:p>
+    <w:p>
+      <w:r>
+        <w:br w:type="page"/>
+      </w:r>
+    </w:p>
+    <w:p>
+      <w:pPr>
+        <w:pStyle w:val="Title"/>
+        <w:spacing w:after="40"/>
+        <w:jc w:val="left"/>
+      </w:pPr>
+      <w:r>
+        <w:rPr>
+          <w:rFonts w:ascii="Aptos" w:hAnsi="Aptos"/>
+          <w:b/>
+          <w:color w:val="000000"/>
+          <w:sz w:val="40"/>
+        </w:rPr>
+        <w:t>Future files and modules</w:t>
+      </w:r>
+    </w:p>
+    <w:p>
+      <w:pPr>
+        <w:spacing w:after="180"/>
+      </w:pPr>
+      <w:r>
+        <w:rPr>
+          <w:rFonts w:ascii="Aptos" w:hAnsi="Aptos"/>
+          <w:b w:val="0"/>
+          <w:color w:val="444444"/>
+          <w:sz w:val="20"/>
+        </w:rPr>
+        <w:t>Save data and use organized code</w:t>
+      </w:r>
+    </w:p>
+    <w:tbl>
+      <w:tblPr>
+        <w:tblW w:type="auto" w:w="0"/>
+        <w:tblLayout w:type="fixed"/>
+        <w:tblLook w:firstColumn="1" w:firstRow="1" w:lastColumn="0" w:lastRow="0" w:noHBand="0" w:noVBand="1" w:val="04A0"/>
+      </w:tblPr>
+      <w:tblGrid>
+        <w:gridCol w:w="6480"/>
+      </w:tblGrid>
+      <w:tr>
+        <w:tc>
+          <w:tcPr>
+            <w:tcW w:type="dxa" w:w="6538"/>
+            <w:shd w:fill="F5F5F5"/>
+          </w:tcPr>
+          <w:p>
+            <w:pPr>
+              <w:spacing w:after="60"/>
+            </w:pPr>
+            <w:r>
+              <w:rPr>
+                <w:rFonts w:ascii="Aptos" w:hAnsi="Aptos"/>
+                <w:b/>
+                <w:color w:val="000000"/>
+                <w:sz w:val="20"/>
+              </w:rPr>
+              <w:t>Read a text file</w:t>
+            </w:r>
+          </w:p>
+          <w:p>
+            <w:pPr>
+              <w:spacing w:after="20"/>
+            </w:pPr>
+            <w:r>
+              <w:rPr>
+                <w:rFonts w:ascii="Consolas" w:hAnsi="Consolas"/>
+                <w:b w:val="0"/>
+                <w:color w:val="000000"/>
+                <w:sz w:val="16"/>
+              </w:rPr>
+              <w:t>with open("notes.txt", "r") as file:</w:t>
+            </w:r>
+          </w:p>
+          <w:p>
+            <w:pPr>
+              <w:spacing w:after="20"/>
+            </w:pPr>
+            <w:r>
+              <w:rPr>
+                <w:rFonts w:ascii="Consolas" w:hAnsi="Consolas"/>
+                <w:b w:val="0"/>
+                <w:color w:val="000000"/>
+                <w:sz w:val="16"/>
+              </w:rPr>
+              <w:t xml:space="preserve">    text = file.read()</w:t>
+            </w:r>
+          </w:p>
+        </w:tc>
+      </w:tr>
+    </w:tbl>
+    <w:p>
+      <w:pPr>
+        <w:spacing w:after="60"/>
+      </w:pPr>
+    </w:p>
+    <w:tbl>
+      <w:tblPr>
+        <w:tblW w:type="auto" w:w="0"/>
+        <w:tblLayout w:type="fixed"/>
+        <w:tblLook w:firstColumn="1" w:firstRow="1" w:lastColumn="0" w:lastRow="0" w:noHBand="0" w:noVBand="1" w:val="04A0"/>
+      </w:tblPr>
+      <w:tblGrid>
+        <w:gridCol w:w="6480"/>
+      </w:tblGrid>
+      <w:tr>
+        <w:tc>
+          <w:tcPr>
+            <w:tcW w:type="dxa" w:w="6538"/>
+            <w:shd w:fill="F5F5F5"/>
+          </w:tcPr>
+          <w:p>
+            <w:pPr>
+              <w:spacing w:after="60"/>
+            </w:pPr>
+            <w:r>
+              <w:rPr>
+                <w:rFonts w:ascii="Aptos" w:hAnsi="Aptos"/>
+                <w:b/>
+                <w:color w:val="000000"/>
+                <w:sz w:val="20"/>
+              </w:rPr>
+              <w:t>Write a text file</w:t>
+            </w:r>
+          </w:p>
+          <w:p>
+            <w:pPr>
+              <w:spacing w:after="20"/>
+            </w:pPr>
+            <w:r>
+              <w:rPr>
+                <w:rFonts w:ascii="Aptos" w:hAnsi="Aptos"/>
+                <w:b w:val="0"/>
+                <w:color w:val="000000"/>
+                <w:sz w:val="17"/>
+              </w:rPr>
+              <w:t>with open("score.txt", "w") as file:</w:t>
+            </w:r>
+          </w:p>
+          <w:p>
+            <w:pPr>
+              <w:spacing w:after="20"/>
+            </w:pPr>
+            <w:r>
+              <w:rPr>
+                <w:rFonts w:ascii="Aptos" w:hAnsi="Aptos"/>
+                <w:b w:val="0"/>
+                <w:color w:val="000000"/>
+                <w:sz w:val="17"/>
+              </w:rPr>
+              <w:t xml:space="preserve">    file.write(str(score))</w:t>
+            </w:r>
+          </w:p>
+        </w:tc>
+      </w:tr>
+    </w:tbl>
+    <w:p>
+      <w:pPr>
+        <w:spacing w:after="60"/>
+      </w:pPr>
+    </w:p>
+    <w:tbl>
+      <w:tblPr>
+        <w:tblW w:type="auto" w:w="0"/>
+        <w:tblLayout w:type="fixed"/>
+        <w:tblLook w:firstColumn="1" w:firstRow="1" w:lastColumn="0" w:lastRow="0" w:noHBand="0" w:noVBand="1" w:val="04A0"/>
+      </w:tblPr>
+      <w:tblGrid>
+        <w:gridCol w:w="6480"/>
+      </w:tblGrid>
+      <w:tr>
+        <w:tc>
+          <w:tcPr>
+            <w:tcW w:type="dxa" w:w="6538"/>
+            <w:shd w:fill="F5F5F5"/>
+          </w:tcPr>
+          <w:p>
+            <w:pPr>
+              <w:spacing w:after="60"/>
+            </w:pPr>
+            <w:r>
+              <w:rPr>
+                <w:rFonts w:ascii="Aptos" w:hAnsi="Aptos"/>
+                <w:b/>
+                <w:color w:val="000000"/>
+                <w:sz w:val="20"/>
+              </w:rPr>
+              <w:t>Import a module</w:t>
+            </w:r>
+          </w:p>
+          <w:p>
+            <w:pPr>
+              <w:spacing w:after="20"/>
+            </w:pPr>
+            <w:r>
+              <w:rPr>
+                <w:rFonts w:ascii="Consolas" w:hAnsi="Consolas"/>
+                <w:b w:val="0"/>
+                <w:color w:val="000000"/>
+                <w:sz w:val="16"/>
+              </w:rPr>
+              <w:t>import random</w:t>
+            </w:r>
+          </w:p>
+          <w:p>
+            <w:pPr>
+              <w:spacing w:after="20"/>
+            </w:pPr>
+            <w:r>
+              <w:rPr>
+                <w:rFonts w:ascii="Consolas" w:hAnsi="Consolas"/>
+                <w:b w:val="0"/>
+                <w:color w:val="000000"/>
+                <w:sz w:val="16"/>
+              </w:rPr>
+              <w:t>choice = random.choice(items)</w:t>
+            </w:r>
+          </w:p>
+        </w:tc>
+      </w:tr>
+    </w:tbl>
+    <w:p>
+      <w:pPr>
+        <w:spacing w:after="60"/>
+      </w:pPr>
+    </w:p>
+    <w:tbl>
+      <w:tblPr>
+        <w:tblW w:type="auto" w:w="0"/>
+        <w:tblLayout w:type="fixed"/>
+        <w:tblLook w:firstColumn="1" w:firstRow="1" w:lastColumn="0" w:lastRow="0" w:noHBand="0" w:noVBand="1" w:val="04A0"/>
+      </w:tblPr>
+      <w:tblGrid>
+        <w:gridCol w:w="6480"/>
+      </w:tblGrid>
+      <w:tr>
+        <w:tc>
+          <w:tcPr>
+            <w:tcW w:type="dxa" w:w="6538"/>
+            <w:shd w:fill="F5F5F5"/>
+          </w:tcPr>
+          <w:p>
+            <w:pPr>
+              <w:spacing w:after="60"/>
+            </w:pPr>
+            <w:r>
+              <w:rPr>
+                <w:rFonts w:ascii="Aptos" w:hAnsi="Aptos"/>
+                <w:b/>
+                <w:color w:val="000000"/>
+                <w:sz w:val="20"/>
+              </w:rPr>
+              <w:t>Main guard</w:t>
+            </w:r>
+          </w:p>
+          <w:p>
+            <w:pPr>
+              <w:spacing w:after="20"/>
+            </w:pPr>
+            <w:r>
+              <w:rPr>
+                <w:rFonts w:ascii="Consolas" w:hAnsi="Consolas"/>
+                <w:b w:val="0"/>
+                <w:color w:val="000000"/>
+                <w:sz w:val="16"/>
+              </w:rPr>
+              <w:t>if __name__ == "__main__":</w:t>
+            </w:r>
+          </w:p>
+          <w:p>
+            <w:pPr>
+              <w:spacing w:after="20"/>
+            </w:pPr>
+            <w:r>
+              <w:rPr>
+                <w:rFonts w:ascii="Consolas" w:hAnsi="Consolas"/>
+                <w:b w:val="0"/>
+                <w:color w:val="000000"/>
+                <w:sz w:val="16"/>
+              </w:rPr>
+              <w:t xml:space="preserve">    main()</w:t>
+            </w:r>
+          </w:p>
+        </w:tc>
+      </w:tr>
+    </w:tbl>
+    <w:p>
+      <w:pPr>
+        <w:spacing w:after="60"/>
+      </w:pPr>
+    </w:p>
+    <w:tbl>
+      <w:tblPr>
+        <w:tblW w:type="auto" w:w="0"/>
+        <w:tblLayout w:type="fixed"/>
+        <w:tblLook w:firstColumn="1" w:firstRow="1" w:lastColumn="0" w:lastRow="0" w:noHBand="0" w:noVBand="1" w:val="04A0"/>
+      </w:tblPr>
+      <w:tblGrid>
+        <w:gridCol w:w="6480"/>
+      </w:tblGrid>
+      <w:tr>
+        <w:tc>
+          <w:tcPr>
+            <w:tcW w:type="dxa" w:w="6538"/>
+            <w:shd w:fill="F5F5F5"/>
+          </w:tcPr>
+          <w:p>
+            <w:pPr>
+              <w:spacing w:after="60"/>
+            </w:pPr>
+            <w:r>
+              <w:rPr>
+                <w:rFonts w:ascii="Aptos" w:hAnsi="Aptos"/>
+                <w:b/>
+                <w:color w:val="000000"/>
+                <w:sz w:val="20"/>
+              </w:rPr>
+              <w:t>File habit</w:t>
+            </w:r>
+          </w:p>
+          <w:p>
+            <w:pPr>
+              <w:spacing w:after="20"/>
+            </w:pPr>
+            <w:r>
+              <w:rPr>
+                <w:rFonts w:ascii="Consolas" w:hAnsi="Consolas"/>
+                <w:b w:val="0"/>
+                <w:color w:val="000000"/>
+                <w:sz w:val="16"/>
+              </w:rPr>
+              <w:t>Use with so Python closes the file even if something goes wrong.</w:t>
+            </w:r>
+          </w:p>
+        </w:tc>
+      </w:tr>
+    </w:tbl>
+    <w:p>
+      <w:pPr>
+        <w:spacing w:after="60"/>
+      </w:pPr>
+    </w:p>
+    <w:p>
+      <w:pPr>
+        <w:jc w:val="right"/>
+      </w:pPr>
+      <w:r>
+        <w:rPr>
+          <w:rFonts w:ascii="Aptos" w:hAnsi="Aptos"/>
+          <w:b/>
+          <w:color w:val="444444"/>
+          <w:sz w:val="15"/>
+        </w:rPr>
+        <w:t>PYTHON FIELD GUIDE   13</w:t>
+      </w:r>
+    </w:p>
+    <w:p>
+      <w:r>
+        <w:br w:type="page"/>
+      </w:r>
+    </w:p>
+    <w:p>
+      <w:pPr>
+        <w:pStyle w:val="Title"/>
+        <w:spacing w:after="40"/>
+        <w:jc w:val="left"/>
+      </w:pPr>
+      <w:r>
+        <w:rPr>
+          <w:rFonts w:ascii="Aptos" w:hAnsi="Aptos"/>
+          <w:b/>
+          <w:color w:val="000000"/>
+          <w:sz w:val="40"/>
+        </w:rPr>
+        <w:t>Future classes and objects</w:t>
+      </w:r>
+    </w:p>
+    <w:p>
+      <w:pPr>
+        <w:spacing w:after="180"/>
+      </w:pPr>
+      <w:r>
+        <w:rPr>
+          <w:rFonts w:ascii="Aptos" w:hAnsi="Aptos"/>
+          <w:b w:val="0"/>
+          <w:color w:val="444444"/>
+          <w:sz w:val="20"/>
+        </w:rPr>
+        <w:t>Bundle related data and behavior</w:t>
+      </w:r>
+    </w:p>
+    <w:tbl>
+      <w:tblPr>
+        <w:tblW w:type="auto" w:w="0"/>
+        <w:tblLayout w:type="fixed"/>
+        <w:tblLook w:firstColumn="1" w:firstRow="1" w:lastColumn="0" w:lastRow="0" w:noHBand="0" w:noVBand="1" w:val="04A0"/>
+      </w:tblPr>
+      <w:tblGrid>
+        <w:gridCol w:w="6480"/>
+      </w:tblGrid>
+      <w:tr>
+        <w:tc>
+          <w:tcPr>
+            <w:tcW w:type="dxa" w:w="6538"/>
+            <w:shd w:fill="F5F5F5"/>
+          </w:tcPr>
+          <w:p>
+            <w:pPr>
+              <w:spacing w:after="60"/>
+            </w:pPr>
+            <w:r>
+              <w:rPr>
+                <w:rFonts w:ascii="Aptos" w:hAnsi="Aptos"/>
+                <w:b/>
+                <w:color w:val="000000"/>
+                <w:sz w:val="20"/>
+              </w:rPr>
+              <w:t>Class pattern</w:t>
+            </w:r>
+          </w:p>
+          <w:p>
+            <w:pPr>
+              <w:spacing w:after="20"/>
+            </w:pPr>
+            <w:r>
+              <w:rPr>
+                <w:rFonts w:ascii="Consolas" w:hAnsi="Consolas"/>
+                <w:b w:val="0"/>
+                <w:color w:val="000000"/>
+                <w:sz w:val="16"/>
+              </w:rPr>
+              <w:t>class Player:</w:t>
+            </w:r>
+          </w:p>
+          <w:p>
+            <w:pPr>
+              <w:spacing w:after="20"/>
+            </w:pPr>
+            <w:r>
+              <w:rPr>
+                <w:rFonts w:ascii="Consolas" w:hAnsi="Consolas"/>
+                <w:b w:val="0"/>
+                <w:color w:val="000000"/>
+                <w:sz w:val="16"/>
+              </w:rPr>
+              <w:t xml:space="preserve">    def __init__(self, name):</w:t>
+            </w:r>
+          </w:p>
+          <w:p>
+            <w:pPr>
+              <w:spacing w:after="20"/>
+            </w:pPr>
+            <w:r>
+              <w:rPr>
+                <w:rFonts w:ascii="Consolas" w:hAnsi="Consolas"/>
+                <w:b w:val="0"/>
+                <w:color w:val="000000"/>
+                <w:sz w:val="16"/>
+              </w:rPr>
+              <w:t xml:space="preserve">        self.name = name</w:t>
+            </w:r>
+          </w:p>
+          <w:p>
+            <w:pPr>
+              <w:spacing w:after="20"/>
+            </w:pPr>
+            <w:r>
+              <w:rPr>
+                <w:rFonts w:ascii="Consolas" w:hAnsi="Consolas"/>
+                <w:b w:val="0"/>
+                <w:color w:val="000000"/>
+                <w:sz w:val="16"/>
+              </w:rPr>
+              <w:t xml:space="preserve">        self.lives = 3</w:t>
+            </w:r>
+          </w:p>
+        </w:tc>
+      </w:tr>
+    </w:tbl>
+    <w:p>
+      <w:pPr>
+        <w:spacing w:after="60"/>
+      </w:pPr>
+    </w:p>
+    <w:tbl>
+      <w:tblPr>
+        <w:tblW w:type="auto" w:w="0"/>
+        <w:tblLayout w:type="fixed"/>
+        <w:tblLook w:firstColumn="1" w:firstRow="1" w:lastColumn="0" w:lastRow="0" w:noHBand="0" w:noVBand="1" w:val="04A0"/>
+      </w:tblPr>
+      <w:tblGrid>
+        <w:gridCol w:w="6480"/>
+      </w:tblGrid>
+      <w:tr>
+        <w:tc>
+          <w:tcPr>
+            <w:tcW w:type="dxa" w:w="6538"/>
+            <w:shd w:fill="F5F5F5"/>
+          </w:tcPr>
+          <w:p>
+            <w:pPr>
+              <w:spacing w:after="60"/>
+            </w:pPr>
+            <w:r>
+              <w:rPr>
+                <w:rFonts w:ascii="Aptos" w:hAnsi="Aptos"/>
+                <w:b/>
+                <w:color w:val="000000"/>
+                <w:sz w:val="20"/>
+              </w:rPr>
+              <w:t>Create an object</w:t>
+            </w:r>
+          </w:p>
+          <w:p>
+            <w:pPr>
+              <w:spacing w:after="20"/>
+            </w:pPr>
+            <w:r>
+              <w:rPr>
+                <w:rFonts w:ascii="Consolas" w:hAnsi="Consolas"/>
+                <w:b w:val="0"/>
+                <w:color w:val="000000"/>
+                <w:sz w:val="16"/>
+              </w:rPr>
+              <w:t>hero = Player("Mario")</w:t>
+            </w:r>
+          </w:p>
+          <w:p>
+            <w:pPr>
+              <w:spacing w:after="20"/>
+            </w:pPr>
+            <w:r>
+              <w:rPr>
+                <w:rFonts w:ascii="Consolas" w:hAnsi="Consolas"/>
+                <w:b w:val="0"/>
+                <w:color w:val="000000"/>
+                <w:sz w:val="16"/>
+              </w:rPr>
+              <w:t>print(hero.name)</w:t>
+            </w:r>
+          </w:p>
+        </w:tc>
+      </w:tr>
+    </w:tbl>
+    <w:p>
+      <w:pPr>
+        <w:spacing w:after="60"/>
+      </w:pPr>
+    </w:p>
+    <w:tbl>
+      <w:tblPr>
+        <w:tblW w:type="auto" w:w="0"/>
+        <w:tblLayout w:type="fixed"/>
+        <w:tblLook w:firstColumn="1" w:firstRow="1" w:lastColumn="0" w:lastRow="0" w:noHBand="0" w:noVBand="1" w:val="04A0"/>
+      </w:tblPr>
+      <w:tblGrid>
+        <w:gridCol w:w="6480"/>
+      </w:tblGrid>
+      <w:tr>
+        <w:tc>
+          <w:tcPr>
+            <w:tcW w:type="dxa" w:w="6538"/>
+            <w:shd w:fill="F5F5F5"/>
+          </w:tcPr>
+          <w:p>
+            <w:pPr>
+              <w:spacing w:after="60"/>
+            </w:pPr>
+            <w:r>
+              <w:rPr>
+                <w:rFonts w:ascii="Aptos" w:hAnsi="Aptos"/>
+                <w:b/>
+                <w:color w:val="000000"/>
+                <w:sz w:val="20"/>
+              </w:rPr>
+              <w:t>Method</w:t>
+            </w:r>
+          </w:p>
+          <w:p>
+            <w:pPr>
+              <w:spacing w:after="20"/>
+            </w:pPr>
+            <w:r>
+              <w:rPr>
+                <w:rFonts w:ascii="Consolas" w:hAnsi="Consolas"/>
+                <w:b w:val="0"/>
+                <w:color w:val="000000"/>
+                <w:sz w:val="16"/>
+              </w:rPr>
+              <w:t>def lose_life(self):</w:t>
+            </w:r>
+          </w:p>
+          <w:p>
+            <w:pPr>
+              <w:spacing w:after="20"/>
+            </w:pPr>
+            <w:r>
+              <w:rPr>
+                <w:rFonts w:ascii="Consolas" w:hAnsi="Consolas"/>
+                <w:b w:val="0"/>
+                <w:color w:val="000000"/>
+                <w:sz w:val="16"/>
+              </w:rPr>
+              <w:t xml:space="preserve">    self.lives -= 1</w:t>
+            </w:r>
+          </w:p>
+        </w:tc>
+      </w:tr>
+    </w:tbl>
+    <w:p>
+      <w:pPr>
+        <w:spacing w:after="60"/>
+      </w:pPr>
+    </w:p>
+    <w:tbl>
+      <w:tblPr>
+        <w:tblW w:type="auto" w:w="0"/>
+        <w:tblLayout w:type="fixed"/>
+        <w:tblLook w:firstColumn="1" w:firstRow="1" w:lastColumn="0" w:lastRow="0" w:noHBand="0" w:noVBand="1" w:val="04A0"/>
+      </w:tblPr>
+      <w:tblGrid>
+        <w:gridCol w:w="6480"/>
+      </w:tblGrid>
+      <w:tr>
+        <w:tc>
+          <w:tcPr>
+            <w:tcW w:type="dxa" w:w="6538"/>
+            <w:shd w:fill="F5F5F5"/>
+          </w:tcPr>
+          <w:p>
+            <w:pPr>
+              <w:spacing w:after="60"/>
+            </w:pPr>
+            <w:r>
+              <w:rPr>
+                <w:rFonts w:ascii="Aptos" w:hAnsi="Aptos"/>
+                <w:b/>
+                <w:color w:val="000000"/>
+                <w:sz w:val="20"/>
+              </w:rPr>
+              <w:t>Mental model</w:t>
+            </w:r>
+          </w:p>
+          <w:p>
+            <w:pPr>
+              <w:spacing w:after="20"/>
+            </w:pPr>
+            <w:r>
+              <w:rPr>
+                <w:rFonts w:ascii="Aptos" w:hAnsi="Aptos"/>
+                <w:b w:val="0"/>
+                <w:color w:val="000000"/>
+                <w:sz w:val="17"/>
+              </w:rPr>
+              <w:t>A class is a blueprint. An object is one value created from that blueprint. self means this object.</w:t>
+            </w:r>
+          </w:p>
+        </w:tc>
+      </w:tr>
+    </w:tbl>
+    <w:p>
+      <w:pPr>
+        <w:spacing w:after="60"/>
+      </w:pPr>
+    </w:p>
+    <w:p>
+      <w:pPr>
+        <w:jc w:val="right"/>
+      </w:pPr>
+      <w:r>
+        <w:rPr>
+          <w:rFonts w:ascii="Aptos" w:hAnsi="Aptos"/>
+          <w:b/>
+          <w:color w:val="444444"/>
+          <w:sz w:val="15"/>
+        </w:rPr>
+        <w:t>PYTHON FIELD GUIDE   14</w:t>
+      </w:r>
+    </w:p>
+    <w:p>
+      <w:r>
+        <w:br w:type="page"/>
+      </w:r>
+    </w:p>
+    <w:p>
+      <w:pPr>
+        <w:pStyle w:val="Title"/>
+        <w:spacing w:after="40"/>
+        <w:jc w:val="left"/>
+      </w:pPr>
+      <w:r>
+        <w:rPr>
+          <w:rFonts w:ascii="Aptos" w:hAnsi="Aptos"/>
+          <w:b/>
+          <w:color w:val="000000"/>
+          <w:sz w:val="40"/>
+        </w:rPr>
+        <w:t>Future testing and design</w:t>
+      </w:r>
+    </w:p>
+    <w:p>
+      <w:pPr>
+        <w:spacing w:after="180"/>
+      </w:pPr>
+      <w:r>
+        <w:rPr>
+          <w:rFonts w:ascii="Aptos" w:hAnsi="Aptos"/>
+          <w:b w:val="0"/>
+          <w:color w:val="444444"/>
+          <w:sz w:val="20"/>
+        </w:rPr>
+        <w:t>Build reliable programs in small steps</w:t>
+      </w:r>
+    </w:p>
+    <w:tbl>
+      <w:tblPr>
+        <w:tblW w:type="auto" w:w="0"/>
+        <w:tblLayout w:type="fixed"/>
+        <w:tblLook w:firstColumn="1" w:firstRow="1" w:lastColumn="0" w:lastRow="0" w:noHBand="0" w:noVBand="1" w:val="04A0"/>
+      </w:tblPr>
+      <w:tblGrid>
+        <w:gridCol w:w="6480"/>
+      </w:tblGrid>
+      <w:tr>
+        <w:tc>
+          <w:tcPr>
+            <w:tcW w:type="dxa" w:w="6538"/>
+            <w:shd w:fill="F5F5F5"/>
+          </w:tcPr>
+          <w:p>
+            <w:pPr>
+              <w:spacing w:after="60"/>
+            </w:pPr>
+            <w:r>
+              <w:rPr>
+                <w:rFonts w:ascii="Aptos" w:hAnsi="Aptos"/>
+                <w:b/>
+                <w:color w:val="000000"/>
+                <w:sz w:val="20"/>
+              </w:rPr>
+              <w:t>Arrange act assert</w:t>
+            </w:r>
+          </w:p>
+          <w:p>
+            <w:pPr>
+              <w:spacing w:after="20"/>
+            </w:pPr>
+            <w:r>
+              <w:rPr>
+                <w:rFonts w:ascii="Aptos" w:hAnsi="Aptos"/>
+                <w:b w:val="0"/>
+                <w:color w:val="000000"/>
+                <w:sz w:val="17"/>
+              </w:rPr>
+              <w:t>Arrange inputs, call the function, then check the result you expected.</w:t>
+            </w:r>
+          </w:p>
+        </w:tc>
+      </w:tr>
+    </w:tbl>
+    <w:p>
+      <w:pPr>
+        <w:spacing w:after="60"/>
+      </w:pPr>
+    </w:p>
+    <w:tbl>
+      <w:tblPr>
+        <w:tblW w:type="auto" w:w="0"/>
+        <w:tblLayout w:type="fixed"/>
+        <w:tblLook w:firstColumn="1" w:firstRow="1" w:lastColumn="0" w:lastRow="0" w:noHBand="0" w:noVBand="1" w:val="04A0"/>
+      </w:tblPr>
+      <w:tblGrid>
+        <w:gridCol w:w="6480"/>
+      </w:tblGrid>
+      <w:tr>
+        <w:tc>
+          <w:tcPr>
+            <w:tcW w:type="dxa" w:w="6538"/>
+            <w:shd w:fill="F5F5F5"/>
+          </w:tcPr>
+          <w:p>
+            <w:pPr>
+              <w:spacing w:after="60"/>
+            </w:pPr>
+            <w:r>
+              <w:rPr>
+                <w:rFonts w:ascii="Aptos" w:hAnsi="Aptos"/>
+                <w:b/>
+                <w:color w:val="000000"/>
+                <w:sz w:val="20"/>
+              </w:rPr>
+              <w:t>Simple self check</w:t>
+            </w:r>
+          </w:p>
+          <w:p>
+            <w:pPr>
+              <w:spacing w:after="20"/>
+            </w:pPr>
+            <w:r>
+              <w:rPr>
+                <w:rFonts w:ascii="Aptos" w:hAnsi="Aptos"/>
+                <w:b w:val="0"/>
+                <w:color w:val="000000"/>
+                <w:sz w:val="17"/>
+              </w:rPr>
+              <w:t>assert power(7, 5) == 12</w:t>
+            </w:r>
+          </w:p>
+          <w:p>
+            <w:pPr>
+              <w:spacing w:after="20"/>
+            </w:pPr>
+            <w:r>
+              <w:rPr>
+                <w:rFonts w:ascii="Aptos" w:hAnsi="Aptos"/>
+                <w:b w:val="0"/>
+                <w:color w:val="000000"/>
+                <w:sz w:val="17"/>
+              </w:rPr>
+              <w:t>assert double(0) == 0</w:t>
+            </w:r>
+          </w:p>
+        </w:tc>
+      </w:tr>
+    </w:tbl>
+    <w:p>
+      <w:pPr>
+        <w:spacing w:after="60"/>
+      </w:pPr>
+    </w:p>
+    <w:tbl>
+      <w:tblPr>
+        <w:tblW w:type="auto" w:w="0"/>
+        <w:tblLayout w:type="fixed"/>
+        <w:tblLook w:firstColumn="1" w:firstRow="1" w:lastColumn="0" w:lastRow="0" w:noHBand="0" w:noVBand="1" w:val="04A0"/>
+      </w:tblPr>
+      <w:tblGrid>
+        <w:gridCol w:w="6480"/>
+      </w:tblGrid>
+      <w:tr>
+        <w:tc>
+          <w:tcPr>
+            <w:tcW w:type="dxa" w:w="6538"/>
+            <w:shd w:fill="F5F5F5"/>
+          </w:tcPr>
+          <w:p>
+            <w:pPr>
+              <w:spacing w:after="60"/>
+            </w:pPr>
+            <w:r>
+              <w:rPr>
+                <w:rFonts w:ascii="Aptos" w:hAnsi="Aptos"/>
+                <w:b/>
+                <w:color w:val="000000"/>
+                <w:sz w:val="20"/>
+              </w:rPr>
+              <w:t>Test edges</w:t>
+            </w:r>
+          </w:p>
+          <w:p>
+            <w:pPr>
+              <w:spacing w:after="20"/>
+            </w:pPr>
+            <w:r>
+              <w:rPr>
+                <w:rFonts w:ascii="Aptos" w:hAnsi="Aptos"/>
+                <w:b w:val="0"/>
+                <w:color w:val="000000"/>
+                <w:sz w:val="17"/>
+              </w:rPr>
+              <w:t>Try empty lists, zero, negative numbers, missing values, and the smallest or largest allowed input.</w:t>
+            </w:r>
+          </w:p>
+        </w:tc>
+      </w:tr>
+    </w:tbl>
+    <w:p>
+      <w:pPr>
+        <w:spacing w:after="60"/>
+      </w:pPr>
+    </w:p>
+    <w:tbl>
+      <w:tblPr>
+        <w:tblW w:type="auto" w:w="0"/>
+        <w:tblLayout w:type="fixed"/>
+        <w:tblLook w:firstColumn="1" w:firstRow="1" w:lastColumn="0" w:lastRow="0" w:noHBand="0" w:noVBand="1" w:val="04A0"/>
+      </w:tblPr>
+      <w:tblGrid>
+        <w:gridCol w:w="6480"/>
+      </w:tblGrid>
+      <w:tr>
+        <w:tc>
+          <w:tcPr>
+            <w:tcW w:type="dxa" w:w="6538"/>
+            <w:shd w:fill="F5F5F5"/>
+          </w:tcPr>
+          <w:p>
+            <w:pPr>
+              <w:spacing w:after="60"/>
+            </w:pPr>
+            <w:r>
+              <w:rPr>
+                <w:rFonts w:ascii="Aptos" w:hAnsi="Aptos"/>
+                <w:b/>
+                <w:color w:val="000000"/>
+                <w:sz w:val="20"/>
+              </w:rPr>
+              <w:t>Decompose</w:t>
+            </w:r>
+          </w:p>
+          <w:p>
+            <w:pPr>
+              <w:spacing w:after="20"/>
+            </w:pPr>
+            <w:r>
+              <w:rPr>
+                <w:rFonts w:ascii="Aptos" w:hAnsi="Aptos"/>
+                <w:b w:val="0"/>
+                <w:color w:val="000000"/>
+                <w:sz w:val="17"/>
+              </w:rPr>
+              <w:t>Break a large problem into named functions. Test each function before joining them together.</w:t>
+            </w:r>
+          </w:p>
+        </w:tc>
+      </w:tr>
+    </w:tbl>
+    <w:p>
+      <w:pPr>
+        <w:spacing w:after="60"/>
+      </w:pPr>
+    </w:p>
+    <w:tbl>
+      <w:tblPr>
+        <w:tblW w:type="auto" w:w="0"/>
+        <w:tblLayout w:type="fixed"/>
+        <w:tblLook w:firstColumn="1" w:firstRow="1" w:lastColumn="0" w:lastRow="0" w:noHBand="0" w:noVBand="1" w:val="04A0"/>
+      </w:tblPr>
+      <w:tblGrid>
+        <w:gridCol w:w="6480"/>
+      </w:tblGrid>
+      <w:tr>
+        <w:tc>
+          <w:tcPr>
+            <w:tcW w:type="dxa" w:w="6538"/>
+            <w:shd w:fill="F5F5F5"/>
+          </w:tcPr>
+          <w:p>
+            <w:pPr>
+              <w:spacing w:after="60"/>
+            </w:pPr>
+            <w:r>
+              <w:rPr>
+                <w:rFonts w:ascii="Aptos" w:hAnsi="Aptos"/>
+                <w:b/>
+                <w:color w:val="000000"/>
+                <w:sz w:val="20"/>
+              </w:rPr>
+              <w:t>Comments</w:t>
+            </w:r>
+          </w:p>
+          <w:p>
+            <w:pPr>
+              <w:spacing w:after="20"/>
+            </w:pPr>
+            <w:r>
+              <w:rPr>
+                <w:rFonts w:ascii="Aptos" w:hAnsi="Aptos"/>
+                <w:b w:val="0"/>
+                <w:color w:val="000000"/>
+                <w:sz w:val="17"/>
+              </w:rPr>
+              <w:t>Explain why a decision exists. Let clear names and small functions explain what the code does.</w:t>
+            </w:r>
+          </w:p>
+        </w:tc>
+      </w:tr>
+    </w:tbl>
+    <w:p>
+      <w:pPr>
+        <w:spacing w:after="60"/>
+      </w:pPr>
+    </w:p>
+    <w:p>
+      <w:pPr>
+        <w:jc w:val="right"/>
+      </w:pPr>
+      <w:r>
+        <w:rPr>
+          <w:rFonts w:ascii="Aptos" w:hAnsi="Aptos"/>
+          <w:b/>
+          <w:color w:val="444444"/>
+          <w:sz w:val="15"/>
+        </w:rPr>
+        <w:t>PYTHON FIELD GUIDE   15</w:t>
+      </w:r>
+    </w:p>
+    <w:p>
+      <w:r>
+        <w:br w:type="page"/>
+      </w:r>
+    </w:p>
+    <w:p>
+      <w:pPr>
+        <w:pStyle w:val="Title"/>
+        <w:spacing w:after="40"/>
+        <w:jc w:val="left"/>
+      </w:pPr>
+      <w:r>
+        <w:rPr>
+          <w:rFonts w:ascii="Aptos" w:hAnsi="Aptos"/>
+          <w:b/>
+          <w:color w:val="000000"/>
+          <w:sz w:val="40"/>
+        </w:rPr>
+        <w:t>Python lookup index</w:t>
+      </w:r>
+    </w:p>
+    <w:p>
+      <w:pPr>
+        <w:spacing w:after="180"/>
+      </w:pPr>
+      <w:r>
+        <w:rPr>
+          <w:rFonts w:ascii="Aptos" w:hAnsi="Aptos"/>
+          <w:b w:val="0"/>
+          <w:color w:val="444444"/>
+          <w:sz w:val="20"/>
+        </w:rPr>
+        <w:t>Where to turn when you get stuck</w:t>
+      </w:r>
+    </w:p>
+    <w:tbl>
+      <w:tblPr>
+        <w:tblW w:type="auto" w:w="0"/>
+        <w:tblLayout w:type="fixed"/>
+        <w:tblLook w:firstColumn="1" w:firstRow="1" w:lastColumn="0" w:lastRow="0" w:noHBand="0" w:noVBand="1" w:val="04A0"/>
+      </w:tblPr>
+      <w:tblGrid>
+        <w:gridCol w:w="6480"/>
+      </w:tblGrid>
+      <w:tr>
+        <w:tc>
+          <w:tcPr>
+            <w:tcW w:type="dxa" w:w="6538"/>
+            <w:shd w:fill="F5F5F5"/>
+          </w:tcPr>
+          <w:p>
+            <w:pPr>
+              <w:spacing w:after="60"/>
+            </w:pPr>
+            <w:r>
+              <w:rPr>
+                <w:rFonts w:ascii="Aptos" w:hAnsi="Aptos"/>
+                <w:b/>
+                <w:color w:val="000000"/>
+                <w:sz w:val="20"/>
+              </w:rPr>
+              <w:t>Current course</w:t>
+            </w:r>
+          </w:p>
+          <w:p>
+            <w:pPr>
+              <w:spacing w:after="20"/>
+            </w:pPr>
+            <w:r>
+              <w:rPr>
+                <w:rFonts w:ascii="Aptos" w:hAnsi="Aptos"/>
+                <w:b w:val="0"/>
+                <w:color w:val="000000"/>
+                <w:sz w:val="17"/>
+              </w:rPr>
+              <w:t>Variables and input 3   Conditions 4   For and range 5   While 6   Functions and None 7   Quick check 8</w:t>
+            </w:r>
+          </w:p>
+        </w:tc>
+      </w:tr>
+    </w:tbl>
+    <w:p>
+      <w:pPr>
+        <w:spacing w:after="60"/>
+      </w:pPr>
+    </w:p>
+    <w:tbl>
+      <w:tblPr>
+        <w:tblW w:type="auto" w:w="0"/>
+        <w:tblLayout w:type="fixed"/>
+        <w:tblLook w:firstColumn="1" w:firstRow="1" w:lastColumn="0" w:lastRow="0" w:noHBand="0" w:noVBand="1" w:val="04A0"/>
+      </w:tblPr>
+      <w:tblGrid>
+        <w:gridCol w:w="6480"/>
+      </w:tblGrid>
+      <w:tr>
+        <w:tc>
+          <w:tcPr>
+            <w:tcW w:type="dxa" w:w="6538"/>
+            <w:shd w:fill="F5F5F5"/>
+          </w:tcPr>
+          <w:p>
+            <w:pPr>
+              <w:spacing w:after="60"/>
+            </w:pPr>
+            <w:r>
+              <w:rPr>
+                <w:rFonts w:ascii="Aptos" w:hAnsi="Aptos"/>
+                <w:b/>
+                <w:color w:val="000000"/>
+                <w:sz w:val="20"/>
+              </w:rPr>
+              <w:t>Future reference</w:t>
+            </w:r>
+          </w:p>
+          <w:p>
+            <w:pPr>
+              <w:spacing w:after="20"/>
+            </w:pPr>
+            <w:r>
+              <w:rPr>
+                <w:rFonts w:ascii="Aptos" w:hAnsi="Aptos"/>
+                <w:b w:val="0"/>
+                <w:color w:val="000000"/>
+                <w:sz w:val="17"/>
+              </w:rPr>
+              <w:t>Strings 9   Dictionaries 10   Function patterns 11   Errors 12   Files 13   Classes 14   Testing 15</w:t>
+            </w:r>
+          </w:p>
+        </w:tc>
+      </w:tr>
+    </w:tbl>
+    <w:p>
+      <w:pPr>
+        <w:spacing w:after="60"/>
+      </w:pPr>
+    </w:p>
+    <w:tbl>
+      <w:tblPr>
+        <w:tblW w:type="auto" w:w="0"/>
+        <w:tblLayout w:type="fixed"/>
+        <w:tblLook w:firstColumn="1" w:firstRow="1" w:lastColumn="0" w:lastRow="0" w:noHBand="0" w:noVBand="1" w:val="04A0"/>
+      </w:tblPr>
+      <w:tblGrid>
+        <w:gridCol w:w="6480"/>
+      </w:tblGrid>
+      <w:tr>
+        <w:tc>
+          <w:tcPr>
+            <w:tcW w:type="dxa" w:w="6538"/>
+            <w:shd w:fill="F5F5F5"/>
+          </w:tcPr>
+          <w:p>
+            <w:pPr>
+              <w:spacing w:after="60"/>
+            </w:pPr>
+            <w:r>
+              <w:rPr>
+                <w:rFonts w:ascii="Aptos" w:hAnsi="Aptos"/>
+                <w:b/>
+                <w:color w:val="000000"/>
+                <w:sz w:val="20"/>
+              </w:rPr>
+              <w:t>Search formula</w:t>
+            </w:r>
+          </w:p>
+          <w:p>
+            <w:pPr>
+              <w:spacing w:after="20"/>
+            </w:pPr>
+            <w:r>
+              <w:rPr>
+                <w:rFonts w:ascii="Aptos" w:hAnsi="Aptos"/>
+                <w:b w:val="0"/>
+                <w:color w:val="000000"/>
+                <w:sz w:val="17"/>
+              </w:rPr>
+              <w:t>Search Python plus your goal plus the value type. Example: Python remove item from list.</w:t>
+            </w:r>
+          </w:p>
+        </w:tc>
+      </w:tr>
+    </w:tbl>
+    <w:p>
+      <w:pPr>
+        <w:spacing w:after="60"/>
+      </w:pPr>
+    </w:p>
+    <w:tbl>
+      <w:tblPr>
+        <w:tblW w:type="auto" w:w="0"/>
+        <w:tblLayout w:type="fixed"/>
+        <w:tblLook w:firstColumn="1" w:firstRow="1" w:lastColumn="0" w:lastRow="0" w:noHBand="0" w:noVBand="1" w:val="04A0"/>
+      </w:tblPr>
+      <w:tblGrid>
+        <w:gridCol w:w="6480"/>
+      </w:tblGrid>
+      <w:tr>
+        <w:tc>
+          <w:tcPr>
+            <w:tcW w:type="dxa" w:w="6538"/>
+            <w:shd w:fill="F5F5F5"/>
+          </w:tcPr>
+          <w:p>
+            <w:pPr>
+              <w:spacing w:after="60"/>
+            </w:pPr>
+            <w:r>
+              <w:rPr>
+                <w:rFonts w:ascii="Aptos" w:hAnsi="Aptos"/>
+                <w:b/>
+                <w:color w:val="000000"/>
+                <w:sz w:val="20"/>
+              </w:rPr>
+              <w:t>Ask a strong question</w:t>
+            </w:r>
+          </w:p>
+          <w:p>
+            <w:pPr>
+              <w:spacing w:after="20"/>
+            </w:pPr>
+            <w:r>
+              <w:rPr>
+                <w:rFonts w:ascii="Aptos" w:hAnsi="Aptos"/>
+                <w:b w:val="0"/>
+                <w:color w:val="000000"/>
+                <w:sz w:val="17"/>
+              </w:rPr>
+              <w:t>Share what you expected, what happened, the smallest code that reproduces it, and the full error message.</w:t>
+            </w:r>
+          </w:p>
+        </w:tc>
+      </w:tr>
+    </w:tbl>
+    <w:p>
+      <w:pPr>
+        <w:spacing w:after="60"/>
+      </w:pPr>
+    </w:p>
+    <w:tbl>
+      <w:tblPr>
+        <w:tblW w:type="auto" w:w="0"/>
+        <w:tblLayout w:type="fixed"/>
+        <w:tblLook w:firstColumn="1" w:firstRow="1" w:lastColumn="0" w:lastRow="0" w:noHBand="0" w:noVBand="1" w:val="04A0"/>
+      </w:tblPr>
+      <w:tblGrid>
+        <w:gridCol w:w="6480"/>
+      </w:tblGrid>
+      <w:tr>
+        <w:tc>
+          <w:tcPr>
+            <w:tcW w:type="dxa" w:w="6538"/>
+            <w:shd w:fill="F5F5F5"/>
+          </w:tcPr>
+          <w:p>
+            <w:pPr>
+              <w:spacing w:after="60"/>
+            </w:pPr>
+            <w:r>
+              <w:rPr>
+                <w:rFonts w:ascii="Aptos" w:hAnsi="Aptos"/>
+                <w:b/>
+                <w:color w:val="000000"/>
+                <w:sz w:val="20"/>
+              </w:rPr>
+              <w:t>Keep learning</w:t>
+            </w:r>
+          </w:p>
+          <w:p>
+            <w:pPr>
+              <w:spacing w:after="20"/>
+            </w:pPr>
+            <w:r>
+              <w:rPr>
+                <w:rFonts w:ascii="Aptos" w:hAnsi="Aptos"/>
+                <w:b w:val="0"/>
+                <w:color w:val="000000"/>
+                <w:sz w:val="17"/>
+              </w:rPr>
+              <w:t>Read examples actively: predict, run, change one thing, and explain the new result.</w:t>
+            </w:r>
+          </w:p>
+        </w:tc>
+      </w:tr>
+    </w:tbl>
+    <w:p>
+      <w:pPr>
+        <w:spacing w:after="60"/>
+      </w:pPr>
+    </w:p>
+    <w:p>
+      <w:pPr>
+        <w:jc w:val="right"/>
+      </w:pPr>
+      <w:r>
+        <w:rPr>
+          <w:rFonts w:ascii="Aptos" w:hAnsi="Aptos"/>
+          <w:b/>
+          <w:color w:val="444444"/>
+          <w:sz w:val="15"/>
+        </w:rPr>
+        <w:t>PYTHON FIELD GUIDE   16</w:t>
       </w:r>
     </w:p>
     <w:sectPr>

</xml_diff>

<commit_message>
Preserve Python indentation in field guide
</commit_message>
<xml_diff>
--- a/week-05-halloween-loop-quest/handouts/python-field-guide-editable.docx
+++ b/week-05-halloween-loop-quest/handouts/python-field-guide-editable.docx
@@ -169,10 +169,10 @@
             </w:pPr>
             <w:r>
               <w:rPr>
-                <w:rFonts w:ascii="Consolas" w:hAnsi="Consolas"/>
+                <w:rFonts w:ascii="Aptos" w:hAnsi="Aptos"/>
                 <w:b w:val="0"/>
                 <w:color w:val="000000"/>
-                <w:sz w:val="16"/>
+                <w:sz w:val="17"/>
               </w:rPr>
               <w:t>Pages 2 through 8 review our current course. Pages 9 through 16 prepare you for future lessons.</w:t>
             </w:r>
@@ -371,10 +371,10 @@
             </w:pPr>
             <w:r>
               <w:rPr>
-                <w:rFonts w:ascii="Consolas" w:hAnsi="Consolas"/>
+                <w:rFonts w:ascii="Aptos" w:hAnsi="Aptos"/>
                 <w:b w:val="0"/>
                 <w:color w:val="000000"/>
-                <w:sz w:val="16"/>
+                <w:sz w:val="17"/>
               </w:rPr>
               <w:t>Use for with a collection or range. Use while when repetition depends on a condition.</w:t>
             </w:r>
@@ -1170,10 +1170,10 @@
             </w:pPr>
             <w:r>
               <w:rPr>
-                <w:rFonts w:ascii="Consolas" w:hAnsi="Consolas"/>
+                <w:rFonts w:ascii="Aptos" w:hAnsi="Aptos"/>
                 <w:b w:val="0"/>
                 <w:color w:val="000000"/>
-                <w:sz w:val="16"/>
+                <w:sz w:val="17"/>
               </w:rPr>
               <w:t>Use == to compare values. Use = to assign a value to a variable.</w:t>
             </w:r>
@@ -1335,10 +1335,10 @@
             </w:pPr>
             <w:r>
               <w:rPr>
-                <w:rFonts w:ascii="Consolas" w:hAnsi="Consolas"/>
+                <w:rFonts w:ascii="Aptos" w:hAnsi="Aptos"/>
                 <w:b w:val="0"/>
                 <w:color w:val="000000"/>
-                <w:sz w:val="16"/>
+                <w:sz w:val="17"/>
               </w:rPr>
               <w:t>range(4) produces 0, 1, 2, 3. It starts at 0 and stops before 4.</w:t>
             </w:r>
@@ -1386,10 +1386,10 @@
             </w:pPr>
             <w:r>
               <w:rPr>
-                <w:rFonts w:ascii="Consolas" w:hAnsi="Consolas"/>
+                <w:rFonts w:ascii="Aptos" w:hAnsi="Aptos"/>
                 <w:b w:val="0"/>
                 <w:color w:val="000000"/>
-                <w:sz w:val="16"/>
+                <w:sz w:val="17"/>
               </w:rPr>
               <w:t>range(4) -&gt; 0,1,2,3</w:t>
             </w:r>
@@ -1400,10 +1400,10 @@
             </w:pPr>
             <w:r>
               <w:rPr>
-                <w:rFonts w:ascii="Consolas" w:hAnsi="Consolas"/>
+                <w:rFonts w:ascii="Aptos" w:hAnsi="Aptos"/>
                 <w:b w:val="0"/>
                 <w:color w:val="000000"/>
-                <w:sz w:val="16"/>
+                <w:sz w:val="17"/>
               </w:rPr>
               <w:t>range(2, 5) -&gt; 2,3,4</w:t>
             </w:r>
@@ -1414,10 +1414,10 @@
             </w:pPr>
             <w:r>
               <w:rPr>
-                <w:rFonts w:ascii="Consolas" w:hAnsi="Consolas"/>
+                <w:rFonts w:ascii="Aptos" w:hAnsi="Aptos"/>
                 <w:b w:val="0"/>
                 <w:color w:val="000000"/>
-                <w:sz w:val="16"/>
+                <w:sz w:val="17"/>
               </w:rPr>
               <w:t>range(2, 9, 2) -&gt; 2,4,6,8</w:t>
             </w:r>
@@ -1774,10 +1774,10 @@
             </w:pPr>
             <w:r>
               <w:rPr>
-                <w:rFonts w:ascii="Consolas" w:hAnsi="Consolas"/>
+                <w:rFonts w:ascii="Aptos" w:hAnsi="Aptos"/>
                 <w:b w:val="0"/>
                 <w:color w:val="000000"/>
-                <w:sz w:val="16"/>
+                <w:sz w:val="17"/>
               </w:rPr>
               <w:t>Use for for a list or known count. Use while when repetition depends on a condition.</w:t>
             </w:r>
@@ -2321,10 +2321,10 @@
             </w:pPr>
             <w:r>
               <w:rPr>
-                <w:rFonts w:ascii="Consolas" w:hAnsi="Consolas"/>
+                <w:rFonts w:ascii="Aptos" w:hAnsi="Aptos"/>
                 <w:b w:val="0"/>
                 <w:color w:val="000000"/>
-                <w:sz w:val="16"/>
+                <w:sz w:val="17"/>
               </w:rPr>
               <w:t>Look for missing colons, parentheses, quotes, indentation, or misspelled names.</w:t>
             </w:r>
@@ -2934,10 +2934,10 @@
             </w:pPr>
             <w:r>
               <w:rPr>
-                <w:rFonts w:ascii="Consolas" w:hAnsi="Consolas"/>
+                <w:rFonts w:ascii="Aptos" w:hAnsi="Aptos"/>
                 <w:b w:val="0"/>
                 <w:color w:val="000000"/>
-                <w:sz w:val="16"/>
+                <w:sz w:val="17"/>
               </w:rPr>
               <w:t>player.get("power", "small") returns a default if the key is missing.</w:t>
             </w:r>
@@ -3050,10 +3050,10 @@
             </w:pPr>
             <w:r>
               <w:rPr>
-                <w:rFonts w:ascii="Consolas" w:hAnsi="Consolas"/>
+                <w:rFonts w:ascii="Aptos" w:hAnsi="Aptos"/>
                 <w:b w:val="0"/>
                 <w:color w:val="000000"/>
-                <w:sz w:val="16"/>
+                <w:sz w:val="17"/>
               </w:rPr>
               <w:t>unique_items = set(items) removes duplicates. Sets are useful for membership checks.</w:t>
             </w:r>
@@ -3317,10 +3317,10 @@
             </w:pPr>
             <w:r>
               <w:rPr>
-                <w:rFonts w:ascii="Consolas" w:hAnsi="Consolas"/>
+                <w:rFonts w:ascii="Aptos" w:hAnsi="Aptos"/>
                 <w:b w:val="0"/>
                 <w:color w:val="000000"/>
-                <w:sz w:val="16"/>
+                <w:sz w:val="17"/>
               </w:rPr>
               <w:t>Place a short docstring under def to explain the inputs, behavior, and returned value.</w:t>
             </w:r>
@@ -3417,10 +3417,10 @@
             </w:pPr>
             <w:r>
               <w:rPr>
-                <w:rFonts w:ascii="Consolas" w:hAnsi="Consolas"/>
+                <w:rFonts w:ascii="Aptos" w:hAnsi="Aptos"/>
                 <w:b w:val="0"/>
                 <w:color w:val="000000"/>
-                <w:sz w:val="16"/>
+                <w:sz w:val="17"/>
               </w:rPr>
               <w:t>Start at the final line for the error type and message, then check the named line in your code.</w:t>
             </w:r>
@@ -3612,10 +3612,10 @@
             </w:pPr>
             <w:r>
               <w:rPr>
-                <w:rFonts w:ascii="Consolas" w:hAnsi="Consolas"/>
+                <w:rFonts w:ascii="Aptos" w:hAnsi="Aptos"/>
                 <w:b w:val="0"/>
                 <w:color w:val="000000"/>
-                <w:sz w:val="16"/>
+                <w:sz w:val="17"/>
               </w:rPr>
               <w:t>Catch errors you expect and can handle. Unexpected errors should stay visible while debugging.</w:t>
             </w:r>
@@ -3777,10 +3777,10 @@
             </w:pPr>
             <w:r>
               <w:rPr>
-                <w:rFonts w:ascii="Aptos" w:hAnsi="Aptos"/>
+                <w:rFonts w:ascii="Consolas" w:hAnsi="Consolas"/>
                 <w:b w:val="0"/>
                 <w:color w:val="000000"/>
-                <w:sz w:val="17"/>
+                <w:sz w:val="16"/>
               </w:rPr>
               <w:t>with open("score.txt", "w") as file:</w:t>
             </w:r>
@@ -3791,10 +3791,10 @@
             </w:pPr>
             <w:r>
               <w:rPr>
-                <w:rFonts w:ascii="Aptos" w:hAnsi="Aptos"/>
+                <w:rFonts w:ascii="Consolas" w:hAnsi="Consolas"/>
                 <w:b w:val="0"/>
                 <w:color w:val="000000"/>
-                <w:sz w:val="17"/>
+                <w:sz w:val="16"/>
               </w:rPr>
               <w:t xml:space="preserve">    file.write(str(score))</w:t>
             </w:r>
@@ -3972,10 +3972,10 @@
             </w:pPr>
             <w:r>
               <w:rPr>
-                <w:rFonts w:ascii="Consolas" w:hAnsi="Consolas"/>
+                <w:rFonts w:ascii="Aptos" w:hAnsi="Aptos"/>
                 <w:b w:val="0"/>
                 <w:color w:val="000000"/>
-                <w:sz w:val="16"/>
+                <w:sz w:val="17"/>
               </w:rPr>
               <w:t>Use with so Python closes the file even if something goes wrong.</w:t>
             </w:r>
@@ -4446,10 +4446,10 @@
             </w:pPr>
             <w:r>
               <w:rPr>
-                <w:rFonts w:ascii="Aptos" w:hAnsi="Aptos"/>
+                <w:rFonts w:ascii="Consolas" w:hAnsi="Consolas"/>
                 <w:b w:val="0"/>
                 <w:color w:val="000000"/>
-                <w:sz w:val="17"/>
+                <w:sz w:val="16"/>
               </w:rPr>
               <w:t>assert power(7, 5) == 12</w:t>
             </w:r>
@@ -4460,10 +4460,10 @@
             </w:pPr>
             <w:r>
               <w:rPr>
-                <w:rFonts w:ascii="Aptos" w:hAnsi="Aptos"/>
+                <w:rFonts w:ascii="Consolas" w:hAnsi="Consolas"/>
                 <w:b w:val="0"/>
                 <w:color w:val="000000"/>
-                <w:sz w:val="17"/>
+                <w:sz w:val="16"/>
               </w:rPr>
               <w:t>assert double(0) == 0</w:t>
             </w:r>

</xml_diff>

<commit_message>
Add worked concept examples to Python field guide
</commit_message>
<xml_diff>
--- a/week-05-halloween-loop-quest/handouts/python-field-guide-editable.docx
+++ b/week-05-halloween-loop-quest/handouts/python-field-guide-editable.docx
@@ -8746,6 +8746,1894 @@
           <w:color w:val="000000"/>
           <w:sz w:val="40"/>
         </w:rPr>
+        <w:t>Worked types examples</w:t>
+      </w:r>
+    </w:p>
+    <w:p>
+      <w:pPr>
+        <w:spacing w:after="180"/>
+      </w:pPr>
+      <w:r>
+        <w:rPr>
+          <w:rFonts w:ascii="Aptos" w:hAnsi="Aptos"/>
+          <w:b w:val="0"/>
+          <w:color w:val="444444"/>
+          <w:sz w:val="20"/>
+        </w:rPr>
+        <w:t>Predict the type and value before reading the answer</w:t>
+      </w:r>
+    </w:p>
+    <w:tbl>
+      <w:tblPr>
+        <w:tblW w:type="auto" w:w="0"/>
+        <w:tblLayout w:type="fixed"/>
+        <w:tblLook w:firstColumn="1" w:firstRow="1" w:lastColumn="0" w:lastRow="0" w:noHBand="0" w:noVBand="1" w:val="04A0"/>
+      </w:tblPr>
+      <w:tblGrid>
+        <w:gridCol w:w="6480"/>
+      </w:tblGrid>
+      <w:tr>
+        <w:tc>
+          <w:tcPr>
+            <w:tcW w:type="dxa" w:w="6538"/>
+            <w:shd w:fill="F5F5F5"/>
+          </w:tcPr>
+          <w:p>
+            <w:pPr>
+              <w:spacing w:after="60"/>
+            </w:pPr>
+            <w:r>
+              <w:rPr>
+                <w:rFonts w:ascii="Aptos" w:hAnsi="Aptos"/>
+                <w:b/>
+                <w:color w:val="000000"/>
+                <w:sz w:val="20"/>
+              </w:rPr>
+              <w:t>Integer and float</w:t>
+            </w:r>
+          </w:p>
+          <w:p>
+            <w:pPr>
+              <w:spacing w:after="20"/>
+            </w:pPr>
+            <w:r>
+              <w:rPr>
+                <w:rFonts w:ascii="Consolas" w:hAnsi="Consolas"/>
+                <w:b w:val="0"/>
+                <w:color w:val="000000"/>
+                <w:sz w:val="16"/>
+              </w:rPr>
+              <w:t>points = 7</w:t>
+            </w:r>
+          </w:p>
+          <w:p>
+            <w:pPr>
+              <w:spacing w:after="20"/>
+            </w:pPr>
+            <w:r>
+              <w:rPr>
+                <w:rFonts w:ascii="Consolas" w:hAnsi="Consolas"/>
+                <w:b w:val="0"/>
+                <w:color w:val="000000"/>
+                <w:sz w:val="16"/>
+              </w:rPr>
+              <w:t>bonus = 2.5</w:t>
+            </w:r>
+          </w:p>
+          <w:p>
+            <w:pPr>
+              <w:spacing w:after="20"/>
+            </w:pPr>
+            <w:r>
+              <w:rPr>
+                <w:rFonts w:ascii="Consolas" w:hAnsi="Consolas"/>
+                <w:b w:val="0"/>
+                <w:color w:val="000000"/>
+                <w:sz w:val="16"/>
+              </w:rPr>
+              <w:t>total = points + bonus</w:t>
+            </w:r>
+          </w:p>
+          <w:p>
+            <w:pPr>
+              <w:spacing w:after="20"/>
+            </w:pPr>
+            <w:r>
+              <w:rPr>
+                <w:rFonts w:ascii="Consolas" w:hAnsi="Consolas"/>
+                <w:b w:val="0"/>
+                <w:color w:val="000000"/>
+                <w:sz w:val="16"/>
+              </w:rPr>
+              <w:t># total is 9.5 and its type is float</w:t>
+            </w:r>
+          </w:p>
+        </w:tc>
+      </w:tr>
+    </w:tbl>
+    <w:p>
+      <w:pPr>
+        <w:spacing w:after="60"/>
+      </w:pPr>
+    </w:p>
+    <w:tbl>
+      <w:tblPr>
+        <w:tblW w:type="auto" w:w="0"/>
+        <w:tblLayout w:type="fixed"/>
+        <w:tblLook w:firstColumn="1" w:firstRow="1" w:lastColumn="0" w:lastRow="0" w:noHBand="0" w:noVBand="1" w:val="04A0"/>
+      </w:tblPr>
+      <w:tblGrid>
+        <w:gridCol w:w="6480"/>
+      </w:tblGrid>
+      <w:tr>
+        <w:tc>
+          <w:tcPr>
+            <w:tcW w:type="dxa" w:w="6538"/>
+            <w:shd w:fill="F5F5F5"/>
+          </w:tcPr>
+          <w:p>
+            <w:pPr>
+              <w:spacing w:after="60"/>
+            </w:pPr>
+            <w:r>
+              <w:rPr>
+                <w:rFonts w:ascii="Aptos" w:hAnsi="Aptos"/>
+                <w:b/>
+                <w:color w:val="000000"/>
+                <w:sz w:val="20"/>
+              </w:rPr>
+              <w:t>String versus number</w:t>
+            </w:r>
+          </w:p>
+          <w:p>
+            <w:pPr>
+              <w:spacing w:after="20"/>
+            </w:pPr>
+            <w:r>
+              <w:rPr>
+                <w:rFonts w:ascii="Consolas" w:hAnsi="Consolas"/>
+                <w:b w:val="0"/>
+                <w:color w:val="000000"/>
+                <w:sz w:val="16"/>
+              </w:rPr>
+              <w:t>text = "12"</w:t>
+            </w:r>
+          </w:p>
+          <w:p>
+            <w:pPr>
+              <w:spacing w:after="20"/>
+            </w:pPr>
+            <w:r>
+              <w:rPr>
+                <w:rFonts w:ascii="Consolas" w:hAnsi="Consolas"/>
+                <w:b w:val="0"/>
+                <w:color w:val="000000"/>
+                <w:sz w:val="16"/>
+              </w:rPr>
+              <w:t>number = int(text)</w:t>
+            </w:r>
+          </w:p>
+          <w:p>
+            <w:pPr>
+              <w:spacing w:after="20"/>
+            </w:pPr>
+            <w:r>
+              <w:rPr>
+                <w:rFonts w:ascii="Consolas" w:hAnsi="Consolas"/>
+                <w:b w:val="0"/>
+                <w:color w:val="000000"/>
+                <w:sz w:val="16"/>
+              </w:rPr>
+              <w:t>result = number + 3</w:t>
+            </w:r>
+          </w:p>
+          <w:p>
+            <w:pPr>
+              <w:spacing w:after="20"/>
+            </w:pPr>
+            <w:r>
+              <w:rPr>
+                <w:rFonts w:ascii="Consolas" w:hAnsi="Consolas"/>
+                <w:b w:val="0"/>
+                <w:color w:val="000000"/>
+                <w:sz w:val="16"/>
+              </w:rPr>
+              <w:t># result is 15, not '123'</w:t>
+            </w:r>
+          </w:p>
+        </w:tc>
+      </w:tr>
+    </w:tbl>
+    <w:p>
+      <w:pPr>
+        <w:spacing w:after="60"/>
+      </w:pPr>
+    </w:p>
+    <w:tbl>
+      <w:tblPr>
+        <w:tblW w:type="auto" w:w="0"/>
+        <w:tblLayout w:type="fixed"/>
+        <w:tblLook w:firstColumn="1" w:firstRow="1" w:lastColumn="0" w:lastRow="0" w:noHBand="0" w:noVBand="1" w:val="04A0"/>
+      </w:tblPr>
+      <w:tblGrid>
+        <w:gridCol w:w="6480"/>
+      </w:tblGrid>
+      <w:tr>
+        <w:tc>
+          <w:tcPr>
+            <w:tcW w:type="dxa" w:w="6538"/>
+            <w:shd w:fill="F5F5F5"/>
+          </w:tcPr>
+          <w:p>
+            <w:pPr>
+              <w:spacing w:after="60"/>
+            </w:pPr>
+            <w:r>
+              <w:rPr>
+                <w:rFonts w:ascii="Aptos" w:hAnsi="Aptos"/>
+                <w:b/>
+                <w:color w:val="000000"/>
+                <w:sz w:val="20"/>
+              </w:rPr>
+              <w:t>Boolean result</w:t>
+            </w:r>
+          </w:p>
+          <w:p>
+            <w:pPr>
+              <w:spacing w:after="20"/>
+            </w:pPr>
+            <w:r>
+              <w:rPr>
+                <w:rFonts w:ascii="Consolas" w:hAnsi="Consolas"/>
+                <w:b w:val="0"/>
+                <w:color w:val="000000"/>
+                <w:sz w:val="16"/>
+              </w:rPr>
+              <w:t>temperature = 72</w:t>
+            </w:r>
+          </w:p>
+          <w:p>
+            <w:pPr>
+              <w:spacing w:after="20"/>
+            </w:pPr>
+            <w:r>
+              <w:rPr>
+                <w:rFonts w:ascii="Consolas" w:hAnsi="Consolas"/>
+                <w:b w:val="0"/>
+                <w:color w:val="000000"/>
+                <w:sz w:val="16"/>
+              </w:rPr>
+              <w:t>is_warm = temperature &gt;= 70</w:t>
+            </w:r>
+          </w:p>
+          <w:p>
+            <w:pPr>
+              <w:spacing w:after="20"/>
+            </w:pPr>
+            <w:r>
+              <w:rPr>
+                <w:rFonts w:ascii="Consolas" w:hAnsi="Consolas"/>
+                <w:b w:val="0"/>
+                <w:color w:val="000000"/>
+                <w:sz w:val="16"/>
+              </w:rPr>
+              <w:t># is_warm is True and its type is bool</w:t>
+            </w:r>
+          </w:p>
+        </w:tc>
+      </w:tr>
+    </w:tbl>
+    <w:p>
+      <w:pPr>
+        <w:spacing w:after="60"/>
+      </w:pPr>
+    </w:p>
+    <w:tbl>
+      <w:tblPr>
+        <w:tblW w:type="auto" w:w="0"/>
+        <w:tblLayout w:type="fixed"/>
+        <w:tblLook w:firstColumn="1" w:firstRow="1" w:lastColumn="0" w:lastRow="0" w:noHBand="0" w:noVBand="1" w:val="04A0"/>
+      </w:tblPr>
+      <w:tblGrid>
+        <w:gridCol w:w="6480"/>
+      </w:tblGrid>
+      <w:tr>
+        <w:tc>
+          <w:tcPr>
+            <w:tcW w:type="dxa" w:w="6538"/>
+            <w:shd w:fill="F5F5F5"/>
+          </w:tcPr>
+          <w:p>
+            <w:pPr>
+              <w:spacing w:after="60"/>
+            </w:pPr>
+            <w:r>
+              <w:rPr>
+                <w:rFonts w:ascii="Aptos" w:hAnsi="Aptos"/>
+                <w:b/>
+                <w:color w:val="000000"/>
+                <w:sz w:val="20"/>
+              </w:rPr>
+              <w:t>None result</w:t>
+            </w:r>
+          </w:p>
+          <w:p>
+            <w:pPr>
+              <w:spacing w:after="20"/>
+            </w:pPr>
+            <w:r>
+              <w:rPr>
+                <w:rFonts w:ascii="Consolas" w:hAnsi="Consolas"/>
+                <w:b w:val="0"/>
+                <w:color w:val="000000"/>
+                <w:sz w:val="16"/>
+              </w:rPr>
+              <w:t>def show_score(score):</w:t>
+            </w:r>
+          </w:p>
+          <w:p>
+            <w:pPr>
+              <w:spacing w:after="20"/>
+            </w:pPr>
+            <w:r>
+              <w:rPr>
+                <w:rFonts w:ascii="Consolas" w:hAnsi="Consolas"/>
+                <w:b w:val="0"/>
+                <w:color w:val="000000"/>
+                <w:sz w:val="16"/>
+              </w:rPr>
+              <w:t xml:space="preserve">    print(score)</w:t>
+            </w:r>
+          </w:p>
+          <w:p>
+            <w:pPr>
+              <w:spacing w:after="20"/>
+            </w:pPr>
+            <w:r>
+              <w:rPr>
+                <w:rFonts w:ascii="Consolas" w:hAnsi="Consolas"/>
+                <w:b w:val="0"/>
+                <w:color w:val="000000"/>
+                <w:sz w:val="16"/>
+              </w:rPr>
+            </w:r>
+          </w:p>
+          <w:p>
+            <w:pPr>
+              <w:spacing w:after="20"/>
+            </w:pPr>
+            <w:r>
+              <w:rPr>
+                <w:rFonts w:ascii="Consolas" w:hAnsi="Consolas"/>
+                <w:b w:val="0"/>
+                <w:color w:val="000000"/>
+                <w:sz w:val="16"/>
+              </w:rPr>
+              <w:t>value = show_score(10)</w:t>
+            </w:r>
+          </w:p>
+          <w:p>
+            <w:pPr>
+              <w:spacing w:after="20"/>
+            </w:pPr>
+            <w:r>
+              <w:rPr>
+                <w:rFonts w:ascii="Consolas" w:hAnsi="Consolas"/>
+                <w:b w:val="0"/>
+                <w:color w:val="000000"/>
+                <w:sz w:val="16"/>
+              </w:rPr>
+              <w:t># value is None because there is no return</w:t>
+            </w:r>
+          </w:p>
+        </w:tc>
+      </w:tr>
+    </w:tbl>
+    <w:p>
+      <w:pPr>
+        <w:spacing w:after="60"/>
+      </w:pPr>
+    </w:p>
+    <w:p>
+      <w:pPr>
+        <w:jc w:val="right"/>
+      </w:pPr>
+      <w:r>
+        <w:rPr>
+          <w:rFonts w:ascii="Aptos" w:hAnsi="Aptos"/>
+          <w:b/>
+          <w:color w:val="444444"/>
+          <w:sz w:val="15"/>
+        </w:rPr>
+        <w:t>PYTHON FIELD GUIDE   28</w:t>
+      </w:r>
+    </w:p>
+    <w:p>
+      <w:r>
+        <w:br w:type="page"/>
+      </w:r>
+    </w:p>
+    <w:p>
+      <w:pPr>
+        <w:pStyle w:val="Title"/>
+        <w:spacing w:after="40"/>
+        <w:jc w:val="left"/>
+      </w:pPr>
+      <w:r>
+        <w:rPr>
+          <w:rFonts w:ascii="Aptos" w:hAnsi="Aptos"/>
+          <w:b/>
+          <w:color w:val="000000"/>
+          <w:sz w:val="40"/>
+        </w:rPr>
+        <w:t>Worked decision examples</w:t>
+      </w:r>
+    </w:p>
+    <w:p>
+      <w:pPr>
+        <w:spacing w:after="180"/>
+      </w:pPr>
+      <w:r>
+        <w:rPr>
+          <w:rFonts w:ascii="Aptos" w:hAnsi="Aptos"/>
+          <w:b w:val="0"/>
+          <w:color w:val="444444"/>
+          <w:sz w:val="20"/>
+        </w:rPr>
+        <w:t>Trace which branch executes and why</w:t>
+      </w:r>
+    </w:p>
+    <w:tbl>
+      <w:tblPr>
+        <w:tblW w:type="auto" w:w="0"/>
+        <w:tblLayout w:type="fixed"/>
+        <w:tblLook w:firstColumn="1" w:firstRow="1" w:lastColumn="0" w:lastRow="0" w:noHBand="0" w:noVBand="1" w:val="04A0"/>
+      </w:tblPr>
+      <w:tblGrid>
+        <w:gridCol w:w="6480"/>
+      </w:tblGrid>
+      <w:tr>
+        <w:tc>
+          <w:tcPr>
+            <w:tcW w:type="dxa" w:w="6538"/>
+            <w:shd w:fill="F5F5F5"/>
+          </w:tcPr>
+          <w:p>
+            <w:pPr>
+              <w:spacing w:after="60"/>
+            </w:pPr>
+            <w:r>
+              <w:rPr>
+                <w:rFonts w:ascii="Aptos" w:hAnsi="Aptos"/>
+                <w:b/>
+                <w:color w:val="000000"/>
+                <w:sz w:val="20"/>
+              </w:rPr>
+              <w:t>One comparison</w:t>
+            </w:r>
+          </w:p>
+          <w:p>
+            <w:pPr>
+              <w:spacing w:after="20"/>
+            </w:pPr>
+            <w:r>
+              <w:rPr>
+                <w:rFonts w:ascii="Consolas" w:hAnsi="Consolas"/>
+                <w:b w:val="0"/>
+                <w:color w:val="000000"/>
+                <w:sz w:val="16"/>
+              </w:rPr>
+              <w:t>coins = 8</w:t>
+            </w:r>
+          </w:p>
+          <w:p>
+            <w:pPr>
+              <w:spacing w:after="20"/>
+            </w:pPr>
+            <w:r>
+              <w:rPr>
+                <w:rFonts w:ascii="Consolas" w:hAnsi="Consolas"/>
+                <w:b w:val="0"/>
+                <w:color w:val="000000"/>
+                <w:sz w:val="16"/>
+              </w:rPr>
+              <w:t>if coins &gt;= 10:</w:t>
+            </w:r>
+          </w:p>
+          <w:p>
+            <w:pPr>
+              <w:spacing w:after="20"/>
+            </w:pPr>
+            <w:r>
+              <w:rPr>
+                <w:rFonts w:ascii="Consolas" w:hAnsi="Consolas"/>
+                <w:b w:val="0"/>
+                <w:color w:val="000000"/>
+                <w:sz w:val="16"/>
+              </w:rPr>
+              <w:t xml:space="preserve">    message = "1-UP"</w:t>
+            </w:r>
+          </w:p>
+          <w:p>
+            <w:pPr>
+              <w:spacing w:after="20"/>
+            </w:pPr>
+            <w:r>
+              <w:rPr>
+                <w:rFonts w:ascii="Consolas" w:hAnsi="Consolas"/>
+                <w:b w:val="0"/>
+                <w:color w:val="000000"/>
+                <w:sz w:val="16"/>
+              </w:rPr>
+              <w:t>else:</w:t>
+            </w:r>
+          </w:p>
+          <w:p>
+            <w:pPr>
+              <w:spacing w:after="20"/>
+            </w:pPr>
+            <w:r>
+              <w:rPr>
+                <w:rFonts w:ascii="Consolas" w:hAnsi="Consolas"/>
+                <w:b w:val="0"/>
+                <w:color w:val="000000"/>
+                <w:sz w:val="16"/>
+              </w:rPr>
+              <w:t xml:space="preserve">    message = "Keep going"</w:t>
+            </w:r>
+          </w:p>
+          <w:p>
+            <w:pPr>
+              <w:spacing w:after="20"/>
+            </w:pPr>
+            <w:r>
+              <w:rPr>
+                <w:rFonts w:ascii="Consolas" w:hAnsi="Consolas"/>
+                <w:b w:val="0"/>
+                <w:color w:val="000000"/>
+                <w:sz w:val="16"/>
+              </w:rPr>
+              <w:t># message is 'Keep going'</w:t>
+            </w:r>
+          </w:p>
+        </w:tc>
+      </w:tr>
+    </w:tbl>
+    <w:p>
+      <w:pPr>
+        <w:spacing w:after="60"/>
+      </w:pPr>
+    </w:p>
+    <w:tbl>
+      <w:tblPr>
+        <w:tblW w:type="auto" w:w="0"/>
+        <w:tblLayout w:type="fixed"/>
+        <w:tblLook w:firstColumn="1" w:firstRow="1" w:lastColumn="0" w:lastRow="0" w:noHBand="0" w:noVBand="1" w:val="04A0"/>
+      </w:tblPr>
+      <w:tblGrid>
+        <w:gridCol w:w="6480"/>
+      </w:tblGrid>
+      <w:tr>
+        <w:tc>
+          <w:tcPr>
+            <w:tcW w:type="dxa" w:w="6538"/>
+            <w:shd w:fill="F5F5F5"/>
+          </w:tcPr>
+          <w:p>
+            <w:pPr>
+              <w:spacing w:after="60"/>
+            </w:pPr>
+            <w:r>
+              <w:rPr>
+                <w:rFonts w:ascii="Aptos" w:hAnsi="Aptos"/>
+                <w:b/>
+                <w:color w:val="000000"/>
+                <w:sz w:val="20"/>
+              </w:rPr>
+              <w:t>Combined logic</w:t>
+            </w:r>
+          </w:p>
+          <w:p>
+            <w:pPr>
+              <w:spacing w:after="20"/>
+            </w:pPr>
+            <w:r>
+              <w:rPr>
+                <w:rFonts w:ascii="Consolas" w:hAnsi="Consolas"/>
+                <w:b w:val="0"/>
+                <w:color w:val="000000"/>
+                <w:sz w:val="16"/>
+              </w:rPr>
+              <w:t>has_key = True</w:t>
+            </w:r>
+          </w:p>
+          <w:p>
+            <w:pPr>
+              <w:spacing w:after="20"/>
+            </w:pPr>
+            <w:r>
+              <w:rPr>
+                <w:rFonts w:ascii="Consolas" w:hAnsi="Consolas"/>
+                <w:b w:val="0"/>
+                <w:color w:val="000000"/>
+                <w:sz w:val="16"/>
+              </w:rPr>
+              <w:t>door_locked = True</w:t>
+            </w:r>
+          </w:p>
+          <w:p>
+            <w:pPr>
+              <w:spacing w:after="20"/>
+            </w:pPr>
+            <w:r>
+              <w:rPr>
+                <w:rFonts w:ascii="Consolas" w:hAnsi="Consolas"/>
+                <w:b w:val="0"/>
+                <w:color w:val="000000"/>
+                <w:sz w:val="16"/>
+              </w:rPr>
+              <w:t>if has_key and door_locked:</w:t>
+            </w:r>
+          </w:p>
+          <w:p>
+            <w:pPr>
+              <w:spacing w:after="20"/>
+            </w:pPr>
+            <w:r>
+              <w:rPr>
+                <w:rFonts w:ascii="Consolas" w:hAnsi="Consolas"/>
+                <w:b w:val="0"/>
+                <w:color w:val="000000"/>
+                <w:sz w:val="16"/>
+              </w:rPr>
+              <w:t xml:space="preserve">    can_enter = True</w:t>
+            </w:r>
+          </w:p>
+          <w:p>
+            <w:pPr>
+              <w:spacing w:after="20"/>
+            </w:pPr>
+            <w:r>
+              <w:rPr>
+                <w:rFonts w:ascii="Consolas" w:hAnsi="Consolas"/>
+                <w:b w:val="0"/>
+                <w:color w:val="000000"/>
+                <w:sz w:val="16"/>
+              </w:rPr>
+              <w:t># can_enter becomes True</w:t>
+            </w:r>
+          </w:p>
+        </w:tc>
+      </w:tr>
+    </w:tbl>
+    <w:p>
+      <w:pPr>
+        <w:spacing w:after="60"/>
+      </w:pPr>
+    </w:p>
+    <w:tbl>
+      <w:tblPr>
+        <w:tblW w:type="auto" w:w="0"/>
+        <w:tblLayout w:type="fixed"/>
+        <w:tblLook w:firstColumn="1" w:firstRow="1" w:lastColumn="0" w:lastRow="0" w:noHBand="0" w:noVBand="1" w:val="04A0"/>
+      </w:tblPr>
+      <w:tblGrid>
+        <w:gridCol w:w="6480"/>
+      </w:tblGrid>
+      <w:tr>
+        <w:tc>
+          <w:tcPr>
+            <w:tcW w:type="dxa" w:w="6538"/>
+            <w:shd w:fill="F5F5F5"/>
+          </w:tcPr>
+          <w:p>
+            <w:pPr>
+              <w:spacing w:after="60"/>
+            </w:pPr>
+            <w:r>
+              <w:rPr>
+                <w:rFonts w:ascii="Aptos" w:hAnsi="Aptos"/>
+                <w:b/>
+                <w:color w:val="000000"/>
+                <w:sz w:val="20"/>
+              </w:rPr>
+              <w:t>Order of branches</w:t>
+            </w:r>
+          </w:p>
+          <w:p>
+            <w:pPr>
+              <w:spacing w:after="20"/>
+            </w:pPr>
+            <w:r>
+              <w:rPr>
+                <w:rFonts w:ascii="Consolas" w:hAnsi="Consolas"/>
+                <w:b w:val="0"/>
+                <w:color w:val="000000"/>
+                <w:sz w:val="16"/>
+              </w:rPr>
+              <w:t>score = 95</w:t>
+            </w:r>
+          </w:p>
+          <w:p>
+            <w:pPr>
+              <w:spacing w:after="20"/>
+            </w:pPr>
+            <w:r>
+              <w:rPr>
+                <w:rFonts w:ascii="Consolas" w:hAnsi="Consolas"/>
+                <w:b w:val="0"/>
+                <w:color w:val="000000"/>
+                <w:sz w:val="16"/>
+              </w:rPr>
+              <w:t>if score &gt;= 90:</w:t>
+            </w:r>
+          </w:p>
+          <w:p>
+            <w:pPr>
+              <w:spacing w:after="20"/>
+            </w:pPr>
+            <w:r>
+              <w:rPr>
+                <w:rFonts w:ascii="Consolas" w:hAnsi="Consolas"/>
+                <w:b w:val="0"/>
+                <w:color w:val="000000"/>
+                <w:sz w:val="16"/>
+              </w:rPr>
+              <w:t xml:space="preserve">    grade = "A"</w:t>
+            </w:r>
+          </w:p>
+          <w:p>
+            <w:pPr>
+              <w:spacing w:after="20"/>
+            </w:pPr>
+            <w:r>
+              <w:rPr>
+                <w:rFonts w:ascii="Consolas" w:hAnsi="Consolas"/>
+                <w:b w:val="0"/>
+                <w:color w:val="000000"/>
+                <w:sz w:val="16"/>
+              </w:rPr>
+              <w:t>elif score &gt;= 80:</w:t>
+            </w:r>
+          </w:p>
+          <w:p>
+            <w:pPr>
+              <w:spacing w:after="20"/>
+            </w:pPr>
+            <w:r>
+              <w:rPr>
+                <w:rFonts w:ascii="Consolas" w:hAnsi="Consolas"/>
+                <w:b w:val="0"/>
+                <w:color w:val="000000"/>
+                <w:sz w:val="16"/>
+              </w:rPr>
+              <w:t xml:space="preserve">    grade = "B"</w:t>
+            </w:r>
+          </w:p>
+          <w:p>
+            <w:pPr>
+              <w:spacing w:after="20"/>
+            </w:pPr>
+            <w:r>
+              <w:rPr>
+                <w:rFonts w:ascii="Consolas" w:hAnsi="Consolas"/>
+                <w:b w:val="0"/>
+                <w:color w:val="000000"/>
+                <w:sz w:val="16"/>
+              </w:rPr>
+              <w:t># grade is 'A'; Python stops after the first match</w:t>
+            </w:r>
+          </w:p>
+        </w:tc>
+      </w:tr>
+    </w:tbl>
+    <w:p>
+      <w:pPr>
+        <w:spacing w:after="60"/>
+      </w:pPr>
+    </w:p>
+    <w:tbl>
+      <w:tblPr>
+        <w:tblW w:type="auto" w:w="0"/>
+        <w:tblLayout w:type="fixed"/>
+        <w:tblLook w:firstColumn="1" w:firstRow="1" w:lastColumn="0" w:lastRow="0" w:noHBand="0" w:noVBand="1" w:val="04A0"/>
+      </w:tblPr>
+      <w:tblGrid>
+        <w:gridCol w:w="6480"/>
+      </w:tblGrid>
+      <w:tr>
+        <w:tc>
+          <w:tcPr>
+            <w:tcW w:type="dxa" w:w="6538"/>
+            <w:shd w:fill="F5F5F5"/>
+          </w:tcPr>
+          <w:p>
+            <w:pPr>
+              <w:spacing w:after="60"/>
+            </w:pPr>
+            <w:r>
+              <w:rPr>
+                <w:rFonts w:ascii="Aptos" w:hAnsi="Aptos"/>
+                <w:b/>
+                <w:color w:val="000000"/>
+                <w:sz w:val="20"/>
+              </w:rPr>
+              <w:t>Truthiness</w:t>
+            </w:r>
+          </w:p>
+          <w:p>
+            <w:pPr>
+              <w:spacing w:after="20"/>
+            </w:pPr>
+            <w:r>
+              <w:rPr>
+                <w:rFonts w:ascii="Consolas" w:hAnsi="Consolas"/>
+                <w:b w:val="0"/>
+                <w:color w:val="000000"/>
+                <w:sz w:val="16"/>
+              </w:rPr>
+              <w:t>items = []</w:t>
+            </w:r>
+          </w:p>
+          <w:p>
+            <w:pPr>
+              <w:spacing w:after="20"/>
+            </w:pPr>
+            <w:r>
+              <w:rPr>
+                <w:rFonts w:ascii="Consolas" w:hAnsi="Consolas"/>
+                <w:b w:val="0"/>
+                <w:color w:val="000000"/>
+                <w:sz w:val="16"/>
+              </w:rPr>
+              <w:t>if items:</w:t>
+            </w:r>
+          </w:p>
+          <w:p>
+            <w:pPr>
+              <w:spacing w:after="20"/>
+            </w:pPr>
+            <w:r>
+              <w:rPr>
+                <w:rFonts w:ascii="Consolas" w:hAnsi="Consolas"/>
+                <w:b w:val="0"/>
+                <w:color w:val="000000"/>
+                <w:sz w:val="16"/>
+              </w:rPr>
+              <w:t xml:space="preserve">    message = "Items found"</w:t>
+            </w:r>
+          </w:p>
+          <w:p>
+            <w:pPr>
+              <w:spacing w:after="20"/>
+            </w:pPr>
+            <w:r>
+              <w:rPr>
+                <w:rFonts w:ascii="Consolas" w:hAnsi="Consolas"/>
+                <w:b w:val="0"/>
+                <w:color w:val="000000"/>
+                <w:sz w:val="16"/>
+              </w:rPr>
+              <w:t>else:</w:t>
+            </w:r>
+          </w:p>
+          <w:p>
+            <w:pPr>
+              <w:spacing w:after="20"/>
+            </w:pPr>
+            <w:r>
+              <w:rPr>
+                <w:rFonts w:ascii="Consolas" w:hAnsi="Consolas"/>
+                <w:b w:val="0"/>
+                <w:color w:val="000000"/>
+                <w:sz w:val="16"/>
+              </w:rPr>
+              <w:t xml:space="preserve">    message = "Empty"</w:t>
+            </w:r>
+          </w:p>
+          <w:p>
+            <w:pPr>
+              <w:spacing w:after="20"/>
+            </w:pPr>
+            <w:r>
+              <w:rPr>
+                <w:rFonts w:ascii="Consolas" w:hAnsi="Consolas"/>
+                <w:b w:val="0"/>
+                <w:color w:val="000000"/>
+                <w:sz w:val="16"/>
+              </w:rPr>
+              <w:t># an empty list acts False, so message is 'Empty'</w:t>
+            </w:r>
+          </w:p>
+        </w:tc>
+      </w:tr>
+    </w:tbl>
+    <w:p>
+      <w:pPr>
+        <w:spacing w:after="60"/>
+      </w:pPr>
+    </w:p>
+    <w:p>
+      <w:pPr>
+        <w:jc w:val="right"/>
+      </w:pPr>
+      <w:r>
+        <w:rPr>
+          <w:rFonts w:ascii="Aptos" w:hAnsi="Aptos"/>
+          <w:b/>
+          <w:color w:val="444444"/>
+          <w:sz w:val="15"/>
+        </w:rPr>
+        <w:t>PYTHON FIELD GUIDE   29</w:t>
+      </w:r>
+    </w:p>
+    <w:p>
+      <w:r>
+        <w:br w:type="page"/>
+      </w:r>
+    </w:p>
+    <w:p>
+      <w:pPr>
+        <w:pStyle w:val="Title"/>
+        <w:spacing w:after="40"/>
+        <w:jc w:val="left"/>
+      </w:pPr>
+      <w:r>
+        <w:rPr>
+          <w:rFonts w:ascii="Aptos" w:hAnsi="Aptos"/>
+          <w:b/>
+          <w:color w:val="000000"/>
+          <w:sz w:val="40"/>
+        </w:rPr>
+        <w:t>Worked loop examples</w:t>
+      </w:r>
+    </w:p>
+    <w:p>
+      <w:pPr>
+        <w:spacing w:after="180"/>
+      </w:pPr>
+      <w:r>
+        <w:rPr>
+          <w:rFonts w:ascii="Aptos" w:hAnsi="Aptos"/>
+          <w:b w:val="0"/>
+          <w:color w:val="444444"/>
+          <w:sz w:val="20"/>
+        </w:rPr>
+        <w:t>Follow the changing value after each iteration</w:t>
+      </w:r>
+    </w:p>
+    <w:tbl>
+      <w:tblPr>
+        <w:tblW w:type="auto" w:w="0"/>
+        <w:tblLayout w:type="fixed"/>
+        <w:tblLook w:firstColumn="1" w:firstRow="1" w:lastColumn="0" w:lastRow="0" w:noHBand="0" w:noVBand="1" w:val="04A0"/>
+      </w:tblPr>
+      <w:tblGrid>
+        <w:gridCol w:w="6480"/>
+      </w:tblGrid>
+      <w:tr>
+        <w:tc>
+          <w:tcPr>
+            <w:tcW w:type="dxa" w:w="6538"/>
+            <w:shd w:fill="F5F5F5"/>
+          </w:tcPr>
+          <w:p>
+            <w:pPr>
+              <w:spacing w:after="60"/>
+            </w:pPr>
+            <w:r>
+              <w:rPr>
+                <w:rFonts w:ascii="Aptos" w:hAnsi="Aptos"/>
+                <w:b/>
+                <w:color w:val="000000"/>
+                <w:sz w:val="20"/>
+              </w:rPr>
+              <w:t>Counter</w:t>
+            </w:r>
+          </w:p>
+          <w:p>
+            <w:pPr>
+              <w:spacing w:after="20"/>
+            </w:pPr>
+            <w:r>
+              <w:rPr>
+                <w:rFonts w:ascii="Consolas" w:hAnsi="Consolas"/>
+                <w:b w:val="0"/>
+                <w:color w:val="000000"/>
+                <w:sz w:val="16"/>
+              </w:rPr>
+              <w:t>count = 0</w:t>
+            </w:r>
+          </w:p>
+          <w:p>
+            <w:pPr>
+              <w:spacing w:after="20"/>
+            </w:pPr>
+            <w:r>
+              <w:rPr>
+                <w:rFonts w:ascii="Consolas" w:hAnsi="Consolas"/>
+                <w:b w:val="0"/>
+                <w:color w:val="000000"/>
+                <w:sz w:val="16"/>
+              </w:rPr>
+              <w:t>for name in ["Ana", "Bo", "Cam"]:</w:t>
+            </w:r>
+          </w:p>
+          <w:p>
+            <w:pPr>
+              <w:spacing w:after="20"/>
+            </w:pPr>
+            <w:r>
+              <w:rPr>
+                <w:rFonts w:ascii="Consolas" w:hAnsi="Consolas"/>
+                <w:b w:val="0"/>
+                <w:color w:val="000000"/>
+                <w:sz w:val="16"/>
+              </w:rPr>
+              <w:t xml:space="preserve">    count += 1</w:t>
+            </w:r>
+          </w:p>
+          <w:p>
+            <w:pPr>
+              <w:spacing w:after="20"/>
+            </w:pPr>
+            <w:r>
+              <w:rPr>
+                <w:rFonts w:ascii="Consolas" w:hAnsi="Consolas"/>
+                <w:b w:val="0"/>
+                <w:color w:val="000000"/>
+                <w:sz w:val="16"/>
+              </w:rPr>
+              <w:t># count changes 0 -&gt; 1 -&gt; 2 -&gt; 3</w:t>
+            </w:r>
+          </w:p>
+        </w:tc>
+      </w:tr>
+    </w:tbl>
+    <w:p>
+      <w:pPr>
+        <w:spacing w:after="60"/>
+      </w:pPr>
+    </w:p>
+    <w:tbl>
+      <w:tblPr>
+        <w:tblW w:type="auto" w:w="0"/>
+        <w:tblLayout w:type="fixed"/>
+        <w:tblLook w:firstColumn="1" w:firstRow="1" w:lastColumn="0" w:lastRow="0" w:noHBand="0" w:noVBand="1" w:val="04A0"/>
+      </w:tblPr>
+      <w:tblGrid>
+        <w:gridCol w:w="6480"/>
+      </w:tblGrid>
+      <w:tr>
+        <w:tc>
+          <w:tcPr>
+            <w:tcW w:type="dxa" w:w="6538"/>
+            <w:shd w:fill="F5F5F5"/>
+          </w:tcPr>
+          <w:p>
+            <w:pPr>
+              <w:spacing w:after="60"/>
+            </w:pPr>
+            <w:r>
+              <w:rPr>
+                <w:rFonts w:ascii="Aptos" w:hAnsi="Aptos"/>
+                <w:b/>
+                <w:color w:val="000000"/>
+                <w:sz w:val="20"/>
+              </w:rPr>
+              <w:t>Accumulator</w:t>
+            </w:r>
+          </w:p>
+          <w:p>
+            <w:pPr>
+              <w:spacing w:after="20"/>
+            </w:pPr>
+            <w:r>
+              <w:rPr>
+                <w:rFonts w:ascii="Consolas" w:hAnsi="Consolas"/>
+                <w:b w:val="0"/>
+                <w:color w:val="000000"/>
+                <w:sz w:val="16"/>
+              </w:rPr>
+              <w:t>total = 0</w:t>
+            </w:r>
+          </w:p>
+          <w:p>
+            <w:pPr>
+              <w:spacing w:after="20"/>
+            </w:pPr>
+            <w:r>
+              <w:rPr>
+                <w:rFonts w:ascii="Consolas" w:hAnsi="Consolas"/>
+                <w:b w:val="0"/>
+                <w:color w:val="000000"/>
+                <w:sz w:val="16"/>
+              </w:rPr>
+              <w:t>for value in [4, 6, 2]:</w:t>
+            </w:r>
+          </w:p>
+          <w:p>
+            <w:pPr>
+              <w:spacing w:after="20"/>
+            </w:pPr>
+            <w:r>
+              <w:rPr>
+                <w:rFonts w:ascii="Consolas" w:hAnsi="Consolas"/>
+                <w:b w:val="0"/>
+                <w:color w:val="000000"/>
+                <w:sz w:val="16"/>
+              </w:rPr>
+              <w:t xml:space="preserve">    total += value</w:t>
+            </w:r>
+          </w:p>
+          <w:p>
+            <w:pPr>
+              <w:spacing w:after="20"/>
+            </w:pPr>
+            <w:r>
+              <w:rPr>
+                <w:rFonts w:ascii="Consolas" w:hAnsi="Consolas"/>
+                <w:b w:val="0"/>
+                <w:color w:val="000000"/>
+                <w:sz w:val="16"/>
+              </w:rPr>
+              <w:t># total changes 0 -&gt; 4 -&gt; 10 -&gt; 12</w:t>
+            </w:r>
+          </w:p>
+        </w:tc>
+      </w:tr>
+    </w:tbl>
+    <w:p>
+      <w:pPr>
+        <w:spacing w:after="60"/>
+      </w:pPr>
+    </w:p>
+    <w:tbl>
+      <w:tblPr>
+        <w:tblW w:type="auto" w:w="0"/>
+        <w:tblLayout w:type="fixed"/>
+        <w:tblLook w:firstColumn="1" w:firstRow="1" w:lastColumn="0" w:lastRow="0" w:noHBand="0" w:noVBand="1" w:val="04A0"/>
+      </w:tblPr>
+      <w:tblGrid>
+        <w:gridCol w:w="6480"/>
+      </w:tblGrid>
+      <w:tr>
+        <w:tc>
+          <w:tcPr>
+            <w:tcW w:type="dxa" w:w="6538"/>
+            <w:shd w:fill="F5F5F5"/>
+          </w:tcPr>
+          <w:p>
+            <w:pPr>
+              <w:spacing w:after="60"/>
+            </w:pPr>
+            <w:r>
+              <w:rPr>
+                <w:rFonts w:ascii="Aptos" w:hAnsi="Aptos"/>
+                <w:b/>
+                <w:color w:val="000000"/>
+                <w:sz w:val="20"/>
+              </w:rPr>
+              <w:t>Build a list</w:t>
+            </w:r>
+          </w:p>
+          <w:p>
+            <w:pPr>
+              <w:spacing w:after="20"/>
+            </w:pPr>
+            <w:r>
+              <w:rPr>
+                <w:rFonts w:ascii="Consolas" w:hAnsi="Consolas"/>
+                <w:b w:val="0"/>
+                <w:color w:val="000000"/>
+                <w:sz w:val="16"/>
+              </w:rPr>
+              <w:t>doubles = []</w:t>
+            </w:r>
+          </w:p>
+          <w:p>
+            <w:pPr>
+              <w:spacing w:after="20"/>
+            </w:pPr>
+            <w:r>
+              <w:rPr>
+                <w:rFonts w:ascii="Consolas" w:hAnsi="Consolas"/>
+                <w:b w:val="0"/>
+                <w:color w:val="000000"/>
+                <w:sz w:val="16"/>
+              </w:rPr>
+              <w:t>for number in range(1, 4):</w:t>
+            </w:r>
+          </w:p>
+          <w:p>
+            <w:pPr>
+              <w:spacing w:after="20"/>
+            </w:pPr>
+            <w:r>
+              <w:rPr>
+                <w:rFonts w:ascii="Consolas" w:hAnsi="Consolas"/>
+                <w:b w:val="0"/>
+                <w:color w:val="000000"/>
+                <w:sz w:val="16"/>
+              </w:rPr>
+              <w:t xml:space="preserve">    doubles.append(number * 2)</w:t>
+            </w:r>
+          </w:p>
+          <w:p>
+            <w:pPr>
+              <w:spacing w:after="20"/>
+            </w:pPr>
+            <w:r>
+              <w:rPr>
+                <w:rFonts w:ascii="Consolas" w:hAnsi="Consolas"/>
+                <w:b w:val="0"/>
+                <w:color w:val="000000"/>
+                <w:sz w:val="16"/>
+              </w:rPr>
+              <w:t># doubles becomes [2, 4, 6]</w:t>
+            </w:r>
+          </w:p>
+        </w:tc>
+      </w:tr>
+    </w:tbl>
+    <w:p>
+      <w:pPr>
+        <w:spacing w:after="60"/>
+      </w:pPr>
+    </w:p>
+    <w:tbl>
+      <w:tblPr>
+        <w:tblW w:type="auto" w:w="0"/>
+        <w:tblLayout w:type="fixed"/>
+        <w:tblLook w:firstColumn="1" w:firstRow="1" w:lastColumn="0" w:lastRow="0" w:noHBand="0" w:noVBand="1" w:val="04A0"/>
+      </w:tblPr>
+      <w:tblGrid>
+        <w:gridCol w:w="6480"/>
+      </w:tblGrid>
+      <w:tr>
+        <w:tc>
+          <w:tcPr>
+            <w:tcW w:type="dxa" w:w="6538"/>
+            <w:shd w:fill="F5F5F5"/>
+          </w:tcPr>
+          <w:p>
+            <w:pPr>
+              <w:spacing w:after="60"/>
+            </w:pPr>
+            <w:r>
+              <w:rPr>
+                <w:rFonts w:ascii="Aptos" w:hAnsi="Aptos"/>
+                <w:b/>
+                <w:color w:val="000000"/>
+                <w:sz w:val="20"/>
+              </w:rPr>
+              <w:t>While loop</w:t>
+            </w:r>
+          </w:p>
+          <w:p>
+            <w:pPr>
+              <w:spacing w:after="20"/>
+            </w:pPr>
+            <w:r>
+              <w:rPr>
+                <w:rFonts w:ascii="Consolas" w:hAnsi="Consolas"/>
+                <w:b w:val="0"/>
+                <w:color w:val="000000"/>
+                <w:sz w:val="16"/>
+              </w:rPr>
+              <w:t>energy = 3</w:t>
+            </w:r>
+          </w:p>
+          <w:p>
+            <w:pPr>
+              <w:spacing w:after="20"/>
+            </w:pPr>
+            <w:r>
+              <w:rPr>
+                <w:rFonts w:ascii="Consolas" w:hAnsi="Consolas"/>
+                <w:b w:val="0"/>
+                <w:color w:val="000000"/>
+                <w:sz w:val="16"/>
+              </w:rPr>
+              <w:t>while energy &gt; 0:</w:t>
+            </w:r>
+          </w:p>
+          <w:p>
+            <w:pPr>
+              <w:spacing w:after="20"/>
+            </w:pPr>
+            <w:r>
+              <w:rPr>
+                <w:rFonts w:ascii="Consolas" w:hAnsi="Consolas"/>
+                <w:b w:val="0"/>
+                <w:color w:val="000000"/>
+                <w:sz w:val="16"/>
+              </w:rPr>
+              <w:t xml:space="preserve">    energy -= 1</w:t>
+            </w:r>
+          </w:p>
+          <w:p>
+            <w:pPr>
+              <w:spacing w:after="20"/>
+            </w:pPr>
+            <w:r>
+              <w:rPr>
+                <w:rFonts w:ascii="Consolas" w:hAnsi="Consolas"/>
+                <w:b w:val="0"/>
+                <w:color w:val="000000"/>
+                <w:sz w:val="16"/>
+              </w:rPr>
+              <w:t># energy changes 3 -&gt; 2 -&gt; 1 -&gt; 0, then stops</w:t>
+            </w:r>
+          </w:p>
+        </w:tc>
+      </w:tr>
+    </w:tbl>
+    <w:p>
+      <w:pPr>
+        <w:spacing w:after="60"/>
+      </w:pPr>
+    </w:p>
+    <w:p>
+      <w:pPr>
+        <w:jc w:val="right"/>
+      </w:pPr>
+      <w:r>
+        <w:rPr>
+          <w:rFonts w:ascii="Aptos" w:hAnsi="Aptos"/>
+          <w:b/>
+          <w:color w:val="444444"/>
+          <w:sz w:val="15"/>
+        </w:rPr>
+        <w:t>PYTHON FIELD GUIDE   30</w:t>
+      </w:r>
+    </w:p>
+    <w:p>
+      <w:r>
+        <w:br w:type="page"/>
+      </w:r>
+    </w:p>
+    <w:p>
+      <w:pPr>
+        <w:pStyle w:val="Title"/>
+        <w:spacing w:after="40"/>
+        <w:jc w:val="left"/>
+      </w:pPr>
+      <w:r>
+        <w:rPr>
+          <w:rFonts w:ascii="Aptos" w:hAnsi="Aptos"/>
+          <w:b/>
+          <w:color w:val="000000"/>
+          <w:sz w:val="40"/>
+        </w:rPr>
+        <w:t>Worked function examples</w:t>
+      </w:r>
+    </w:p>
+    <w:p>
+      <w:pPr>
+        <w:spacing w:after="180"/>
+      </w:pPr>
+      <w:r>
+        <w:rPr>
+          <w:rFonts w:ascii="Aptos" w:hAnsi="Aptos"/>
+          <w:b w:val="0"/>
+          <w:color w:val="444444"/>
+          <w:sz w:val="20"/>
+        </w:rPr>
+        <w:t>Connect arguments parameters return values and reuse</w:t>
+      </w:r>
+    </w:p>
+    <w:tbl>
+      <w:tblPr>
+        <w:tblW w:type="auto" w:w="0"/>
+        <w:tblLayout w:type="fixed"/>
+        <w:tblLook w:firstColumn="1" w:firstRow="1" w:lastColumn="0" w:lastRow="0" w:noHBand="0" w:noVBand="1" w:val="04A0"/>
+      </w:tblPr>
+      <w:tblGrid>
+        <w:gridCol w:w="6480"/>
+      </w:tblGrid>
+      <w:tr>
+        <w:tc>
+          <w:tcPr>
+            <w:tcW w:type="dxa" w:w="6538"/>
+            <w:shd w:fill="F5F5F5"/>
+          </w:tcPr>
+          <w:p>
+            <w:pPr>
+              <w:spacing w:after="60"/>
+            </w:pPr>
+            <w:r>
+              <w:rPr>
+                <w:rFonts w:ascii="Aptos" w:hAnsi="Aptos"/>
+                <w:b/>
+                <w:color w:val="000000"/>
+                <w:sz w:val="20"/>
+              </w:rPr>
+              <w:t>Return a calculation</w:t>
+            </w:r>
+          </w:p>
+          <w:p>
+            <w:pPr>
+              <w:spacing w:after="20"/>
+            </w:pPr>
+            <w:r>
+              <w:rPr>
+                <w:rFonts w:ascii="Consolas" w:hAnsi="Consolas"/>
+                <w:b w:val="0"/>
+                <w:color w:val="000000"/>
+                <w:sz w:val="16"/>
+              </w:rPr>
+              <w:t>def area(width, height):</w:t>
+            </w:r>
+          </w:p>
+          <w:p>
+            <w:pPr>
+              <w:spacing w:after="20"/>
+            </w:pPr>
+            <w:r>
+              <w:rPr>
+                <w:rFonts w:ascii="Consolas" w:hAnsi="Consolas"/>
+                <w:b w:val="0"/>
+                <w:color w:val="000000"/>
+                <w:sz w:val="16"/>
+              </w:rPr>
+              <w:t xml:space="preserve">    return width * height</w:t>
+            </w:r>
+          </w:p>
+          <w:p>
+            <w:pPr>
+              <w:spacing w:after="20"/>
+            </w:pPr>
+            <w:r>
+              <w:rPr>
+                <w:rFonts w:ascii="Consolas" w:hAnsi="Consolas"/>
+                <w:b w:val="0"/>
+                <w:color w:val="000000"/>
+                <w:sz w:val="16"/>
+              </w:rPr>
+            </w:r>
+          </w:p>
+          <w:p>
+            <w:pPr>
+              <w:spacing w:after="20"/>
+            </w:pPr>
+            <w:r>
+              <w:rPr>
+                <w:rFonts w:ascii="Consolas" w:hAnsi="Consolas"/>
+                <w:b w:val="0"/>
+                <w:color w:val="000000"/>
+                <w:sz w:val="16"/>
+              </w:rPr>
+              <w:t>room_area = area(4, 3)</w:t>
+            </w:r>
+          </w:p>
+          <w:p>
+            <w:pPr>
+              <w:spacing w:after="20"/>
+            </w:pPr>
+            <w:r>
+              <w:rPr>
+                <w:rFonts w:ascii="Consolas" w:hAnsi="Consolas"/>
+                <w:b w:val="0"/>
+                <w:color w:val="000000"/>
+                <w:sz w:val="16"/>
+              </w:rPr>
+              <w:t># width=4, height=3, room_area=12</w:t>
+            </w:r>
+          </w:p>
+        </w:tc>
+      </w:tr>
+    </w:tbl>
+    <w:p>
+      <w:pPr>
+        <w:spacing w:after="60"/>
+      </w:pPr>
+    </w:p>
+    <w:tbl>
+      <w:tblPr>
+        <w:tblW w:type="auto" w:w="0"/>
+        <w:tblLayout w:type="fixed"/>
+        <w:tblLook w:firstColumn="1" w:firstRow="1" w:lastColumn="0" w:lastRow="0" w:noHBand="0" w:noVBand="1" w:val="04A0"/>
+      </w:tblPr>
+      <w:tblGrid>
+        <w:gridCol w:w="6480"/>
+      </w:tblGrid>
+      <w:tr>
+        <w:tc>
+          <w:tcPr>
+            <w:tcW w:type="dxa" w:w="6538"/>
+            <w:shd w:fill="F5F5F5"/>
+          </w:tcPr>
+          <w:p>
+            <w:pPr>
+              <w:spacing w:after="60"/>
+            </w:pPr>
+            <w:r>
+              <w:rPr>
+                <w:rFonts w:ascii="Aptos" w:hAnsi="Aptos"/>
+                <w:b/>
+                <w:color w:val="000000"/>
+                <w:sz w:val="20"/>
+              </w:rPr>
+              <w:t>Use one function in another</w:t>
+            </w:r>
+          </w:p>
+          <w:p>
+            <w:pPr>
+              <w:spacing w:after="20"/>
+            </w:pPr>
+            <w:r>
+              <w:rPr>
+                <w:rFonts w:ascii="Consolas" w:hAnsi="Consolas"/>
+                <w:b w:val="0"/>
+                <w:color w:val="000000"/>
+                <w:sz w:val="16"/>
+              </w:rPr>
+              <w:t>def double(number):</w:t>
+            </w:r>
+          </w:p>
+          <w:p>
+            <w:pPr>
+              <w:spacing w:after="20"/>
+            </w:pPr>
+            <w:r>
+              <w:rPr>
+                <w:rFonts w:ascii="Consolas" w:hAnsi="Consolas"/>
+                <w:b w:val="0"/>
+                <w:color w:val="000000"/>
+                <w:sz w:val="16"/>
+              </w:rPr>
+              <w:t xml:space="preserve">    return number * 2</w:t>
+            </w:r>
+          </w:p>
+          <w:p>
+            <w:pPr>
+              <w:spacing w:after="20"/>
+            </w:pPr>
+            <w:r>
+              <w:rPr>
+                <w:rFonts w:ascii="Consolas" w:hAnsi="Consolas"/>
+                <w:b w:val="0"/>
+                <w:color w:val="000000"/>
+                <w:sz w:val="16"/>
+              </w:rPr>
+            </w:r>
+          </w:p>
+          <w:p>
+            <w:pPr>
+              <w:spacing w:after="20"/>
+            </w:pPr>
+            <w:r>
+              <w:rPr>
+                <w:rFonts w:ascii="Consolas" w:hAnsi="Consolas"/>
+                <w:b w:val="0"/>
+                <w:color w:val="000000"/>
+                <w:sz w:val="16"/>
+              </w:rPr>
+              <w:t>def add_doubled(value, total):</w:t>
+            </w:r>
+          </w:p>
+          <w:p>
+            <w:pPr>
+              <w:spacing w:after="20"/>
+            </w:pPr>
+            <w:r>
+              <w:rPr>
+                <w:rFonts w:ascii="Consolas" w:hAnsi="Consolas"/>
+                <w:b w:val="0"/>
+                <w:color w:val="000000"/>
+                <w:sz w:val="16"/>
+              </w:rPr>
+              <w:t xml:space="preserve">    return total + double(value)</w:t>
+            </w:r>
+          </w:p>
+          <w:p>
+            <w:pPr>
+              <w:spacing w:after="20"/>
+            </w:pPr>
+            <w:r>
+              <w:rPr>
+                <w:rFonts w:ascii="Consolas" w:hAnsi="Consolas"/>
+                <w:b w:val="0"/>
+                <w:color w:val="000000"/>
+                <w:sz w:val="16"/>
+              </w:rPr>
+            </w:r>
+          </w:p>
+          <w:p>
+            <w:pPr>
+              <w:spacing w:after="20"/>
+            </w:pPr>
+            <w:r>
+              <w:rPr>
+                <w:rFonts w:ascii="Consolas" w:hAnsi="Consolas"/>
+                <w:b w:val="0"/>
+                <w:color w:val="000000"/>
+                <w:sz w:val="16"/>
+              </w:rPr>
+              <w:t>answer = add_doubled(3, 10)  # 16</w:t>
+            </w:r>
+          </w:p>
+        </w:tc>
+      </w:tr>
+    </w:tbl>
+    <w:p>
+      <w:pPr>
+        <w:spacing w:after="60"/>
+      </w:pPr>
+    </w:p>
+    <w:tbl>
+      <w:tblPr>
+        <w:tblW w:type="auto" w:w="0"/>
+        <w:tblLayout w:type="fixed"/>
+        <w:tblLook w:firstColumn="1" w:firstRow="1" w:lastColumn="0" w:lastRow="0" w:noHBand="0" w:noVBand="1" w:val="04A0"/>
+      </w:tblPr>
+      <w:tblGrid>
+        <w:gridCol w:w="6480"/>
+      </w:tblGrid>
+      <w:tr>
+        <w:tc>
+          <w:tcPr>
+            <w:tcW w:type="dxa" w:w="6538"/>
+            <w:shd w:fill="F5F5F5"/>
+          </w:tcPr>
+          <w:p>
+            <w:pPr>
+              <w:spacing w:after="60"/>
+            </w:pPr>
+            <w:r>
+              <w:rPr>
+                <w:rFonts w:ascii="Aptos" w:hAnsi="Aptos"/>
+                <w:b/>
+                <w:color w:val="000000"/>
+                <w:sz w:val="20"/>
+              </w:rPr>
+              <w:t>Return early</w:t>
+            </w:r>
+          </w:p>
+          <w:p>
+            <w:pPr>
+              <w:spacing w:after="20"/>
+            </w:pPr>
+            <w:r>
+              <w:rPr>
+                <w:rFonts w:ascii="Consolas" w:hAnsi="Consolas"/>
+                <w:b w:val="0"/>
+                <w:color w:val="000000"/>
+                <w:sz w:val="16"/>
+              </w:rPr>
+              <w:t>def label(score):</w:t>
+            </w:r>
+          </w:p>
+          <w:p>
+            <w:pPr>
+              <w:spacing w:after="20"/>
+            </w:pPr>
+            <w:r>
+              <w:rPr>
+                <w:rFonts w:ascii="Consolas" w:hAnsi="Consolas"/>
+                <w:b w:val="0"/>
+                <w:color w:val="000000"/>
+                <w:sz w:val="16"/>
+              </w:rPr>
+              <w:t xml:space="preserve">    if score &gt;= 70:</w:t>
+            </w:r>
+          </w:p>
+          <w:p>
+            <w:pPr>
+              <w:spacing w:after="20"/>
+            </w:pPr>
+            <w:r>
+              <w:rPr>
+                <w:rFonts w:ascii="Consolas" w:hAnsi="Consolas"/>
+                <w:b w:val="0"/>
+                <w:color w:val="000000"/>
+                <w:sz w:val="16"/>
+              </w:rPr>
+              <w:t xml:space="preserve">        return "Pass"</w:t>
+            </w:r>
+          </w:p>
+          <w:p>
+            <w:pPr>
+              <w:spacing w:after="20"/>
+            </w:pPr>
+            <w:r>
+              <w:rPr>
+                <w:rFonts w:ascii="Consolas" w:hAnsi="Consolas"/>
+                <w:b w:val="0"/>
+                <w:color w:val="000000"/>
+                <w:sz w:val="16"/>
+              </w:rPr>
+              <w:t xml:space="preserve">    return "Try again"</w:t>
+            </w:r>
+          </w:p>
+          <w:p>
+            <w:pPr>
+              <w:spacing w:after="20"/>
+            </w:pPr>
+            <w:r>
+              <w:rPr>
+                <w:rFonts w:ascii="Consolas" w:hAnsi="Consolas"/>
+                <w:b w:val="0"/>
+                <w:color w:val="000000"/>
+                <w:sz w:val="16"/>
+              </w:rPr>
+            </w:r>
+          </w:p>
+          <w:p>
+            <w:pPr>
+              <w:spacing w:after="20"/>
+            </w:pPr>
+            <w:r>
+              <w:rPr>
+                <w:rFonts w:ascii="Consolas" w:hAnsi="Consolas"/>
+                <w:b w:val="0"/>
+                <w:color w:val="000000"/>
+                <w:sz w:val="16"/>
+              </w:rPr>
+              <w:t>result = label(82)  # 'Pass'</w:t>
+            </w:r>
+          </w:p>
+        </w:tc>
+      </w:tr>
+    </w:tbl>
+    <w:p>
+      <w:pPr>
+        <w:spacing w:after="60"/>
+      </w:pPr>
+    </w:p>
+    <w:tbl>
+      <w:tblPr>
+        <w:tblW w:type="auto" w:w="0"/>
+        <w:tblLayout w:type="fixed"/>
+        <w:tblLook w:firstColumn="1" w:firstRow="1" w:lastColumn="0" w:lastRow="0" w:noHBand="0" w:noVBand="1" w:val="04A0"/>
+      </w:tblPr>
+      <w:tblGrid>
+        <w:gridCol w:w="6480"/>
+      </w:tblGrid>
+      <w:tr>
+        <w:tc>
+          <w:tcPr>
+            <w:tcW w:type="dxa" w:w="6538"/>
+            <w:shd w:fill="F5F5F5"/>
+          </w:tcPr>
+          <w:p>
+            <w:pPr>
+              <w:spacing w:after="60"/>
+            </w:pPr>
+            <w:r>
+              <w:rPr>
+                <w:rFonts w:ascii="Aptos" w:hAnsi="Aptos"/>
+                <w:b/>
+                <w:color w:val="000000"/>
+                <w:sz w:val="20"/>
+              </w:rPr>
+              <w:t>List parameter</w:t>
+            </w:r>
+          </w:p>
+          <w:p>
+            <w:pPr>
+              <w:spacing w:after="20"/>
+            </w:pPr>
+            <w:r>
+              <w:rPr>
+                <w:rFonts w:ascii="Consolas" w:hAnsi="Consolas"/>
+                <w:b w:val="0"/>
+                <w:color w:val="000000"/>
+                <w:sz w:val="16"/>
+              </w:rPr>
+              <w:t>def first_item(items):</w:t>
+            </w:r>
+          </w:p>
+          <w:p>
+            <w:pPr>
+              <w:spacing w:after="20"/>
+            </w:pPr>
+            <w:r>
+              <w:rPr>
+                <w:rFonts w:ascii="Consolas" w:hAnsi="Consolas"/>
+                <w:b w:val="0"/>
+                <w:color w:val="000000"/>
+                <w:sz w:val="16"/>
+              </w:rPr>
+              <w:t xml:space="preserve">    if len(items) == 0:</w:t>
+            </w:r>
+          </w:p>
+          <w:p>
+            <w:pPr>
+              <w:spacing w:after="20"/>
+            </w:pPr>
+            <w:r>
+              <w:rPr>
+                <w:rFonts w:ascii="Consolas" w:hAnsi="Consolas"/>
+                <w:b w:val="0"/>
+                <w:color w:val="000000"/>
+                <w:sz w:val="16"/>
+              </w:rPr>
+              <w:t xml:space="preserve">        return None</w:t>
+            </w:r>
+          </w:p>
+          <w:p>
+            <w:pPr>
+              <w:spacing w:after="20"/>
+            </w:pPr>
+            <w:r>
+              <w:rPr>
+                <w:rFonts w:ascii="Consolas" w:hAnsi="Consolas"/>
+                <w:b w:val="0"/>
+                <w:color w:val="000000"/>
+                <w:sz w:val="16"/>
+              </w:rPr>
+              <w:t xml:space="preserve">    return items[0]</w:t>
+            </w:r>
+          </w:p>
+          <w:p>
+            <w:pPr>
+              <w:spacing w:after="20"/>
+            </w:pPr>
+            <w:r>
+              <w:rPr>
+                <w:rFonts w:ascii="Consolas" w:hAnsi="Consolas"/>
+                <w:b w:val="0"/>
+                <w:color w:val="000000"/>
+                <w:sz w:val="16"/>
+              </w:rPr>
+            </w:r>
+          </w:p>
+          <w:p>
+            <w:pPr>
+              <w:spacing w:after="20"/>
+            </w:pPr>
+            <w:r>
+              <w:rPr>
+                <w:rFonts w:ascii="Consolas" w:hAnsi="Consolas"/>
+                <w:b w:val="0"/>
+                <w:color w:val="000000"/>
+                <w:sz w:val="16"/>
+              </w:rPr>
+              <w:t>first = first_item(["key", "star"])  # 'key'</w:t>
+            </w:r>
+          </w:p>
+        </w:tc>
+      </w:tr>
+    </w:tbl>
+    <w:p>
+      <w:pPr>
+        <w:spacing w:after="60"/>
+      </w:pPr>
+    </w:p>
+    <w:p>
+      <w:pPr>
+        <w:jc w:val="right"/>
+      </w:pPr>
+      <w:r>
+        <w:rPr>
+          <w:rFonts w:ascii="Aptos" w:hAnsi="Aptos"/>
+          <w:b/>
+          <w:color w:val="444444"/>
+          <w:sz w:val="15"/>
+        </w:rPr>
+        <w:t>PYTHON FIELD GUIDE   31</w:t>
+      </w:r>
+    </w:p>
+    <w:p>
+      <w:r>
+        <w:br w:type="page"/>
+      </w:r>
+    </w:p>
+    <w:p>
+      <w:pPr>
+        <w:pStyle w:val="Title"/>
+        <w:spacing w:after="40"/>
+        <w:jc w:val="left"/>
+      </w:pPr>
+      <w:r>
+        <w:rPr>
+          <w:rFonts w:ascii="Aptos" w:hAnsi="Aptos"/>
+          <w:b/>
+          <w:color w:val="000000"/>
+          <w:sz w:val="40"/>
+        </w:rPr>
         <w:t>Index and official sources</w:t>
       </w:r>
     </w:p>
@@ -8905,7 +10793,7 @@
                 <w:color w:val="000000"/>
                 <w:sz w:val="17"/>
               </w:rPr>
-              <w:t>Nested data 25   Comprehensions and sorting 26   Program planning 27</w:t>
+              <w:t>Nested data 25   Comprehensions 26   Planning 27   Worked examples 28-31</w:t>
             </w:r>
           </w:p>
         </w:tc>
@@ -9080,7 +10968,7 @@
           <w:color w:val="444444"/>
           <w:sz w:val="15"/>
         </w:rPr>
-        <w:t>PYTHON FIELD GUIDE   28</w:t>
+        <w:t>PYTHON FIELD GUIDE   32</w:t>
       </w:r>
     </w:p>
     <w:sectPr>

</xml_diff>

<commit_message>
Condense field guide without removing content
</commit_message>
<xml_diff>
--- a/week-05-halloween-loop-quest/handouts/python-field-guide-editable.docx
+++ b/week-05-halloween-loop-quest/handouts/python-field-guide-editable.docx
@@ -29,7 +29,7 @@
           <w:color w:val="444444"/>
           <w:sz w:val="20"/>
         </w:rPr>
-        <w:t>A student reference for reading writing and debugging Python</w:t>
+        <w:t>Reference map and lookup routine</w:t>
       </w:r>
     </w:p>
     <w:tbl>
@@ -185,54 +185,56 @@
         <w:spacing w:after="60"/>
       </w:pPr>
     </w:p>
+    <w:tbl>
+      <w:tblPr>
+        <w:tblW w:type="auto" w:w="0"/>
+        <w:tblLayout w:type="fixed"/>
+        <w:tblLook w:firstColumn="1" w:firstRow="1" w:lastColumn="0" w:lastRow="0" w:noHBand="0" w:noVBand="1" w:val="04A0"/>
+      </w:tblPr>
+      <w:tblGrid>
+        <w:gridCol w:w="6480"/>
+      </w:tblGrid>
+      <w:tr>
+        <w:tc>
+          <w:tcPr>
+            <w:tcW w:type="dxa" w:w="6538"/>
+            <w:shd w:fill="F5F5F5"/>
+          </w:tcPr>
+          <w:p>
+            <w:pPr>
+              <w:spacing w:after="60"/>
+            </w:pPr>
+            <w:r>
+              <w:rPr>
+                <w:rFonts w:ascii="Aptos" w:hAnsi="Aptos"/>
+                <w:b/>
+                <w:color w:val="000000"/>
+                <w:sz w:val="20"/>
+              </w:rPr>
+              <w:t>1 Name the goal</w:t>
+            </w:r>
+          </w:p>
+          <w:p>
+            <w:pPr>
+              <w:spacing w:after="20"/>
+            </w:pPr>
+            <w:r>
+              <w:rPr>
+                <w:rFonts w:ascii="Aptos" w:hAnsi="Aptos"/>
+                <w:b w:val="0"/>
+                <w:color w:val="000000"/>
+                <w:sz w:val="17"/>
+              </w:rPr>
+              <w:t>Say what you want the program to do without using code words.</w:t>
+            </w:r>
+          </w:p>
+        </w:tc>
+      </w:tr>
+    </w:tbl>
     <w:p>
       <w:pPr>
-        <w:jc w:val="right"/>
-      </w:pPr>
-      <w:r>
-        <w:rPr>
-          <w:rFonts w:ascii="Aptos" w:hAnsi="Aptos"/>
-          <w:b/>
-          <w:color w:val="444444"/>
-          <w:sz w:val="15"/>
-        </w:rPr>
-        <w:t>PYTHON FIELD GUIDE   1</w:t>
-      </w:r>
-    </w:p>
-    <w:p>
-      <w:r>
-        <w:br w:type="page"/>
-      </w:r>
-    </w:p>
-    <w:p>
-      <w:pPr>
-        <w:pStyle w:val="Title"/>
-        <w:spacing w:after="40"/>
-        <w:jc w:val="left"/>
-      </w:pPr>
-      <w:r>
-        <w:rPr>
-          <w:rFonts w:ascii="Aptos" w:hAnsi="Aptos"/>
-          <w:b/>
-          <w:color w:val="000000"/>
-          <w:sz w:val="40"/>
-        </w:rPr>
-        <w:t>How to use this guide</w:t>
-      </w:r>
-    </w:p>
-    <w:p>
-      <w:pPr>
-        <w:spacing w:after="180"/>
-      </w:pPr>
-      <w:r>
-        <w:rPr>
-          <w:rFonts w:ascii="Aptos" w:hAnsi="Aptos"/>
-          <w:b w:val="0"/>
-          <w:color w:val="444444"/>
-          <w:sz w:val="20"/>
-        </w:rPr>
-        <w:t>A four step lookup routine</w:t>
-      </w:r>
+        <w:spacing w:after="60"/>
+      </w:pPr>
     </w:p>
     <w:tbl>
       <w:tblPr>
@@ -260,7 +262,7 @@
                 <w:color w:val="000000"/>
                 <w:sz w:val="20"/>
               </w:rPr>
-              <w:t>1 Name the goal</w:t>
+              <w:t>2 Find a pattern</w:t>
             </w:r>
           </w:p>
           <w:p>
@@ -274,7 +276,7 @@
                 <w:color w:val="000000"/>
                 <w:sz w:val="17"/>
               </w:rPr>
-              <w:t>Say what you want the program to do without using code words.</w:t>
+              <w:t>Use the index or headings to locate a small example that matches your goal.</w:t>
             </w:r>
           </w:p>
         </w:tc>
@@ -311,7 +313,7 @@
                 <w:color w:val="000000"/>
                 <w:sz w:val="20"/>
               </w:rPr>
-              <w:t>2 Find a pattern</w:t>
+              <w:t>3 Adapt carefully</w:t>
             </w:r>
           </w:p>
           <w:p>
@@ -325,7 +327,7 @@
                 <w:color w:val="000000"/>
                 <w:sz w:val="17"/>
               </w:rPr>
-              <w:t>Use the index or headings to locate a small example that matches your goal.</w:t>
+              <w:t>Change names and values, but keep punctuation, indentation, and the overall shape.</w:t>
             </w:r>
           </w:p>
         </w:tc>
@@ -362,7 +364,7 @@
                 <w:color w:val="000000"/>
                 <w:sz w:val="20"/>
               </w:rPr>
-              <w:t>3 Adapt carefully</w:t>
+              <w:t>4 Predict and test</w:t>
             </w:r>
           </w:p>
           <w:p>
@@ -376,7 +378,7 @@
                 <w:color w:val="000000"/>
                 <w:sz w:val="17"/>
               </w:rPr>
-              <w:t>Change names and values, but keep punctuation, indentation, and the overall shape.</w:t>
+              <w:t>Predict the output, run the smallest useful test, and compare the result with your prediction.</w:t>
             </w:r>
           </w:p>
         </w:tc>
@@ -413,57 +415,6 @@
                 <w:color w:val="000000"/>
                 <w:sz w:val="20"/>
               </w:rPr>
-              <w:t>4 Predict and test</w:t>
-            </w:r>
-          </w:p>
-          <w:p>
-            <w:pPr>
-              <w:spacing w:after="20"/>
-            </w:pPr>
-            <w:r>
-              <w:rPr>
-                <w:rFonts w:ascii="Aptos" w:hAnsi="Aptos"/>
-                <w:b w:val="0"/>
-                <w:color w:val="000000"/>
-                <w:sz w:val="17"/>
-              </w:rPr>
-              <w:t>Predict the output, run the smallest useful test, and compare the result with your prediction.</w:t>
-            </w:r>
-          </w:p>
-        </w:tc>
-      </w:tr>
-    </w:tbl>
-    <w:p>
-      <w:pPr>
-        <w:spacing w:after="60"/>
-      </w:pPr>
-    </w:p>
-    <w:tbl>
-      <w:tblPr>
-        <w:tblW w:type="auto" w:w="0"/>
-        <w:tblLayout w:type="fixed"/>
-        <w:tblLook w:firstColumn="1" w:firstRow="1" w:lastColumn="0" w:lastRow="0" w:noHBand="0" w:noVBand="1" w:val="04A0"/>
-      </w:tblPr>
-      <w:tblGrid>
-        <w:gridCol w:w="6480"/>
-      </w:tblGrid>
-      <w:tr>
-        <w:tc>
-          <w:tcPr>
-            <w:tcW w:type="dxa" w:w="6538"/>
-            <w:shd w:fill="F5F5F5"/>
-          </w:tcPr>
-          <w:p>
-            <w:pPr>
-              <w:spacing w:after="60"/>
-            </w:pPr>
-            <w:r>
-              <w:rPr>
-                <w:rFonts w:ascii="Aptos" w:hAnsi="Aptos"/>
-                <w:b/>
-                <w:color w:val="000000"/>
-                <w:sz w:val="20"/>
-              </w:rPr>
               <w:t>When asking for help</w:t>
             </w:r>
           </w:p>
@@ -500,7 +451,7 @@
           <w:color w:val="444444"/>
           <w:sz w:val="15"/>
         </w:rPr>
-        <w:t>PYTHON FIELD GUIDE   2</w:t>
+        <w:t>PYTHON FIELD GUIDE   1</w:t>
       </w:r>
     </w:p>
     <w:p>
@@ -804,7 +755,7 @@
           <w:color w:val="444444"/>
           <w:sz w:val="15"/>
         </w:rPr>
-        <w:t>PYTHON FIELD GUIDE   3</w:t>
+        <w:t>PYTHON FIELD GUIDE   2</w:t>
       </w:r>
     </w:p>
     <w:p>
@@ -1164,7 +1115,7 @@
           <w:color w:val="444444"/>
           <w:sz w:val="15"/>
         </w:rPr>
-        <w:t>PYTHON FIELD GUIDE   4</w:t>
+        <w:t>PYTHON FIELD GUIDE   3</w:t>
       </w:r>
     </w:p>
     <w:p>
@@ -1496,7 +1447,7 @@
           <w:color w:val="444444"/>
           <w:sz w:val="15"/>
         </w:rPr>
-        <w:t>PYTHON FIELD GUIDE   5</w:t>
+        <w:t>PYTHON FIELD GUIDE   4</w:t>
       </w:r>
     </w:p>
     <w:p>
@@ -1828,7 +1779,7 @@
           <w:color w:val="444444"/>
           <w:sz w:val="15"/>
         </w:rPr>
-        <w:t>PYTHON FIELD GUIDE   6</w:t>
+        <w:t>PYTHON FIELD GUIDE   5</w:t>
       </w:r>
     </w:p>
     <w:p>
@@ -2244,7 +2195,7 @@
           <w:color w:val="444444"/>
           <w:sz w:val="15"/>
         </w:rPr>
-        <w:t>PYTHON FIELD GUIDE   7</w:t>
+        <w:t>PYTHON FIELD GUIDE   6</w:t>
       </w:r>
     </w:p>
     <w:p>
@@ -2604,7 +2555,7 @@
           <w:color w:val="444444"/>
           <w:sz w:val="15"/>
         </w:rPr>
-        <w:t>PYTHON FIELD GUIDE   8</w:t>
+        <w:t>PYTHON FIELD GUIDE   7</w:t>
       </w:r>
     </w:p>
     <w:p>
@@ -2955,7 +2906,7 @@
           <w:color w:val="444444"/>
           <w:sz w:val="15"/>
         </w:rPr>
-        <w:t>PYTHON FIELD GUIDE   9</w:t>
+        <w:t>PYTHON FIELD GUIDE   8</w:t>
       </w:r>
     </w:p>
     <w:p>
@@ -3287,7 +3238,7 @@
           <w:color w:val="444444"/>
           <w:sz w:val="15"/>
         </w:rPr>
-        <w:t>PYTHON FIELD GUIDE   10</w:t>
+        <w:t>PYTHON FIELD GUIDE   9</w:t>
       </w:r>
     </w:p>
     <w:p>
@@ -3610,7 +3561,7 @@
           <w:color w:val="444444"/>
           <w:sz w:val="15"/>
         </w:rPr>
-        <w:t>PYTHON FIELD GUIDE   11</w:t>
+        <w:t>PYTHON FIELD GUIDE   10</w:t>
       </w:r>
     </w:p>
     <w:p>
@@ -3933,7 +3884,7 @@
           <w:color w:val="444444"/>
           <w:sz w:val="15"/>
         </w:rPr>
-        <w:t>PYTHON FIELD GUIDE   12</w:t>
+        <w:t>PYTHON FIELD GUIDE   11</w:t>
       </w:r>
     </w:p>
     <w:p>
@@ -4279,7 +4230,7 @@
           <w:color w:val="444444"/>
           <w:sz w:val="15"/>
         </w:rPr>
-        <w:t>PYTHON FIELD GUIDE   13</w:t>
+        <w:t>PYTHON FIELD GUIDE   12</w:t>
       </w:r>
     </w:p>
     <w:p>
@@ -4587,7 +4538,7 @@
           <w:color w:val="444444"/>
           <w:sz w:val="15"/>
         </w:rPr>
-        <w:t>PYTHON FIELD GUIDE   14</w:t>
+        <w:t>PYTHON FIELD GUIDE   13</w:t>
       </w:r>
     </w:p>
     <w:p>
@@ -4988,7 +4939,7 @@
           <w:color w:val="444444"/>
           <w:sz w:val="15"/>
         </w:rPr>
-        <w:t>PYTHON FIELD GUIDE   15</w:t>
+        <w:t>PYTHON FIELD GUIDE   14</w:t>
       </w:r>
     </w:p>
     <w:p>
@@ -5292,7 +5243,7 @@
           <w:color w:val="444444"/>
           <w:sz w:val="15"/>
         </w:rPr>
-        <w:t>PYTHON FIELD GUIDE   16</w:t>
+        <w:t>PYTHON FIELD GUIDE   15</w:t>
       </w:r>
     </w:p>
     <w:p>
@@ -5652,7 +5603,7 @@
           <w:color w:val="444444"/>
           <w:sz w:val="15"/>
         </w:rPr>
-        <w:t>PYTHON FIELD GUIDE   17</w:t>
+        <w:t>PYTHON FIELD GUIDE   16</w:t>
       </w:r>
     </w:p>
     <w:p>
@@ -5947,7 +5898,7 @@
           <w:color w:val="444444"/>
           <w:sz w:val="15"/>
         </w:rPr>
-        <w:t>PYTHON FIELD GUIDE   18</w:t>
+        <w:t>PYTHON FIELD GUIDE   17</w:t>
       </w:r>
     </w:p>
     <w:p>
@@ -6256,7 +6207,7 @@
           <w:color w:val="444444"/>
           <w:sz w:val="15"/>
         </w:rPr>
-        <w:t>PYTHON FIELD GUIDE   19</w:t>
+        <w:t>PYTHON FIELD GUIDE   18</w:t>
       </w:r>
     </w:p>
     <w:p>
@@ -6592,7 +6543,7 @@
           <w:color w:val="444444"/>
           <w:sz w:val="15"/>
         </w:rPr>
-        <w:t>PYTHON FIELD GUIDE   20</w:t>
+        <w:t>PYTHON FIELD GUIDE   19</w:t>
       </w:r>
     </w:p>
     <w:p>
@@ -6956,7 +6907,7 @@
           <w:color w:val="444444"/>
           <w:sz w:val="15"/>
         </w:rPr>
-        <w:t>PYTHON FIELD GUIDE   21</w:t>
+        <w:t>PYTHON FIELD GUIDE   20</w:t>
       </w:r>
     </w:p>
     <w:p>
@@ -6977,7 +6928,7 @@
           <w:color w:val="000000"/>
           <w:sz w:val="40"/>
         </w:rPr>
-        <w:t>Testing</w:t>
+        <w:t>Testing and readable code</w:t>
       </w:r>
     </w:p>
     <w:p>
@@ -6991,7 +6942,7 @@
           <w:color w:val="444444"/>
           <w:sz w:val="20"/>
         </w:rPr>
-        <w:t>Future confidence checks</w:t>
+        <w:t>Check behavior and communicate intent</w:t>
       </w:r>
     </w:p>
     <w:tbl>
@@ -7226,6 +7177,261 @@
         <w:spacing w:after="60"/>
       </w:pPr>
     </w:p>
+    <w:tbl>
+      <w:tblPr>
+        <w:tblW w:type="auto" w:w="0"/>
+        <w:tblLayout w:type="fixed"/>
+        <w:tblLook w:firstColumn="1" w:firstRow="1" w:lastColumn="0" w:lastRow="0" w:noHBand="0" w:noVBand="1" w:val="04A0"/>
+      </w:tblPr>
+      <w:tblGrid>
+        <w:gridCol w:w="6480"/>
+      </w:tblGrid>
+      <w:tr>
+        <w:tc>
+          <w:tcPr>
+            <w:tcW w:type="dxa" w:w="6538"/>
+            <w:shd w:fill="F5F5F5"/>
+          </w:tcPr>
+          <w:p>
+            <w:pPr>
+              <w:spacing w:after="60"/>
+            </w:pPr>
+            <w:r>
+              <w:rPr>
+                <w:rFonts w:ascii="Aptos" w:hAnsi="Aptos"/>
+                <w:b/>
+                <w:color w:val="000000"/>
+                <w:sz w:val="20"/>
+              </w:rPr>
+              <w:t>Indent consistently</w:t>
+            </w:r>
+          </w:p>
+          <w:p>
+            <w:pPr>
+              <w:spacing w:after="20"/>
+            </w:pPr>
+            <w:r>
+              <w:rPr>
+                <w:rFonts w:ascii="Aptos" w:hAnsi="Aptos"/>
+                <w:b w:val="0"/>
+                <w:color w:val="000000"/>
+                <w:sz w:val="17"/>
+              </w:rPr>
+              <w:t>Use four spaces for each block. Do not mix tabs and spaces.</w:t>
+            </w:r>
+          </w:p>
+        </w:tc>
+      </w:tr>
+    </w:tbl>
+    <w:p>
+      <w:pPr>
+        <w:spacing w:after="60"/>
+      </w:pPr>
+    </w:p>
+    <w:tbl>
+      <w:tblPr>
+        <w:tblW w:type="auto" w:w="0"/>
+        <w:tblLayout w:type="fixed"/>
+        <w:tblLook w:firstColumn="1" w:firstRow="1" w:lastColumn="0" w:lastRow="0" w:noHBand="0" w:noVBand="1" w:val="04A0"/>
+      </w:tblPr>
+      <w:tblGrid>
+        <w:gridCol w:w="6480"/>
+      </w:tblGrid>
+      <w:tr>
+        <w:tc>
+          <w:tcPr>
+            <w:tcW w:type="dxa" w:w="6538"/>
+            <w:shd w:fill="F5F5F5"/>
+          </w:tcPr>
+          <w:p>
+            <w:pPr>
+              <w:spacing w:after="60"/>
+            </w:pPr>
+            <w:r>
+              <w:rPr>
+                <w:rFonts w:ascii="Aptos" w:hAnsi="Aptos"/>
+                <w:b/>
+                <w:color w:val="000000"/>
+                <w:sz w:val="20"/>
+              </w:rPr>
+              <w:t>Name clearly</w:t>
+            </w:r>
+          </w:p>
+          <w:p>
+            <w:pPr>
+              <w:spacing w:after="20"/>
+            </w:pPr>
+            <w:r>
+              <w:rPr>
+                <w:rFonts w:ascii="Aptos" w:hAnsi="Aptos"/>
+                <w:b w:val="0"/>
+                <w:color w:val="000000"/>
+                <w:sz w:val="17"/>
+              </w:rPr>
+              <w:t>Prefer calculate_average over calc or x. Boolean names often begin with is, has, or can.</w:t>
+            </w:r>
+          </w:p>
+        </w:tc>
+      </w:tr>
+    </w:tbl>
+    <w:p>
+      <w:pPr>
+        <w:spacing w:after="60"/>
+      </w:pPr>
+    </w:p>
+    <w:tbl>
+      <w:tblPr>
+        <w:tblW w:type="auto" w:w="0"/>
+        <w:tblLayout w:type="fixed"/>
+        <w:tblLook w:firstColumn="1" w:firstRow="1" w:lastColumn="0" w:lastRow="0" w:noHBand="0" w:noVBand="1" w:val="04A0"/>
+      </w:tblPr>
+      <w:tblGrid>
+        <w:gridCol w:w="6480"/>
+      </w:tblGrid>
+      <w:tr>
+        <w:tc>
+          <w:tcPr>
+            <w:tcW w:type="dxa" w:w="6538"/>
+            <w:shd w:fill="F5F5F5"/>
+          </w:tcPr>
+          <w:p>
+            <w:pPr>
+              <w:spacing w:after="60"/>
+            </w:pPr>
+            <w:r>
+              <w:rPr>
+                <w:rFonts w:ascii="Aptos" w:hAnsi="Aptos"/>
+                <w:b/>
+                <w:color w:val="000000"/>
+                <w:sz w:val="20"/>
+              </w:rPr>
+              <w:t>Keep functions focused</w:t>
+            </w:r>
+          </w:p>
+          <w:p>
+            <w:pPr>
+              <w:spacing w:after="20"/>
+            </w:pPr>
+            <w:r>
+              <w:rPr>
+                <w:rFonts w:ascii="Aptos" w:hAnsi="Aptos"/>
+                <w:b w:val="0"/>
+                <w:color w:val="000000"/>
+                <w:sz w:val="17"/>
+              </w:rPr>
+              <w:t>Split a long task into smaller named functions with clear inputs and return values.</w:t>
+            </w:r>
+          </w:p>
+        </w:tc>
+      </w:tr>
+    </w:tbl>
+    <w:p>
+      <w:pPr>
+        <w:spacing w:after="60"/>
+      </w:pPr>
+    </w:p>
+    <w:tbl>
+      <w:tblPr>
+        <w:tblW w:type="auto" w:w="0"/>
+        <w:tblLayout w:type="fixed"/>
+        <w:tblLook w:firstColumn="1" w:firstRow="1" w:lastColumn="0" w:lastRow="0" w:noHBand="0" w:noVBand="1" w:val="04A0"/>
+      </w:tblPr>
+      <w:tblGrid>
+        <w:gridCol w:w="6480"/>
+      </w:tblGrid>
+      <w:tr>
+        <w:tc>
+          <w:tcPr>
+            <w:tcW w:type="dxa" w:w="6538"/>
+            <w:shd w:fill="F5F5F5"/>
+          </w:tcPr>
+          <w:p>
+            <w:pPr>
+              <w:spacing w:after="60"/>
+            </w:pPr>
+            <w:r>
+              <w:rPr>
+                <w:rFonts w:ascii="Aptos" w:hAnsi="Aptos"/>
+                <w:b/>
+                <w:color w:val="000000"/>
+                <w:sz w:val="20"/>
+              </w:rPr>
+              <w:t>Comments explain why</w:t>
+            </w:r>
+          </w:p>
+          <w:p>
+            <w:pPr>
+              <w:spacing w:after="20"/>
+            </w:pPr>
+            <w:r>
+              <w:rPr>
+                <w:rFonts w:ascii="Aptos" w:hAnsi="Aptos"/>
+                <w:b w:val="0"/>
+                <w:color w:val="000000"/>
+                <w:sz w:val="17"/>
+              </w:rPr>
+              <w:t>Do not narrate obvious code. Explain a decision, rule, assumption, or surprising workaround.</w:t>
+            </w:r>
+          </w:p>
+        </w:tc>
+      </w:tr>
+    </w:tbl>
+    <w:p>
+      <w:pPr>
+        <w:spacing w:after="60"/>
+      </w:pPr>
+    </w:p>
+    <w:tbl>
+      <w:tblPr>
+        <w:tblW w:type="auto" w:w="0"/>
+        <w:tblLayout w:type="fixed"/>
+        <w:tblLook w:firstColumn="1" w:firstRow="1" w:lastColumn="0" w:lastRow="0" w:noHBand="0" w:noVBand="1" w:val="04A0"/>
+      </w:tblPr>
+      <w:tblGrid>
+        <w:gridCol w:w="6480"/>
+      </w:tblGrid>
+      <w:tr>
+        <w:tc>
+          <w:tcPr>
+            <w:tcW w:type="dxa" w:w="6538"/>
+            <w:shd w:fill="F5F5F5"/>
+          </w:tcPr>
+          <w:p>
+            <w:pPr>
+              <w:spacing w:after="60"/>
+            </w:pPr>
+            <w:r>
+              <w:rPr>
+                <w:rFonts w:ascii="Aptos" w:hAnsi="Aptos"/>
+                <w:b/>
+                <w:color w:val="000000"/>
+                <w:sz w:val="20"/>
+              </w:rPr>
+              <w:t>Whitespace helps</w:t>
+            </w:r>
+          </w:p>
+          <w:p>
+            <w:pPr>
+              <w:spacing w:after="20"/>
+            </w:pPr>
+            <w:r>
+              <w:rPr>
+                <w:rFonts w:ascii="Aptos" w:hAnsi="Aptos"/>
+                <w:b w:val="0"/>
+                <w:color w:val="000000"/>
+                <w:sz w:val="17"/>
+              </w:rPr>
+              <w:t>Use blank lines between major parts and spaces around operators so code is easier to scan.</w:t>
+            </w:r>
+          </w:p>
+        </w:tc>
+      </w:tr>
+    </w:tbl>
+    <w:p>
+      <w:pPr>
+        <w:spacing w:after="60"/>
+      </w:pPr>
+    </w:p>
     <w:p>
       <w:pPr>
         <w:jc w:val="right"/>
@@ -7237,7 +7443,7 @@
           <w:color w:val="444444"/>
           <w:sz w:val="15"/>
         </w:rPr>
-        <w:t>PYTHON FIELD GUIDE   22</w:t>
+        <w:t>PYTHON FIELD GUIDE   21</w:t>
       </w:r>
     </w:p>
     <w:p>
@@ -7258,7 +7464,7 @@
           <w:color w:val="000000"/>
           <w:sz w:val="40"/>
         </w:rPr>
-        <w:t>Style and readable code</w:t>
+        <w:t>Glossary and project planning</w:t>
       </w:r>
     </w:p>
     <w:p>
@@ -7272,7 +7478,7 @@
           <w:color w:val="444444"/>
           <w:sz w:val="20"/>
         </w:rPr>
-        <w:t>Make programs easier for people to understand</w:t>
+        <w:t>Programming language and a path from idea to code</w:t>
       </w:r>
     </w:p>
     <w:tbl>
@@ -7301,7 +7507,7 @@
                 <w:color w:val="000000"/>
                 <w:sz w:val="20"/>
               </w:rPr>
-              <w:t>Indent consistently</w:t>
+              <w:t>Expression and statement</w:t>
             </w:r>
           </w:p>
           <w:p>
@@ -7315,7 +7521,7 @@
                 <w:color w:val="000000"/>
                 <w:sz w:val="17"/>
               </w:rPr>
-              <w:t>Use four spaces for each block. Do not mix tabs and spaces.</w:t>
+              <w:t>An expression produces a value. A statement performs an action such as assignment or return.</w:t>
             </w:r>
           </w:p>
         </w:tc>
@@ -7352,7 +7558,7 @@
                 <w:color w:val="000000"/>
                 <w:sz w:val="20"/>
               </w:rPr>
-              <w:t>Name clearly</w:t>
+              <w:t>Function method and argument</w:t>
             </w:r>
           </w:p>
           <w:p>
@@ -7366,7 +7572,7 @@
                 <w:color w:val="000000"/>
                 <w:sz w:val="17"/>
               </w:rPr>
-              <w:t>Prefer calculate_average over calc or x. Boolean names often begin with is, has, or can.</w:t>
+              <w:t>A function is callable code. A method belongs to an object. An argument is a value passed into a call.</w:t>
             </w:r>
           </w:p>
         </w:tc>
@@ -7403,7 +7609,7 @@
                 <w:color w:val="000000"/>
                 <w:sz w:val="20"/>
               </w:rPr>
-              <w:t>Keep functions focused</w:t>
+              <w:t>Mutable and immutable</w:t>
             </w:r>
           </w:p>
           <w:p>
@@ -7417,7 +7623,7 @@
                 <w:color w:val="000000"/>
                 <w:sz w:val="17"/>
               </w:rPr>
-              <w:t>Split a long task into smaller named functions with clear inputs and return values.</w:t>
+              <w:t>Mutable objects can change in place. Immutable objects cannot. Lists are mutable; strings and tuples are immutable.</w:t>
             </w:r>
           </w:p>
         </w:tc>
@@ -7454,7 +7660,7 @@
                 <w:color w:val="000000"/>
                 <w:sz w:val="20"/>
               </w:rPr>
-              <w:t>Comments explain why</w:t>
+              <w:t>Iterable and iteration</w:t>
             </w:r>
           </w:p>
           <w:p>
@@ -7468,7 +7674,7 @@
                 <w:color w:val="000000"/>
                 <w:sz w:val="17"/>
               </w:rPr>
-              <w:t>Do not narrate obvious code. Explain a decision, rule, assumption, or surprising workaround.</w:t>
+              <w:t>An iterable can supply values one at a time. One pass through a loop body is an iteration.</w:t>
             </w:r>
           </w:p>
         </w:tc>
@@ -7505,7 +7711,7 @@
                 <w:color w:val="000000"/>
                 <w:sz w:val="20"/>
               </w:rPr>
-              <w:t>Whitespace helps</w:t>
+              <w:t>Bug and exception</w:t>
             </w:r>
           </w:p>
           <w:p>
@@ -7519,7 +7725,262 @@
                 <w:color w:val="000000"/>
                 <w:sz w:val="17"/>
               </w:rPr>
-              <w:t>Use blank lines between major parts and spaces around operators so code is easier to scan.</w:t>
+              <w:t>A bug is incorrect behavior. An exception is a runtime signal that normal execution cannot continue.</w:t>
+            </w:r>
+          </w:p>
+        </w:tc>
+      </w:tr>
+    </w:tbl>
+    <w:p>
+      <w:pPr>
+        <w:spacing w:after="60"/>
+      </w:pPr>
+    </w:p>
+    <w:tbl>
+      <w:tblPr>
+        <w:tblW w:type="auto" w:w="0"/>
+        <w:tblLayout w:type="fixed"/>
+        <w:tblLook w:firstColumn="1" w:firstRow="1" w:lastColumn="0" w:lastRow="0" w:noHBand="0" w:noVBand="1" w:val="04A0"/>
+      </w:tblPr>
+      <w:tblGrid>
+        <w:gridCol w:w="6480"/>
+      </w:tblGrid>
+      <w:tr>
+        <w:tc>
+          <w:tcPr>
+            <w:tcW w:type="dxa" w:w="6538"/>
+            <w:shd w:fill="F5F5F5"/>
+          </w:tcPr>
+          <w:p>
+            <w:pPr>
+              <w:spacing w:after="60"/>
+            </w:pPr>
+            <w:r>
+              <w:rPr>
+                <w:rFonts w:ascii="Aptos" w:hAnsi="Aptos"/>
+                <w:b/>
+                <w:color w:val="000000"/>
+                <w:sz w:val="20"/>
+              </w:rPr>
+              <w:t>Inputs</w:t>
+            </w:r>
+          </w:p>
+          <w:p>
+            <w:pPr>
+              <w:spacing w:after="20"/>
+            </w:pPr>
+            <w:r>
+              <w:rPr>
+                <w:rFonts w:ascii="Aptos" w:hAnsi="Aptos"/>
+                <w:b w:val="0"/>
+                <w:color w:val="000000"/>
+                <w:sz w:val="17"/>
+              </w:rPr>
+              <w:t>What information enters the program? What type should each input have?</w:t>
+            </w:r>
+          </w:p>
+        </w:tc>
+      </w:tr>
+    </w:tbl>
+    <w:p>
+      <w:pPr>
+        <w:spacing w:after="60"/>
+      </w:pPr>
+    </w:p>
+    <w:tbl>
+      <w:tblPr>
+        <w:tblW w:type="auto" w:w="0"/>
+        <w:tblLayout w:type="fixed"/>
+        <w:tblLook w:firstColumn="1" w:firstRow="1" w:lastColumn="0" w:lastRow="0" w:noHBand="0" w:noVBand="1" w:val="04A0"/>
+      </w:tblPr>
+      <w:tblGrid>
+        <w:gridCol w:w="6480"/>
+      </w:tblGrid>
+      <w:tr>
+        <w:tc>
+          <w:tcPr>
+            <w:tcW w:type="dxa" w:w="6538"/>
+            <w:shd w:fill="F5F5F5"/>
+          </w:tcPr>
+          <w:p>
+            <w:pPr>
+              <w:spacing w:after="60"/>
+            </w:pPr>
+            <w:r>
+              <w:rPr>
+                <w:rFonts w:ascii="Aptos" w:hAnsi="Aptos"/>
+                <w:b/>
+                <w:color w:val="000000"/>
+                <w:sz w:val="20"/>
+              </w:rPr>
+              <w:t>Outputs</w:t>
+            </w:r>
+          </w:p>
+          <w:p>
+            <w:pPr>
+              <w:spacing w:after="20"/>
+            </w:pPr>
+            <w:r>
+              <w:rPr>
+                <w:rFonts w:ascii="Aptos" w:hAnsi="Aptos"/>
+                <w:b w:val="0"/>
+                <w:color w:val="000000"/>
+                <w:sz w:val="17"/>
+              </w:rPr>
+              <w:t>What should the user see or receive? What should a function return?</w:t>
+            </w:r>
+          </w:p>
+        </w:tc>
+      </w:tr>
+    </w:tbl>
+    <w:p>
+      <w:pPr>
+        <w:spacing w:after="60"/>
+      </w:pPr>
+    </w:p>
+    <w:tbl>
+      <w:tblPr>
+        <w:tblW w:type="auto" w:w="0"/>
+        <w:tblLayout w:type="fixed"/>
+        <w:tblLook w:firstColumn="1" w:firstRow="1" w:lastColumn="0" w:lastRow="0" w:noHBand="0" w:noVBand="1" w:val="04A0"/>
+      </w:tblPr>
+      <w:tblGrid>
+        <w:gridCol w:w="6480"/>
+      </w:tblGrid>
+      <w:tr>
+        <w:tc>
+          <w:tcPr>
+            <w:tcW w:type="dxa" w:w="6538"/>
+            <w:shd w:fill="F5F5F5"/>
+          </w:tcPr>
+          <w:p>
+            <w:pPr>
+              <w:spacing w:after="60"/>
+            </w:pPr>
+            <w:r>
+              <w:rPr>
+                <w:rFonts w:ascii="Aptos" w:hAnsi="Aptos"/>
+                <w:b/>
+                <w:color w:val="000000"/>
+                <w:sz w:val="20"/>
+              </w:rPr>
+              <w:t>Rules</w:t>
+            </w:r>
+          </w:p>
+          <w:p>
+            <w:pPr>
+              <w:spacing w:after="20"/>
+            </w:pPr>
+            <w:r>
+              <w:rPr>
+                <w:rFonts w:ascii="Aptos" w:hAnsi="Aptos"/>
+                <w:b w:val="0"/>
+                <w:color w:val="000000"/>
+                <w:sz w:val="17"/>
+              </w:rPr>
+              <w:t>Write the decisions and repeated actions as plain-language steps before writing Python.</w:t>
+            </w:r>
+          </w:p>
+        </w:tc>
+      </w:tr>
+    </w:tbl>
+    <w:p>
+      <w:pPr>
+        <w:spacing w:after="60"/>
+      </w:pPr>
+    </w:p>
+    <w:tbl>
+      <w:tblPr>
+        <w:tblW w:type="auto" w:w="0"/>
+        <w:tblLayout w:type="fixed"/>
+        <w:tblLook w:firstColumn="1" w:firstRow="1" w:lastColumn="0" w:lastRow="0" w:noHBand="0" w:noVBand="1" w:val="04A0"/>
+      </w:tblPr>
+      <w:tblGrid>
+        <w:gridCol w:w="6480"/>
+      </w:tblGrid>
+      <w:tr>
+        <w:tc>
+          <w:tcPr>
+            <w:tcW w:type="dxa" w:w="6538"/>
+            <w:shd w:fill="F5F5F5"/>
+          </w:tcPr>
+          <w:p>
+            <w:pPr>
+              <w:spacing w:after="60"/>
+            </w:pPr>
+            <w:r>
+              <w:rPr>
+                <w:rFonts w:ascii="Aptos" w:hAnsi="Aptos"/>
+                <w:b/>
+                <w:color w:val="000000"/>
+                <w:sz w:val="20"/>
+              </w:rPr>
+              <w:t>Functions</w:t>
+            </w:r>
+          </w:p>
+          <w:p>
+            <w:pPr>
+              <w:spacing w:after="20"/>
+            </w:pPr>
+            <w:r>
+              <w:rPr>
+                <w:rFonts w:ascii="Aptos" w:hAnsi="Aptos"/>
+                <w:b w:val="0"/>
+                <w:color w:val="000000"/>
+                <w:sz w:val="17"/>
+              </w:rPr>
+              <w:t>Give each major job a name, inputs, and one expected output or effect.</w:t>
+            </w:r>
+          </w:p>
+        </w:tc>
+      </w:tr>
+    </w:tbl>
+    <w:p>
+      <w:pPr>
+        <w:spacing w:after="60"/>
+      </w:pPr>
+    </w:p>
+    <w:tbl>
+      <w:tblPr>
+        <w:tblW w:type="auto" w:w="0"/>
+        <w:tblLayout w:type="fixed"/>
+        <w:tblLook w:firstColumn="1" w:firstRow="1" w:lastColumn="0" w:lastRow="0" w:noHBand="0" w:noVBand="1" w:val="04A0"/>
+      </w:tblPr>
+      <w:tblGrid>
+        <w:gridCol w:w="6480"/>
+      </w:tblGrid>
+      <w:tr>
+        <w:tc>
+          <w:tcPr>
+            <w:tcW w:type="dxa" w:w="6538"/>
+            <w:shd w:fill="F5F5F5"/>
+          </w:tcPr>
+          <w:p>
+            <w:pPr>
+              <w:spacing w:after="60"/>
+            </w:pPr>
+            <w:r>
+              <w:rPr>
+                <w:rFonts w:ascii="Aptos" w:hAnsi="Aptos"/>
+                <w:b/>
+                <w:color w:val="000000"/>
+                <w:sz w:val="20"/>
+              </w:rPr>
+              <w:t>Tests</w:t>
+            </w:r>
+          </w:p>
+          <w:p>
+            <w:pPr>
+              <w:spacing w:after="20"/>
+            </w:pPr>
+            <w:r>
+              <w:rPr>
+                <w:rFonts w:ascii="Aptos" w:hAnsi="Aptos"/>
+                <w:b w:val="0"/>
+                <w:color w:val="000000"/>
+                <w:sz w:val="17"/>
+              </w:rPr>
+              <w:t>Create one normal example, one boundary example, and one invalid example before implementation.</w:t>
             </w:r>
           </w:p>
         </w:tc>
@@ -7541,7 +8002,7 @@
           <w:color w:val="444444"/>
           <w:sz w:val="15"/>
         </w:rPr>
-        <w:t>PYTHON FIELD GUIDE   23</w:t>
+        <w:t>PYTHON FIELD GUIDE   22</w:t>
       </w:r>
     </w:p>
     <w:p>
@@ -7562,7 +8023,7 @@
           <w:color w:val="000000"/>
           <w:sz w:val="40"/>
         </w:rPr>
-        <w:t>Glossary</w:t>
+        <w:t>Nested data and comprehensions</w:t>
       </w:r>
     </w:p>
     <w:p>
@@ -7576,7 +8037,7 @@
           <w:color w:val="444444"/>
           <w:sz w:val="20"/>
         </w:rPr>
-        <w:t>Words programmers use</w:t>
+        <w:t>Future patterns for structured and transformed data</w:t>
       </w:r>
     </w:p>
     <w:tbl>
@@ -7605,7 +8066,7 @@
                 <w:color w:val="000000"/>
                 <w:sz w:val="20"/>
               </w:rPr>
-              <w:t>Expression and statement</w:t>
+              <w:t>List of dictionaries</w:t>
             </w:r>
           </w:p>
           <w:p>
@@ -7614,12 +8075,54 @@
             </w:pPr>
             <w:r>
               <w:rPr>
-                <w:rFonts w:ascii="Aptos" w:hAnsi="Aptos"/>
+                <w:rFonts w:ascii="Consolas" w:hAnsi="Consolas"/>
                 <w:b w:val="0"/>
                 <w:color w:val="000000"/>
-                <w:sz w:val="17"/>
-              </w:rPr>
-              <w:t>An expression produces a value. A statement performs an action such as assignment or return.</w:t>
+                <w:sz w:val="16"/>
+              </w:rPr>
+              <w:t>students = [</w:t>
+            </w:r>
+          </w:p>
+          <w:p>
+            <w:pPr>
+              <w:spacing w:after="20"/>
+            </w:pPr>
+            <w:r>
+              <w:rPr>
+                <w:rFonts w:ascii="Consolas" w:hAnsi="Consolas"/>
+                <w:b w:val="0"/>
+                <w:color w:val="000000"/>
+                <w:sz w:val="16"/>
+              </w:rPr>
+              <w:t xml:space="preserve">    {"name": "Ava", "score": 88},</w:t>
+            </w:r>
+          </w:p>
+          <w:p>
+            <w:pPr>
+              <w:spacing w:after="20"/>
+            </w:pPr>
+            <w:r>
+              <w:rPr>
+                <w:rFonts w:ascii="Consolas" w:hAnsi="Consolas"/>
+                <w:b w:val="0"/>
+                <w:color w:val="000000"/>
+                <w:sz w:val="16"/>
+              </w:rPr>
+              <w:t xml:space="preserve">    {"name": "Noah", "score": 94},</w:t>
+            </w:r>
+          </w:p>
+          <w:p>
+            <w:pPr>
+              <w:spacing w:after="20"/>
+            </w:pPr>
+            <w:r>
+              <w:rPr>
+                <w:rFonts w:ascii="Consolas" w:hAnsi="Consolas"/>
+                <w:b w:val="0"/>
+                <w:color w:val="000000"/>
+                <w:sz w:val="16"/>
+              </w:rPr>
+              <w:t>]</w:t>
             </w:r>
           </w:p>
         </w:tc>
@@ -7656,7 +8159,7 @@
                 <w:color w:val="000000"/>
                 <w:sz w:val="20"/>
               </w:rPr>
-              <w:t>Function method and argument</w:t>
+              <w:t>Read a nested value</w:t>
             </w:r>
           </w:p>
           <w:p>
@@ -7670,7 +8173,7 @@
                 <w:color w:val="000000"/>
                 <w:sz w:val="17"/>
               </w:rPr>
-              <w:t>A function is callable code. A method belongs to an object. An argument is a value passed into a call.</w:t>
+              <w:t>first_name = students[0]["name"]</w:t>
             </w:r>
           </w:p>
         </w:tc>
@@ -7707,7 +8210,7 @@
                 <w:color w:val="000000"/>
                 <w:sz w:val="20"/>
               </w:rPr>
-              <w:t>Mutable and immutable</w:t>
+              <w:t>Loop through records</w:t>
             </w:r>
           </w:p>
           <w:p>
@@ -7716,12 +8219,26 @@
             </w:pPr>
             <w:r>
               <w:rPr>
-                <w:rFonts w:ascii="Aptos" w:hAnsi="Aptos"/>
+                <w:rFonts w:ascii="Consolas" w:hAnsi="Consolas"/>
                 <w:b w:val="0"/>
                 <w:color w:val="000000"/>
-                <w:sz w:val="17"/>
-              </w:rPr>
-              <w:t>Mutable objects can change in place. Immutable objects cannot. Lists are mutable; strings and tuples are immutable.</w:t>
+                <w:sz w:val="16"/>
+              </w:rPr>
+              <w:t>for student in students:</w:t>
+            </w:r>
+          </w:p>
+          <w:p>
+            <w:pPr>
+              <w:spacing w:after="20"/>
+            </w:pPr>
+            <w:r>
+              <w:rPr>
+                <w:rFonts w:ascii="Consolas" w:hAnsi="Consolas"/>
+                <w:b w:val="0"/>
+                <w:color w:val="000000"/>
+                <w:sz w:val="16"/>
+              </w:rPr>
+              <w:t xml:space="preserve">    print(student["name"], student["score"])</w:t>
             </w:r>
           </w:p>
         </w:tc>
@@ -7758,7 +8275,7 @@
                 <w:color w:val="000000"/>
                 <w:sz w:val="20"/>
               </w:rPr>
-              <w:t>Iterable and iteration</w:t>
+              <w:t>Work one layer at a time</w:t>
             </w:r>
           </w:p>
           <w:p>
@@ -7772,7 +8289,7 @@
                 <w:color w:val="000000"/>
                 <w:sz w:val="17"/>
               </w:rPr>
-              <w:t>An iterable can supply values one at a time. One pass through a loop body is an iteration.</w:t>
+              <w:t>First identify the outer type, select one value, then apply the operation for the inner type.</w:t>
             </w:r>
           </w:p>
         </w:tc>
@@ -7809,7 +8326,7 @@
                 <w:color w:val="000000"/>
                 <w:sz w:val="20"/>
               </w:rPr>
-              <w:t>Bug and exception</w:t>
+              <w:t>List comprehension</w:t>
             </w:r>
           </w:p>
           <w:p>
@@ -7823,7 +8340,7 @@
                 <w:color w:val="000000"/>
                 <w:sz w:val="17"/>
               </w:rPr>
-              <w:t>A bug is incorrect behavior. An exception is a runtime signal that normal execution cannot continue.</w:t>
+              <w:t>squares = [number ** 2 for number in range(6)]</w:t>
             </w:r>
           </w:p>
         </w:tc>
@@ -7833,55 +8350,6 @@
       <w:pPr>
         <w:spacing w:after="60"/>
       </w:pPr>
-    </w:p>
-    <w:p>
-      <w:pPr>
-        <w:jc w:val="right"/>
-      </w:pPr>
-      <w:r>
-        <w:rPr>
-          <w:rFonts w:ascii="Aptos" w:hAnsi="Aptos"/>
-          <w:b/>
-          <w:color w:val="444444"/>
-          <w:sz w:val="15"/>
-        </w:rPr>
-        <w:t>PYTHON FIELD GUIDE   24</w:t>
-      </w:r>
-    </w:p>
-    <w:p>
-      <w:r>
-        <w:br w:type="page"/>
-      </w:r>
-    </w:p>
-    <w:p>
-      <w:pPr>
-        <w:pStyle w:val="Title"/>
-        <w:spacing w:after="40"/>
-        <w:jc w:val="left"/>
-      </w:pPr>
-      <w:r>
-        <w:rPr>
-          <w:rFonts w:ascii="Aptos" w:hAnsi="Aptos"/>
-          <w:b/>
-          <w:color w:val="000000"/>
-          <w:sz w:val="40"/>
-        </w:rPr>
-        <w:t>Nested data</w:t>
-      </w:r>
-    </w:p>
-    <w:p>
-      <w:pPr>
-        <w:spacing w:after="180"/>
-      </w:pPr>
-      <w:r>
-        <w:rPr>
-          <w:rFonts w:ascii="Aptos" w:hAnsi="Aptos"/>
-          <w:b w:val="0"/>
-          <w:color w:val="444444"/>
-          <w:sz w:val="20"/>
-        </w:rPr>
-        <w:t>Future structures inside structures</w:t>
-      </w:r>
     </w:p>
     <w:tbl>
       <w:tblPr>
@@ -7909,7 +8377,7 @@
                 <w:color w:val="000000"/>
                 <w:sz w:val="20"/>
               </w:rPr>
-              <w:t>List of dictionaries</w:t>
+              <w:t>Filtered comprehension</w:t>
             </w:r>
           </w:p>
           <w:p>
@@ -7918,54 +8386,12 @@
             </w:pPr>
             <w:r>
               <w:rPr>
-                <w:rFonts w:ascii="Consolas" w:hAnsi="Consolas"/>
+                <w:rFonts w:ascii="Aptos" w:hAnsi="Aptos"/>
                 <w:b w:val="0"/>
                 <w:color w:val="000000"/>
-                <w:sz w:val="16"/>
-              </w:rPr>
-              <w:t>students = [</w:t>
-            </w:r>
-          </w:p>
-          <w:p>
-            <w:pPr>
-              <w:spacing w:after="20"/>
-            </w:pPr>
-            <w:r>
-              <w:rPr>
-                <w:rFonts w:ascii="Consolas" w:hAnsi="Consolas"/>
-                <w:b w:val="0"/>
-                <w:color w:val="000000"/>
-                <w:sz w:val="16"/>
-              </w:rPr>
-              <w:t xml:space="preserve">    {"name": "Ava", "score": 88},</w:t>
-            </w:r>
-          </w:p>
-          <w:p>
-            <w:pPr>
-              <w:spacing w:after="20"/>
-            </w:pPr>
-            <w:r>
-              <w:rPr>
-                <w:rFonts w:ascii="Consolas" w:hAnsi="Consolas"/>
-                <w:b w:val="0"/>
-                <w:color w:val="000000"/>
-                <w:sz w:val="16"/>
-              </w:rPr>
-              <w:t xml:space="preserve">    {"name": "Noah", "score": 94},</w:t>
-            </w:r>
-          </w:p>
-          <w:p>
-            <w:pPr>
-              <w:spacing w:after="20"/>
-            </w:pPr>
-            <w:r>
-              <w:rPr>
-                <w:rFonts w:ascii="Consolas" w:hAnsi="Consolas"/>
-                <w:b w:val="0"/>
-                <w:color w:val="000000"/>
-                <w:sz w:val="16"/>
-              </w:rPr>
-              <w:t>]</w:t>
+                <w:sz w:val="17"/>
+              </w:rPr>
+              <w:t>passing = [score for score in scores if score &gt;= 70]</w:t>
             </w:r>
           </w:p>
         </w:tc>
@@ -8002,7 +8428,7 @@
                 <w:color w:val="000000"/>
                 <w:sz w:val="20"/>
               </w:rPr>
-              <w:t>Read a nested value</w:t>
+              <w:t>Sorted copy</w:t>
             </w:r>
           </w:p>
           <w:p>
@@ -8011,12 +8437,26 @@
             </w:pPr>
             <w:r>
               <w:rPr>
-                <w:rFonts w:ascii="Aptos" w:hAnsi="Aptos"/>
+                <w:rFonts w:ascii="Consolas" w:hAnsi="Consolas"/>
                 <w:b w:val="0"/>
                 <w:color w:val="000000"/>
-                <w:sz w:val="17"/>
-              </w:rPr>
-              <w:t>first_name = students[0]["name"]</w:t>
+                <w:sz w:val="16"/>
+              </w:rPr>
+              <w:t>ordered = sorted(scores)</w:t>
+            </w:r>
+          </w:p>
+          <w:p>
+            <w:pPr>
+              <w:spacing w:after="20"/>
+            </w:pPr>
+            <w:r>
+              <w:rPr>
+                <w:rFonts w:ascii="Consolas" w:hAnsi="Consolas"/>
+                <w:b w:val="0"/>
+                <w:color w:val="000000"/>
+                <w:sz w:val="16"/>
+              </w:rPr>
+              <w:t>descending = sorted(scores, reverse=True)</w:t>
             </w:r>
           </w:p>
         </w:tc>
@@ -8053,72 +8493,7 @@
                 <w:color w:val="000000"/>
                 <w:sz w:val="20"/>
               </w:rPr>
-              <w:t>Loop through records</w:t>
-            </w:r>
-          </w:p>
-          <w:p>
-            <w:pPr>
-              <w:spacing w:after="20"/>
-            </w:pPr>
-            <w:r>
-              <w:rPr>
-                <w:rFonts w:ascii="Consolas" w:hAnsi="Consolas"/>
-                <w:b w:val="0"/>
-                <w:color w:val="000000"/>
-                <w:sz w:val="16"/>
-              </w:rPr>
-              <w:t>for student in students:</w:t>
-            </w:r>
-          </w:p>
-          <w:p>
-            <w:pPr>
-              <w:spacing w:after="20"/>
-            </w:pPr>
-            <w:r>
-              <w:rPr>
-                <w:rFonts w:ascii="Consolas" w:hAnsi="Consolas"/>
-                <w:b w:val="0"/>
-                <w:color w:val="000000"/>
-                <w:sz w:val="16"/>
-              </w:rPr>
-              <w:t xml:space="preserve">    print(student["name"], student["score"])</w:t>
-            </w:r>
-          </w:p>
-        </w:tc>
-      </w:tr>
-    </w:tbl>
-    <w:p>
-      <w:pPr>
-        <w:spacing w:after="60"/>
-      </w:pPr>
-    </w:p>
-    <w:tbl>
-      <w:tblPr>
-        <w:tblW w:type="auto" w:w="0"/>
-        <w:tblLayout w:type="fixed"/>
-        <w:tblLook w:firstColumn="1" w:firstRow="1" w:lastColumn="0" w:lastRow="0" w:noHBand="0" w:noVBand="1" w:val="04A0"/>
-      </w:tblPr>
-      <w:tblGrid>
-        <w:gridCol w:w="6480"/>
-      </w:tblGrid>
-      <w:tr>
-        <w:tc>
-          <w:tcPr>
-            <w:tcW w:type="dxa" w:w="6538"/>
-            <w:shd w:fill="F5F5F5"/>
-          </w:tcPr>
-          <w:p>
-            <w:pPr>
-              <w:spacing w:after="60"/>
-            </w:pPr>
-            <w:r>
-              <w:rPr>
-                <w:rFonts w:ascii="Aptos" w:hAnsi="Aptos"/>
-                <w:b/>
-                <w:color w:val="000000"/>
-                <w:sz w:val="20"/>
-              </w:rPr>
-              <w:t>Work one layer at a time</w:t>
+              <w:t>Choose clarity</w:t>
             </w:r>
           </w:p>
           <w:p>
@@ -8132,7 +8507,7 @@
                 <w:color w:val="000000"/>
                 <w:sz w:val="17"/>
               </w:rPr>
-              <w:t>First identify the outer type, select one value, then apply the operation for the inner type.</w:t>
+              <w:t>Use a normal loop when the shortcut becomes hard to explain. Shorter code is not always clearer code.</w:t>
             </w:r>
           </w:p>
         </w:tc>
@@ -8154,578 +8529,7 @@
           <w:color w:val="444444"/>
           <w:sz w:val="15"/>
         </w:rPr>
-        <w:t>PYTHON FIELD GUIDE   25</w:t>
-      </w:r>
-    </w:p>
-    <w:p>
-      <w:r>
-        <w:br w:type="page"/>
-      </w:r>
-    </w:p>
-    <w:p>
-      <w:pPr>
-        <w:pStyle w:val="Title"/>
-        <w:spacing w:after="40"/>
-        <w:jc w:val="left"/>
-      </w:pPr>
-      <w:r>
-        <w:rPr>
-          <w:rFonts w:ascii="Aptos" w:hAnsi="Aptos"/>
-          <w:b/>
-          <w:color w:val="000000"/>
-          <w:sz w:val="40"/>
-        </w:rPr>
-        <w:t>Comprehensions and sorting</w:t>
-      </w:r>
-    </w:p>
-    <w:p>
-      <w:pPr>
-        <w:spacing w:after="180"/>
-      </w:pPr>
-      <w:r>
-        <w:rPr>
-          <w:rFonts w:ascii="Aptos" w:hAnsi="Aptos"/>
-          <w:b w:val="0"/>
-          <w:color w:val="444444"/>
-          <w:sz w:val="20"/>
-        </w:rPr>
-        <w:t>Future shortcuts after loops make sense</w:t>
-      </w:r>
-    </w:p>
-    <w:tbl>
-      <w:tblPr>
-        <w:tblW w:type="auto" w:w="0"/>
-        <w:tblLayout w:type="fixed"/>
-        <w:tblLook w:firstColumn="1" w:firstRow="1" w:lastColumn="0" w:lastRow="0" w:noHBand="0" w:noVBand="1" w:val="04A0"/>
-      </w:tblPr>
-      <w:tblGrid>
-        <w:gridCol w:w="6480"/>
-      </w:tblGrid>
-      <w:tr>
-        <w:tc>
-          <w:tcPr>
-            <w:tcW w:type="dxa" w:w="6538"/>
-            <w:shd w:fill="F5F5F5"/>
-          </w:tcPr>
-          <w:p>
-            <w:pPr>
-              <w:spacing w:after="60"/>
-            </w:pPr>
-            <w:r>
-              <w:rPr>
-                <w:rFonts w:ascii="Aptos" w:hAnsi="Aptos"/>
-                <w:b/>
-                <w:color w:val="000000"/>
-                <w:sz w:val="20"/>
-              </w:rPr>
-              <w:t>List comprehension</w:t>
-            </w:r>
-          </w:p>
-          <w:p>
-            <w:pPr>
-              <w:spacing w:after="20"/>
-            </w:pPr>
-            <w:r>
-              <w:rPr>
-                <w:rFonts w:ascii="Aptos" w:hAnsi="Aptos"/>
-                <w:b w:val="0"/>
-                <w:color w:val="000000"/>
-                <w:sz w:val="17"/>
-              </w:rPr>
-              <w:t>squares = [number ** 2 for number in range(6)]</w:t>
-            </w:r>
-          </w:p>
-        </w:tc>
-      </w:tr>
-    </w:tbl>
-    <w:p>
-      <w:pPr>
-        <w:spacing w:after="60"/>
-      </w:pPr>
-    </w:p>
-    <w:tbl>
-      <w:tblPr>
-        <w:tblW w:type="auto" w:w="0"/>
-        <w:tblLayout w:type="fixed"/>
-        <w:tblLook w:firstColumn="1" w:firstRow="1" w:lastColumn="0" w:lastRow="0" w:noHBand="0" w:noVBand="1" w:val="04A0"/>
-      </w:tblPr>
-      <w:tblGrid>
-        <w:gridCol w:w="6480"/>
-      </w:tblGrid>
-      <w:tr>
-        <w:tc>
-          <w:tcPr>
-            <w:tcW w:type="dxa" w:w="6538"/>
-            <w:shd w:fill="F5F5F5"/>
-          </w:tcPr>
-          <w:p>
-            <w:pPr>
-              <w:spacing w:after="60"/>
-            </w:pPr>
-            <w:r>
-              <w:rPr>
-                <w:rFonts w:ascii="Aptos" w:hAnsi="Aptos"/>
-                <w:b/>
-                <w:color w:val="000000"/>
-                <w:sz w:val="20"/>
-              </w:rPr>
-              <w:t>Filtered comprehension</w:t>
-            </w:r>
-          </w:p>
-          <w:p>
-            <w:pPr>
-              <w:spacing w:after="20"/>
-            </w:pPr>
-            <w:r>
-              <w:rPr>
-                <w:rFonts w:ascii="Aptos" w:hAnsi="Aptos"/>
-                <w:b w:val="0"/>
-                <w:color w:val="000000"/>
-                <w:sz w:val="17"/>
-              </w:rPr>
-              <w:t>passing = [score for score in scores if score &gt;= 70]</w:t>
-            </w:r>
-          </w:p>
-        </w:tc>
-      </w:tr>
-    </w:tbl>
-    <w:p>
-      <w:pPr>
-        <w:spacing w:after="60"/>
-      </w:pPr>
-    </w:p>
-    <w:tbl>
-      <w:tblPr>
-        <w:tblW w:type="auto" w:w="0"/>
-        <w:tblLayout w:type="fixed"/>
-        <w:tblLook w:firstColumn="1" w:firstRow="1" w:lastColumn="0" w:lastRow="0" w:noHBand="0" w:noVBand="1" w:val="04A0"/>
-      </w:tblPr>
-      <w:tblGrid>
-        <w:gridCol w:w="6480"/>
-      </w:tblGrid>
-      <w:tr>
-        <w:tc>
-          <w:tcPr>
-            <w:tcW w:type="dxa" w:w="6538"/>
-            <w:shd w:fill="F5F5F5"/>
-          </w:tcPr>
-          <w:p>
-            <w:pPr>
-              <w:spacing w:after="60"/>
-            </w:pPr>
-            <w:r>
-              <w:rPr>
-                <w:rFonts w:ascii="Aptos" w:hAnsi="Aptos"/>
-                <w:b/>
-                <w:color w:val="000000"/>
-                <w:sz w:val="20"/>
-              </w:rPr>
-              <w:t>Sorted copy</w:t>
-            </w:r>
-          </w:p>
-          <w:p>
-            <w:pPr>
-              <w:spacing w:after="20"/>
-            </w:pPr>
-            <w:r>
-              <w:rPr>
-                <w:rFonts w:ascii="Consolas" w:hAnsi="Consolas"/>
-                <w:b w:val="0"/>
-                <w:color w:val="000000"/>
-                <w:sz w:val="16"/>
-              </w:rPr>
-              <w:t>ordered = sorted(scores)</w:t>
-            </w:r>
-          </w:p>
-          <w:p>
-            <w:pPr>
-              <w:spacing w:after="20"/>
-            </w:pPr>
-            <w:r>
-              <w:rPr>
-                <w:rFonts w:ascii="Consolas" w:hAnsi="Consolas"/>
-                <w:b w:val="0"/>
-                <w:color w:val="000000"/>
-                <w:sz w:val="16"/>
-              </w:rPr>
-              <w:t>descending = sorted(scores, reverse=True)</w:t>
-            </w:r>
-          </w:p>
-        </w:tc>
-      </w:tr>
-    </w:tbl>
-    <w:p>
-      <w:pPr>
-        <w:spacing w:after="60"/>
-      </w:pPr>
-    </w:p>
-    <w:tbl>
-      <w:tblPr>
-        <w:tblW w:type="auto" w:w="0"/>
-        <w:tblLayout w:type="fixed"/>
-        <w:tblLook w:firstColumn="1" w:firstRow="1" w:lastColumn="0" w:lastRow="0" w:noHBand="0" w:noVBand="1" w:val="04A0"/>
-      </w:tblPr>
-      <w:tblGrid>
-        <w:gridCol w:w="6480"/>
-      </w:tblGrid>
-      <w:tr>
-        <w:tc>
-          <w:tcPr>
-            <w:tcW w:type="dxa" w:w="6538"/>
-            <w:shd w:fill="F5F5F5"/>
-          </w:tcPr>
-          <w:p>
-            <w:pPr>
-              <w:spacing w:after="60"/>
-            </w:pPr>
-            <w:r>
-              <w:rPr>
-                <w:rFonts w:ascii="Aptos" w:hAnsi="Aptos"/>
-                <w:b/>
-                <w:color w:val="000000"/>
-                <w:sz w:val="20"/>
-              </w:rPr>
-              <w:t>Choose clarity</w:t>
-            </w:r>
-          </w:p>
-          <w:p>
-            <w:pPr>
-              <w:spacing w:after="20"/>
-            </w:pPr>
-            <w:r>
-              <w:rPr>
-                <w:rFonts w:ascii="Aptos" w:hAnsi="Aptos"/>
-                <w:b w:val="0"/>
-                <w:color w:val="000000"/>
-                <w:sz w:val="17"/>
-              </w:rPr>
-              <w:t>Use a normal loop when the shortcut becomes hard to explain. Shorter code is not always clearer code.</w:t>
-            </w:r>
-          </w:p>
-        </w:tc>
-      </w:tr>
-    </w:tbl>
-    <w:p>
-      <w:pPr>
-        <w:spacing w:after="60"/>
-      </w:pPr>
-    </w:p>
-    <w:p>
-      <w:pPr>
-        <w:jc w:val="right"/>
-      </w:pPr>
-      <w:r>
-        <w:rPr>
-          <w:rFonts w:ascii="Aptos" w:hAnsi="Aptos"/>
-          <w:b/>
-          <w:color w:val="444444"/>
-          <w:sz w:val="15"/>
-        </w:rPr>
-        <w:t>PYTHON FIELD GUIDE   26</w:t>
-      </w:r>
-    </w:p>
-    <w:p>
-      <w:r>
-        <w:br w:type="page"/>
-      </w:r>
-    </w:p>
-    <w:p>
-      <w:pPr>
-        <w:pStyle w:val="Title"/>
-        <w:spacing w:after="40"/>
-        <w:jc w:val="left"/>
-      </w:pPr>
-      <w:r>
-        <w:rPr>
-          <w:rFonts w:ascii="Aptos" w:hAnsi="Aptos"/>
-          <w:b/>
-          <w:color w:val="000000"/>
-          <w:sz w:val="40"/>
-        </w:rPr>
-        <w:t>Plan a program</w:t>
-      </w:r>
-    </w:p>
-    <w:p>
-      <w:pPr>
-        <w:spacing w:after="180"/>
-      </w:pPr>
-      <w:r>
-        <w:rPr>
-          <w:rFonts w:ascii="Aptos" w:hAnsi="Aptos"/>
-          <w:b w:val="0"/>
-          <w:color w:val="444444"/>
-          <w:sz w:val="20"/>
-        </w:rPr>
-        <w:t>Turn a large idea into testable steps</w:t>
-      </w:r>
-    </w:p>
-    <w:tbl>
-      <w:tblPr>
-        <w:tblW w:type="auto" w:w="0"/>
-        <w:tblLayout w:type="fixed"/>
-        <w:tblLook w:firstColumn="1" w:firstRow="1" w:lastColumn="0" w:lastRow="0" w:noHBand="0" w:noVBand="1" w:val="04A0"/>
-      </w:tblPr>
-      <w:tblGrid>
-        <w:gridCol w:w="6480"/>
-      </w:tblGrid>
-      <w:tr>
-        <w:tc>
-          <w:tcPr>
-            <w:tcW w:type="dxa" w:w="6538"/>
-            <w:shd w:fill="F5F5F5"/>
-          </w:tcPr>
-          <w:p>
-            <w:pPr>
-              <w:spacing w:after="60"/>
-            </w:pPr>
-            <w:r>
-              <w:rPr>
-                <w:rFonts w:ascii="Aptos" w:hAnsi="Aptos"/>
-                <w:b/>
-                <w:color w:val="000000"/>
-                <w:sz w:val="20"/>
-              </w:rPr>
-              <w:t>Inputs</w:t>
-            </w:r>
-          </w:p>
-          <w:p>
-            <w:pPr>
-              <w:spacing w:after="20"/>
-            </w:pPr>
-            <w:r>
-              <w:rPr>
-                <w:rFonts w:ascii="Aptos" w:hAnsi="Aptos"/>
-                <w:b w:val="0"/>
-                <w:color w:val="000000"/>
-                <w:sz w:val="17"/>
-              </w:rPr>
-              <w:t>What information enters the program? What type should each input have?</w:t>
-            </w:r>
-          </w:p>
-        </w:tc>
-      </w:tr>
-    </w:tbl>
-    <w:p>
-      <w:pPr>
-        <w:spacing w:after="60"/>
-      </w:pPr>
-    </w:p>
-    <w:tbl>
-      <w:tblPr>
-        <w:tblW w:type="auto" w:w="0"/>
-        <w:tblLayout w:type="fixed"/>
-        <w:tblLook w:firstColumn="1" w:firstRow="1" w:lastColumn="0" w:lastRow="0" w:noHBand="0" w:noVBand="1" w:val="04A0"/>
-      </w:tblPr>
-      <w:tblGrid>
-        <w:gridCol w:w="6480"/>
-      </w:tblGrid>
-      <w:tr>
-        <w:tc>
-          <w:tcPr>
-            <w:tcW w:type="dxa" w:w="6538"/>
-            <w:shd w:fill="F5F5F5"/>
-          </w:tcPr>
-          <w:p>
-            <w:pPr>
-              <w:spacing w:after="60"/>
-            </w:pPr>
-            <w:r>
-              <w:rPr>
-                <w:rFonts w:ascii="Aptos" w:hAnsi="Aptos"/>
-                <w:b/>
-                <w:color w:val="000000"/>
-                <w:sz w:val="20"/>
-              </w:rPr>
-              <w:t>Outputs</w:t>
-            </w:r>
-          </w:p>
-          <w:p>
-            <w:pPr>
-              <w:spacing w:after="20"/>
-            </w:pPr>
-            <w:r>
-              <w:rPr>
-                <w:rFonts w:ascii="Aptos" w:hAnsi="Aptos"/>
-                <w:b w:val="0"/>
-                <w:color w:val="000000"/>
-                <w:sz w:val="17"/>
-              </w:rPr>
-              <w:t>What should the user see or receive? What should a function return?</w:t>
-            </w:r>
-          </w:p>
-        </w:tc>
-      </w:tr>
-    </w:tbl>
-    <w:p>
-      <w:pPr>
-        <w:spacing w:after="60"/>
-      </w:pPr>
-    </w:p>
-    <w:tbl>
-      <w:tblPr>
-        <w:tblW w:type="auto" w:w="0"/>
-        <w:tblLayout w:type="fixed"/>
-        <w:tblLook w:firstColumn="1" w:firstRow="1" w:lastColumn="0" w:lastRow="0" w:noHBand="0" w:noVBand="1" w:val="04A0"/>
-      </w:tblPr>
-      <w:tblGrid>
-        <w:gridCol w:w="6480"/>
-      </w:tblGrid>
-      <w:tr>
-        <w:tc>
-          <w:tcPr>
-            <w:tcW w:type="dxa" w:w="6538"/>
-            <w:shd w:fill="F5F5F5"/>
-          </w:tcPr>
-          <w:p>
-            <w:pPr>
-              <w:spacing w:after="60"/>
-            </w:pPr>
-            <w:r>
-              <w:rPr>
-                <w:rFonts w:ascii="Aptos" w:hAnsi="Aptos"/>
-                <w:b/>
-                <w:color w:val="000000"/>
-                <w:sz w:val="20"/>
-              </w:rPr>
-              <w:t>Rules</w:t>
-            </w:r>
-          </w:p>
-          <w:p>
-            <w:pPr>
-              <w:spacing w:after="20"/>
-            </w:pPr>
-            <w:r>
-              <w:rPr>
-                <w:rFonts w:ascii="Aptos" w:hAnsi="Aptos"/>
-                <w:b w:val="0"/>
-                <w:color w:val="000000"/>
-                <w:sz w:val="17"/>
-              </w:rPr>
-              <w:t>Write the decisions and repeated actions as plain-language steps before writing Python.</w:t>
-            </w:r>
-          </w:p>
-        </w:tc>
-      </w:tr>
-    </w:tbl>
-    <w:p>
-      <w:pPr>
-        <w:spacing w:after="60"/>
-      </w:pPr>
-    </w:p>
-    <w:tbl>
-      <w:tblPr>
-        <w:tblW w:type="auto" w:w="0"/>
-        <w:tblLayout w:type="fixed"/>
-        <w:tblLook w:firstColumn="1" w:firstRow="1" w:lastColumn="0" w:lastRow="0" w:noHBand="0" w:noVBand="1" w:val="04A0"/>
-      </w:tblPr>
-      <w:tblGrid>
-        <w:gridCol w:w="6480"/>
-      </w:tblGrid>
-      <w:tr>
-        <w:tc>
-          <w:tcPr>
-            <w:tcW w:type="dxa" w:w="6538"/>
-            <w:shd w:fill="F5F5F5"/>
-          </w:tcPr>
-          <w:p>
-            <w:pPr>
-              <w:spacing w:after="60"/>
-            </w:pPr>
-            <w:r>
-              <w:rPr>
-                <w:rFonts w:ascii="Aptos" w:hAnsi="Aptos"/>
-                <w:b/>
-                <w:color w:val="000000"/>
-                <w:sz w:val="20"/>
-              </w:rPr>
-              <w:t>Functions</w:t>
-            </w:r>
-          </w:p>
-          <w:p>
-            <w:pPr>
-              <w:spacing w:after="20"/>
-            </w:pPr>
-            <w:r>
-              <w:rPr>
-                <w:rFonts w:ascii="Aptos" w:hAnsi="Aptos"/>
-                <w:b w:val="0"/>
-                <w:color w:val="000000"/>
-                <w:sz w:val="17"/>
-              </w:rPr>
-              <w:t>Give each major job a name, inputs, and one expected output or effect.</w:t>
-            </w:r>
-          </w:p>
-        </w:tc>
-      </w:tr>
-    </w:tbl>
-    <w:p>
-      <w:pPr>
-        <w:spacing w:after="60"/>
-      </w:pPr>
-    </w:p>
-    <w:tbl>
-      <w:tblPr>
-        <w:tblW w:type="auto" w:w="0"/>
-        <w:tblLayout w:type="fixed"/>
-        <w:tblLook w:firstColumn="1" w:firstRow="1" w:lastColumn="0" w:lastRow="0" w:noHBand="0" w:noVBand="1" w:val="04A0"/>
-      </w:tblPr>
-      <w:tblGrid>
-        <w:gridCol w:w="6480"/>
-      </w:tblGrid>
-      <w:tr>
-        <w:tc>
-          <w:tcPr>
-            <w:tcW w:type="dxa" w:w="6538"/>
-            <w:shd w:fill="F5F5F5"/>
-          </w:tcPr>
-          <w:p>
-            <w:pPr>
-              <w:spacing w:after="60"/>
-            </w:pPr>
-            <w:r>
-              <w:rPr>
-                <w:rFonts w:ascii="Aptos" w:hAnsi="Aptos"/>
-                <w:b/>
-                <w:color w:val="000000"/>
-                <w:sz w:val="20"/>
-              </w:rPr>
-              <w:t>Tests</w:t>
-            </w:r>
-          </w:p>
-          <w:p>
-            <w:pPr>
-              <w:spacing w:after="20"/>
-            </w:pPr>
-            <w:r>
-              <w:rPr>
-                <w:rFonts w:ascii="Aptos" w:hAnsi="Aptos"/>
-                <w:b w:val="0"/>
-                <w:color w:val="000000"/>
-                <w:sz w:val="17"/>
-              </w:rPr>
-              <w:t>Create one normal example, one boundary example, and one invalid example before implementation.</w:t>
-            </w:r>
-          </w:p>
-        </w:tc>
-      </w:tr>
-    </w:tbl>
-    <w:p>
-      <w:pPr>
-        <w:spacing w:after="60"/>
-      </w:pPr>
-    </w:p>
-    <w:p>
-      <w:pPr>
-        <w:jc w:val="right"/>
-      </w:pPr>
-      <w:r>
-        <w:rPr>
-          <w:rFonts w:ascii="Aptos" w:hAnsi="Aptos"/>
-          <w:b/>
-          <w:color w:val="444444"/>
-          <w:sz w:val="15"/>
-        </w:rPr>
-        <w:t>PYTHON FIELD GUIDE   27</w:t>
+        <w:t>PYTHON FIELD GUIDE   23</w:t>
       </w:r>
     </w:p>
     <w:p>
@@ -9145,7 +8949,7 @@
           <w:color w:val="444444"/>
           <w:sz w:val="15"/>
         </w:rPr>
-        <w:t>PYTHON FIELD GUIDE   28</w:t>
+        <w:t>PYTHON FIELD GUIDE   24</w:t>
       </w:r>
     </w:p>
     <w:p>
@@ -9664,7 +9468,7 @@
           <w:color w:val="444444"/>
           <w:sz w:val="15"/>
         </w:rPr>
-        <w:t>PYTHON FIELD GUIDE   29</w:t>
+        <w:t>PYTHON FIELD GUIDE   25</w:t>
       </w:r>
     </w:p>
     <w:p>
@@ -10085,7 +9889,7 @@
           <w:color w:val="444444"/>
           <w:sz w:val="15"/>
         </w:rPr>
-        <w:t>PYTHON FIELD GUIDE   30</w:t>
+        <w:t>PYTHON FIELD GUIDE   26</w:t>
       </w:r>
     </w:p>
     <w:p>
@@ -10613,7 +10417,7 @@
           <w:color w:val="444444"/>
           <w:sz w:val="15"/>
         </w:rPr>
-        <w:t>PYTHON FIELD GUIDE   31</w:t>
+        <w:t>PYTHON FIELD GUIDE   27</w:t>
       </w:r>
     </w:p>
     <w:p>
@@ -10691,7 +10495,7 @@
                 <w:color w:val="000000"/>
                 <w:sz w:val="17"/>
               </w:rPr>
-              <w:t>Variables 4   Types 5-6   Strings 7   Lists 8   Input 9   Operators 10   Conditions 11   Loops 12-13   Functions 14-15</w:t>
+              <w:t>Variables 3   Types 4-5   Strings 6   Lists 7   Input 8   Operators 9</w:t>
             </w:r>
           </w:p>
         </w:tc>
@@ -10728,7 +10532,7 @@
                 <w:color w:val="000000"/>
                 <w:sz w:val="20"/>
               </w:rPr>
-              <w:t>Future foundations</w:t>
+              <w:t>Control and organization</w:t>
             </w:r>
           </w:p>
           <w:p>
@@ -10742,7 +10546,7 @@
                 <w:color w:val="000000"/>
                 <w:sz w:val="17"/>
               </w:rPr>
-              <w:t>Dictionaries 17   Exceptions 18   Files 19   Modules 20   Classes 21   Testing 22   Style 23   Glossary 24</w:t>
+              <w:t>Conditions 10   For loops 11   While loops 12   Functions 13-14   Debugging 15</w:t>
             </w:r>
           </w:p>
         </w:tc>
@@ -10779,7 +10583,7 @@
                 <w:color w:val="000000"/>
                 <w:sz w:val="20"/>
               </w:rPr>
-              <w:t>More practice</w:t>
+              <w:t>Future foundations</w:t>
             </w:r>
           </w:p>
           <w:p>
@@ -10793,7 +10597,7 @@
                 <w:color w:val="000000"/>
                 <w:sz w:val="17"/>
               </w:rPr>
-              <w:t>Nested data 25   Comprehensions 26   Planning 27   Worked examples 28-31</w:t>
+              <w:t>Dictionaries 16   Exceptions 17   Files 18   Modules 19   Classes 20</w:t>
             </w:r>
           </w:p>
         </w:tc>
@@ -10830,7 +10634,7 @@
                 <w:color w:val="000000"/>
                 <w:sz w:val="20"/>
               </w:rPr>
-              <w:t>Official Python tutorial</w:t>
+              <w:t>Practice and design</w:t>
             </w:r>
           </w:p>
           <w:p>
@@ -10844,7 +10648,7 @@
                 <w:color w:val="000000"/>
                 <w:sz w:val="17"/>
               </w:rPr>
-              <w:t>docs.python.org/3/tutorial/</w:t>
+              <w:t>Testing and style 21   Glossary and planning 22   Nested data and comprehensions 23   Worked examples 24-27</w:t>
             </w:r>
           </w:p>
         </w:tc>
@@ -10881,7 +10685,7 @@
                 <w:color w:val="000000"/>
                 <w:sz w:val="20"/>
               </w:rPr>
-              <w:t>Official built-in types</w:t>
+              <w:t>Official Python tutorial</w:t>
             </w:r>
           </w:p>
           <w:p>
@@ -10895,7 +10699,7 @@
                 <w:color w:val="000000"/>
                 <w:sz w:val="17"/>
               </w:rPr>
-              <w:t>docs.python.org/3/library/stdtypes.html</w:t>
+              <w:t>docs.python.org/3/tutorial/</w:t>
             </w:r>
           </w:p>
         </w:tc>
@@ -10932,6 +10736,57 @@
                 <w:color w:val="000000"/>
                 <w:sz w:val="20"/>
               </w:rPr>
+              <w:t>Official built-in types</w:t>
+            </w:r>
+          </w:p>
+          <w:p>
+            <w:pPr>
+              <w:spacing w:after="20"/>
+            </w:pPr>
+            <w:r>
+              <w:rPr>
+                <w:rFonts w:ascii="Aptos" w:hAnsi="Aptos"/>
+                <w:b w:val="0"/>
+                <w:color w:val="000000"/>
+                <w:sz w:val="17"/>
+              </w:rPr>
+              <w:t>docs.python.org/3/library/stdtypes.html</w:t>
+            </w:r>
+          </w:p>
+        </w:tc>
+      </w:tr>
+    </w:tbl>
+    <w:p>
+      <w:pPr>
+        <w:spacing w:after="60"/>
+      </w:pPr>
+    </w:p>
+    <w:tbl>
+      <w:tblPr>
+        <w:tblW w:type="auto" w:w="0"/>
+        <w:tblLayout w:type="fixed"/>
+        <w:tblLook w:firstColumn="1" w:firstRow="1" w:lastColumn="0" w:lastRow="0" w:noHBand="0" w:noVBand="1" w:val="04A0"/>
+      </w:tblPr>
+      <w:tblGrid>
+        <w:gridCol w:w="6480"/>
+      </w:tblGrid>
+      <w:tr>
+        <w:tc>
+          <w:tcPr>
+            <w:tcW w:type="dxa" w:w="6538"/>
+            <w:shd w:fill="F5F5F5"/>
+          </w:tcPr>
+          <w:p>
+            <w:pPr>
+              <w:spacing w:after="60"/>
+            </w:pPr>
+            <w:r>
+              <w:rPr>
+                <w:rFonts w:ascii="Aptos" w:hAnsi="Aptos"/>
+                <w:b/>
+                <w:color w:val="000000"/>
+                <w:sz w:val="20"/>
+              </w:rPr>
               <w:t>Search formula</w:t>
             </w:r>
           </w:p>
@@ -10968,7 +10823,7 @@
           <w:color w:val="444444"/>
           <w:sz w:val="15"/>
         </w:rPr>
-        <w:t>PYTHON FIELD GUIDE   32</w:t>
+        <w:t>PYTHON FIELD GUIDE   28</w:t>
       </w:r>
     </w:p>
     <w:sectPr>

</xml_diff>